<commit_message>
Bundle capstone data & switch recovery to ridge_core
Add bundled capstone data and analysis artifacts, introduce an independent engine-review script, and update the app, docs, models, and tests to reflect a compact Ridge ('ridge_core') recovery winner. Key changes: include data/ workbooks and README, update Streamlit uploader/default-workbook logic to prefer bundled files, bump recovery and day35 model versions, add training_summary and updated manifests, add tree-based candidates for Day35 baseline, and refresh many docs/cheat-sheet texts. Tests updated to expect new UI labels and model choices.
</commit_message>
<xml_diff>
--- a/docs/Project_Canary_Defense_Cheat_Sheet.docx
+++ b/docs/Project_Canary_Defense_Cheat_Sheet.docx
@@ -204,6 +204,9 @@
         <w:gridCol w:w="9360"/>
       </w:tblGrid>
       <w:tr>
+        <w:trPr>
+          <w:cantSplit/>
+        </w:trPr>
         <w:tc>
           <w:tcPr>
             <w:tcW w:type="dxa" w:w="9360"/>
@@ -671,20 +674,598 @@
         <w:pStyle w:val="Heading1"/>
       </w:pPr>
       <w:r>
-        <w:t>3. Data foundation</w:t>
-      </w:r>
-    </w:p>
-    <w:p>
-      <w:pPr>
-        <w:pStyle w:val="ListBullet"/>
-      </w:pPr>
-      <w:r>
-        <w:rPr>
-          <w:rFonts w:ascii="Calibri" w:hAnsi="Calibri"/>
-          <w:color w:val="2A3730"/>
-          <w:sz w:val="21"/>
-        </w:rPr>
-        <w:t xml:space="preserve"> Primary daily source: </w:t>
+        <w:t>2A. How every current-building card is produced</w:t>
+      </w:r>
+    </w:p>
+    <w:tbl>
+      <w:tblPr>
+        <w:tblStyle w:val="TableGrid"/>
+        <w:tblW w:type="dxa" w:w="9360"/>
+        <w:tblLayout w:type="fixed"/>
+        <w:tblLook w:firstColumn="1" w:firstRow="1" w:lastColumn="0" w:lastRow="0" w:noHBand="0" w:noVBand="1" w:val="04A0"/>
+        <w:tblInd w:w="120" w:type="dxa"/>
+      </w:tblPr>
+      <w:tblGrid>
+        <w:gridCol w:w="3000"/>
+        <w:gridCol w:w="6360"/>
+      </w:tblGrid>
+      <w:tr>
+        <w:trPr>
+          <w:cantSplit/>
+          <w:tblHeader w:val="true"/>
+        </w:trPr>
+        <w:tc>
+          <w:tcPr>
+            <w:tcW w:type="dxa" w:w="3000"/>
+            <w:tcMar>
+              <w:top w:w="80" w:type="dxa"/>
+              <w:start w:w="120" w:type="dxa"/>
+              <w:bottom w:w="80" w:type="dxa"/>
+              <w:end w:w="120" w:type="dxa"/>
+            </w:tcMar>
+            <w:vAlign w:val="center"/>
+            <w:shd w:fill="286245"/>
+          </w:tcPr>
+          <w:p>
+            <w:pPr>
+              <w:keepLines/>
+              <w:spacing w:before="0" w:after="0" w:line="264" w:lineRule="auto"/>
+            </w:pPr>
+            <w:r>
+              <w:rPr>
+                <w:b/>
+              </w:rPr>
+            </w:r>
+            <w:r>
+              <w:rPr>
+                <w:rFonts w:ascii="Calibri" w:hAnsi="Calibri"/>
+                <w:b/>
+                <w:color w:val="FFFFFF"/>
+                <w:sz w:val="19"/>
+              </w:rPr>
+              <w:t>Card output</w:t>
+            </w:r>
+          </w:p>
+        </w:tc>
+        <w:tc>
+          <w:tcPr>
+            <w:tcW w:type="dxa" w:w="6360"/>
+            <w:tcMar>
+              <w:top w:w="80" w:type="dxa"/>
+              <w:start w:w="120" w:type="dxa"/>
+              <w:bottom w:w="80" w:type="dxa"/>
+              <w:end w:w="120" w:type="dxa"/>
+            </w:tcMar>
+            <w:vAlign w:val="center"/>
+            <w:shd w:fill="286245"/>
+          </w:tcPr>
+          <w:p>
+            <w:pPr>
+              <w:keepLines/>
+              <w:spacing w:before="0" w:after="0" w:line="264" w:lineRule="auto"/>
+            </w:pPr>
+            <w:r>
+              <w:rPr>
+                <w:b/>
+              </w:rPr>
+            </w:r>
+            <w:r>
+              <w:rPr>
+                <w:rFonts w:ascii="Calibri" w:hAnsi="Calibri"/>
+                <w:b/>
+                <w:color w:val="FFFFFF"/>
+                <w:sz w:val="19"/>
+              </w:rPr>
+              <w:t>How Canary produces it</w:t>
+            </w:r>
+          </w:p>
+        </w:tc>
+      </w:tr>
+      <w:tr>
+        <w:trPr>
+          <w:cantSplit/>
+        </w:trPr>
+        <w:tc>
+          <w:tcPr>
+            <w:tcW w:type="dxa" w:w="3000"/>
+            <w:tcMar>
+              <w:top w:w="80" w:type="dxa"/>
+              <w:start w:w="120" w:type="dxa"/>
+              <w:bottom w:w="80" w:type="dxa"/>
+              <w:end w:w="120" w:type="dxa"/>
+            </w:tcMar>
+            <w:vAlign w:val="center"/>
+          </w:tcPr>
+          <w:p>
+            <w:pPr>
+              <w:keepLines/>
+              <w:spacing w:before="0" w:after="0" w:line="264" w:lineRule="auto"/>
+            </w:pPr>
+            <w:r/>
+            <w:r>
+              <w:rPr>
+                <w:rFonts w:ascii="Calibri" w:hAnsi="Calibri"/>
+                <w:color w:val="2A3730"/>
+                <w:sz w:val="19"/>
+              </w:rPr>
+              <w:t>Current state</w:t>
+            </w:r>
+          </w:p>
+        </w:tc>
+        <w:tc>
+          <w:tcPr>
+            <w:tcW w:type="dxa" w:w="6360"/>
+            <w:tcMar>
+              <w:top w:w="80" w:type="dxa"/>
+              <w:start w:w="120" w:type="dxa"/>
+              <w:bottom w:w="80" w:type="dxa"/>
+              <w:end w:w="120" w:type="dxa"/>
+            </w:tcMar>
+            <w:vAlign w:val="center"/>
+          </w:tcPr>
+          <w:p>
+            <w:pPr>
+              <w:keepLines/>
+              <w:spacing w:before="0" w:after="0" w:line="264" w:lineRule="auto"/>
+            </w:pPr>
+            <w:r/>
+            <w:r>
+              <w:rPr>
+                <w:rFonts w:ascii="Calibri" w:hAnsi="Calibri"/>
+                <w:color w:val="2A3730"/>
+                <w:sz w:val="19"/>
+              </w:rPr>
+              <w:t>Latest population and weight observations recorded on or before the selected review date</w:t>
+            </w:r>
+          </w:p>
+        </w:tc>
+      </w:tr>
+      <w:tr>
+        <w:trPr>
+          <w:cantSplit/>
+        </w:trPr>
+        <w:tc>
+          <w:tcPr>
+            <w:tcW w:type="dxa" w:w="3000"/>
+            <w:tcMar>
+              <w:top w:w="80" w:type="dxa"/>
+              <w:start w:w="120" w:type="dxa"/>
+              <w:bottom w:w="80" w:type="dxa"/>
+              <w:end w:w="120" w:type="dxa"/>
+            </w:tcMar>
+            <w:vAlign w:val="center"/>
+            <w:shd w:fill="F4F8F5"/>
+          </w:tcPr>
+          <w:p>
+            <w:pPr>
+              <w:keepLines/>
+              <w:spacing w:before="0" w:after="0" w:line="264" w:lineRule="auto"/>
+            </w:pPr>
+            <w:r/>
+            <w:r>
+              <w:rPr>
+                <w:rFonts w:ascii="Calibri" w:hAnsi="Calibri"/>
+                <w:color w:val="2A3730"/>
+                <w:sz w:val="19"/>
+              </w:rPr>
+              <w:t>Risk rating</w:t>
+            </w:r>
+          </w:p>
+        </w:tc>
+        <w:tc>
+          <w:tcPr>
+            <w:tcW w:type="dxa" w:w="6360"/>
+            <w:tcMar>
+              <w:top w:w="80" w:type="dxa"/>
+              <w:start w:w="120" w:type="dxa"/>
+              <w:bottom w:w="80" w:type="dxa"/>
+              <w:end w:w="120" w:type="dxa"/>
+            </w:tcMar>
+            <w:vAlign w:val="center"/>
+            <w:shd w:fill="F4F8F5"/>
+          </w:tcPr>
+          <w:p>
+            <w:pPr>
+              <w:keepLines/>
+              <w:spacing w:before="0" w:after="0" w:line="264" w:lineRule="auto"/>
+            </w:pPr>
+            <w:r/>
+            <w:r>
+              <w:rPr>
+                <w:rFonts w:ascii="Calibri" w:hAnsi="Calibri"/>
+                <w:color w:val="2A3730"/>
+                <w:sz w:val="19"/>
+              </w:rPr>
+              <w:t>Sum of the available 0–3 point weight, survival, mortality-trend, and peer checks; total mapped to Low/Medium/High/Critical</w:t>
+            </w:r>
+          </w:p>
+        </w:tc>
+      </w:tr>
+      <w:tr>
+        <w:trPr>
+          <w:cantSplit/>
+        </w:trPr>
+        <w:tc>
+          <w:tcPr>
+            <w:tcW w:type="dxa" w:w="3000"/>
+            <w:tcMar>
+              <w:top w:w="80" w:type="dxa"/>
+              <w:start w:w="120" w:type="dxa"/>
+              <w:bottom w:w="80" w:type="dxa"/>
+              <w:end w:w="120" w:type="dxa"/>
+            </w:tcMar>
+            <w:vAlign w:val="center"/>
+          </w:tcPr>
+          <w:p>
+            <w:pPr>
+              <w:keepLines/>
+              <w:spacing w:before="0" w:after="0" w:line="264" w:lineRule="auto"/>
+            </w:pPr>
+            <w:r/>
+            <w:r>
+              <w:rPr>
+                <w:rFonts w:ascii="Calibri" w:hAnsi="Calibri"/>
+                <w:color w:val="2A3730"/>
+                <w:sz w:val="19"/>
+              </w:rPr>
+              <w:t>Main reason</w:t>
+            </w:r>
+          </w:p>
+        </w:tc>
+        <w:tc>
+          <w:tcPr>
+            <w:tcW w:type="dxa" w:w="6360"/>
+            <w:tcMar>
+              <w:top w:w="80" w:type="dxa"/>
+              <w:start w:w="120" w:type="dxa"/>
+              <w:bottom w:w="80" w:type="dxa"/>
+              <w:end w:w="120" w:type="dxa"/>
+            </w:tcMar>
+            <w:vAlign w:val="center"/>
+          </w:tcPr>
+          <w:p>
+            <w:pPr>
+              <w:keepLines/>
+              <w:spacing w:before="0" w:after="0" w:line="264" w:lineRule="auto"/>
+            </w:pPr>
+            <w:r/>
+            <w:r>
+              <w:rPr>
+                <w:rFonts w:ascii="Calibri" w:hAnsi="Calibri"/>
+                <w:color w:val="2A3730"/>
+                <w:sz w:val="19"/>
+              </w:rPr>
+              <w:t>Most specific current operational alert when supported; otherwise the strongest rules-based risk driver</w:t>
+            </w:r>
+          </w:p>
+        </w:tc>
+      </w:tr>
+      <w:tr>
+        <w:trPr>
+          <w:cantSplit/>
+        </w:trPr>
+        <w:tc>
+          <w:tcPr>
+            <w:tcW w:type="dxa" w:w="3000"/>
+            <w:tcMar>
+              <w:top w:w="80" w:type="dxa"/>
+              <w:start w:w="120" w:type="dxa"/>
+              <w:bottom w:w="80" w:type="dxa"/>
+              <w:end w:w="120" w:type="dxa"/>
+            </w:tcMar>
+            <w:vAlign w:val="center"/>
+            <w:shd w:fill="F4F8F5"/>
+          </w:tcPr>
+          <w:p>
+            <w:pPr>
+              <w:keepLines/>
+              <w:spacing w:before="0" w:after="0" w:line="264" w:lineRule="auto"/>
+            </w:pPr>
+            <w:r/>
+            <w:r>
+              <w:rPr>
+                <w:rFonts w:ascii="Calibri" w:hAnsi="Calibri"/>
+                <w:color w:val="2A3730"/>
+                <w:sz w:val="19"/>
+              </w:rPr>
+              <w:t>Projected harvest recovery</w:t>
+            </w:r>
+          </w:p>
+        </w:tc>
+        <w:tc>
+          <w:tcPr>
+            <w:tcW w:type="dxa" w:w="6360"/>
+            <w:tcMar>
+              <w:top w:w="80" w:type="dxa"/>
+              <w:start w:w="120" w:type="dxa"/>
+              <w:bottom w:w="80" w:type="dxa"/>
+              <w:end w:w="120" w:type="dxa"/>
+            </w:tcMar>
+            <w:vAlign w:val="center"/>
+            <w:shd w:fill="F4F8F5"/>
+          </w:tcPr>
+          <w:p>
+            <w:pPr>
+              <w:keepLines/>
+              <w:spacing w:before="0" w:after="0" w:line="264" w:lineRule="auto"/>
+            </w:pPr>
+            <w:r/>
+            <w:r>
+              <w:rPr>
+                <w:rFonts w:ascii="Calibri" w:hAnsi="Calibri"/>
+                <w:color w:val="2A3730"/>
+                <w:sz w:val="19"/>
+              </w:rPr>
+              <w:t>Selected compact Ridge model using age, current survival, mortality, feed, and available temperature/humidity inputs</w:t>
+            </w:r>
+          </w:p>
+        </w:tc>
+      </w:tr>
+      <w:tr>
+        <w:trPr>
+          <w:cantSplit/>
+        </w:trPr>
+        <w:tc>
+          <w:tcPr>
+            <w:tcW w:type="dxa" w:w="3000"/>
+            <w:tcMar>
+              <w:top w:w="80" w:type="dxa"/>
+              <w:start w:w="120" w:type="dxa"/>
+              <w:bottom w:w="80" w:type="dxa"/>
+              <w:end w:w="120" w:type="dxa"/>
+            </w:tcMar>
+            <w:vAlign w:val="center"/>
+          </w:tcPr>
+          <w:p>
+            <w:pPr>
+              <w:keepLines/>
+              <w:spacing w:before="0" w:after="0" w:line="264" w:lineRule="auto"/>
+            </w:pPr>
+            <w:r/>
+            <w:r>
+              <w:rPr>
+                <w:rFonts w:ascii="Calibri" w:hAnsi="Calibri"/>
+                <w:color w:val="2A3730"/>
+                <w:sz w:val="19"/>
+              </w:rPr>
+              <w:t>Projected Day 35 weight</w:t>
+            </w:r>
+          </w:p>
+        </w:tc>
+        <w:tc>
+          <w:tcPr>
+            <w:tcW w:type="dxa" w:w="6360"/>
+            <w:tcMar>
+              <w:top w:w="80" w:type="dxa"/>
+              <w:start w:w="120" w:type="dxa"/>
+              <w:bottom w:w="80" w:type="dxa"/>
+              <w:end w:w="120" w:type="dxa"/>
+            </w:tcMar>
+            <w:vAlign w:val="center"/>
+          </w:tcPr>
+          <w:p>
+            <w:pPr>
+              <w:keepLines/>
+              <w:spacing w:before="0" w:after="0" w:line="264" w:lineRule="auto"/>
+            </w:pPr>
+            <w:r/>
+            <w:r>
+              <w:rPr>
+                <w:rFonts w:ascii="Calibri" w:hAnsi="Calibri"/>
+                <w:color w:val="2A3730"/>
+                <w:sz w:val="19"/>
+              </w:rPr>
+              <w:t>Latest measured weight plus historically expected remaining gain from that measurement age to Day 35</w:t>
+            </w:r>
+          </w:p>
+        </w:tc>
+      </w:tr>
+      <w:tr>
+        <w:trPr>
+          <w:cantSplit/>
+        </w:trPr>
+        <w:tc>
+          <w:tcPr>
+            <w:tcW w:type="dxa" w:w="3000"/>
+            <w:tcMar>
+              <w:top w:w="80" w:type="dxa"/>
+              <w:start w:w="120" w:type="dxa"/>
+              <w:bottom w:w="80" w:type="dxa"/>
+              <w:end w:w="120" w:type="dxa"/>
+            </w:tcMar>
+            <w:vAlign w:val="center"/>
+            <w:shd w:fill="F4F8F5"/>
+          </w:tcPr>
+          <w:p>
+            <w:pPr>
+              <w:keepLines/>
+              <w:spacing w:before="0" w:after="0" w:line="264" w:lineRule="auto"/>
+            </w:pPr>
+            <w:r/>
+            <w:r>
+              <w:rPr>
+                <w:rFonts w:ascii="Calibri" w:hAnsi="Calibri"/>
+                <w:color w:val="2A3730"/>
+                <w:sz w:val="19"/>
+              </w:rPr>
+              <w:t>Identified problem</w:t>
+            </w:r>
+          </w:p>
+        </w:tc>
+        <w:tc>
+          <w:tcPr>
+            <w:tcW w:type="dxa" w:w="6360"/>
+            <w:tcMar>
+              <w:top w:w="80" w:type="dxa"/>
+              <w:start w:w="120" w:type="dxa"/>
+              <w:bottom w:w="80" w:type="dxa"/>
+              <w:end w:w="120" w:type="dxa"/>
+            </w:tcMar>
+            <w:vAlign w:val="center"/>
+            <w:shd w:fill="F4F8F5"/>
+          </w:tcPr>
+          <w:p>
+            <w:pPr>
+              <w:keepLines/>
+              <w:spacing w:before="0" w:after="0" w:line="264" w:lineRule="auto"/>
+            </w:pPr>
+            <w:r/>
+            <w:r>
+              <w:rPr>
+                <w:rFonts w:ascii="Calibri" w:hAnsi="Calibri"/>
+                <w:color w:val="2A3730"/>
+                <w:sz w:val="19"/>
+              </w:rPr>
+              <w:t>Deterministic pattern assigned from which risk dimensions are elevated and whether the concern is localized or farm-wide</w:t>
+            </w:r>
+          </w:p>
+        </w:tc>
+      </w:tr>
+      <w:tr>
+        <w:trPr>
+          <w:cantSplit/>
+        </w:trPr>
+        <w:tc>
+          <w:tcPr>
+            <w:tcW w:type="dxa" w:w="3000"/>
+            <w:tcMar>
+              <w:top w:w="80" w:type="dxa"/>
+              <w:start w:w="120" w:type="dxa"/>
+              <w:bottom w:w="80" w:type="dxa"/>
+              <w:end w:w="120" w:type="dxa"/>
+            </w:tcMar>
+            <w:vAlign w:val="center"/>
+          </w:tcPr>
+          <w:p>
+            <w:pPr>
+              <w:keepLines/>
+              <w:spacing w:before="0" w:after="0" w:line="264" w:lineRule="auto"/>
+            </w:pPr>
+            <w:r/>
+            <w:r>
+              <w:rPr>
+                <w:rFonts w:ascii="Calibri" w:hAnsi="Calibri"/>
+                <w:color w:val="2A3730"/>
+                <w:sz w:val="19"/>
+              </w:rPr>
+              <w:t>Next action</w:t>
+            </w:r>
+          </w:p>
+        </w:tc>
+        <w:tc>
+          <w:tcPr>
+            <w:tcW w:type="dxa" w:w="6360"/>
+            <w:tcMar>
+              <w:top w:w="80" w:type="dxa"/>
+              <w:start w:w="120" w:type="dxa"/>
+              <w:bottom w:w="80" w:type="dxa"/>
+              <w:end w:w="120" w:type="dxa"/>
+            </w:tcMar>
+            <w:vAlign w:val="center"/>
+          </w:tcPr>
+          <w:p>
+            <w:pPr>
+              <w:keepLines/>
+              <w:spacing w:before="0" w:after="0" w:line="264" w:lineRule="auto"/>
+            </w:pPr>
+            <w:r/>
+            <w:r>
+              <w:rPr>
+                <w:rFonts w:ascii="Calibri" w:hAnsi="Calibri"/>
+                <w:color w:val="2A3730"/>
+                <w:sz w:val="19"/>
+              </w:rPr>
+              <w:t>Specific operational-alert action when supported; otherwise the deterministic playbook rule for the identified pattern, with urgency from the risk rating</w:t>
+            </w:r>
+          </w:p>
+        </w:tc>
+      </w:tr>
+      <w:tr>
+        <w:trPr>
+          <w:cantSplit/>
+        </w:trPr>
+        <w:tc>
+          <w:tcPr>
+            <w:tcW w:type="dxa" w:w="3000"/>
+            <w:tcMar>
+              <w:top w:w="80" w:type="dxa"/>
+              <w:start w:w="120" w:type="dxa"/>
+              <w:bottom w:w="80" w:type="dxa"/>
+              <w:end w:w="120" w:type="dxa"/>
+            </w:tcMar>
+            <w:vAlign w:val="center"/>
+            <w:shd w:fill="F4F8F5"/>
+          </w:tcPr>
+          <w:p>
+            <w:pPr>
+              <w:keepLines/>
+              <w:spacing w:before="0" w:after="0" w:line="264" w:lineRule="auto"/>
+            </w:pPr>
+            <w:r/>
+            <w:r>
+              <w:rPr>
+                <w:rFonts w:ascii="Calibri" w:hAnsi="Calibri"/>
+                <w:color w:val="2A3730"/>
+                <w:sz w:val="19"/>
+              </w:rPr>
+              <w:t>Gross revenue at risk</w:t>
+            </w:r>
+          </w:p>
+        </w:tc>
+        <w:tc>
+          <w:tcPr>
+            <w:tcW w:type="dxa" w:w="6360"/>
+            <w:tcMar>
+              <w:top w:w="80" w:type="dxa"/>
+              <w:start w:w="120" w:type="dxa"/>
+              <w:bottom w:w="80" w:type="dxa"/>
+              <w:end w:w="120" w:type="dxa"/>
+            </w:tcMar>
+            <w:vAlign w:val="center"/>
+            <w:shd w:fill="F4F8F5"/>
+          </w:tcPr>
+          <w:p>
+            <w:pPr>
+              <w:keepLines/>
+              <w:spacing w:before="0" w:after="0" w:line="264" w:lineRule="auto"/>
+            </w:pPr>
+            <w:r/>
+            <w:r>
+              <w:rPr>
+                <w:rFonts w:ascii="Calibri" w:hAnsi="Calibri"/>
+                <w:color w:val="2A3730"/>
+                <w:sz w:val="19"/>
+              </w:rPr>
+              <w:t>Beginning birds × recovery gap to 95% × assumed sale weight × assumed PHP price per kg</w:t>
+            </w:r>
+          </w:p>
+        </w:tc>
+      </w:tr>
+    </w:tbl>
+    <w:p>
+      <w:pPr>
+        <w:spacing w:after="40"/>
+      </w:pPr>
+    </w:p>
+    <w:p>
+      <w:pPr>
+        <w:pStyle w:val="Heading3"/>
+      </w:pPr>
+      <w:r>
+        <w:t>Worked current-cycle example — Tags 2 on Day 22</w:t>
+      </w:r>
+    </w:p>
+    <w:p>
+      <w:pPr>
+        <w:spacing w:before="0" w:after="120" w:line="288" w:lineRule="auto"/>
+      </w:pPr>
+      <w:r>
+        <w:rPr>
+          <w:rFonts w:ascii="Calibri" w:hAnsi="Calibri"/>
+          <w:color w:val="2A3730"/>
+          <w:sz w:val="21"/>
+        </w:rPr>
+        <w:t xml:space="preserve">This is the result using records available through </w:t>
       </w:r>
       <w:r>
         <w:rPr>
@@ -693,7 +1274,24 @@
           <w:color w:val="2A3730"/>
           <w:sz w:val="21"/>
         </w:rPr>
-        <w:t>FARM HARVEST DATA.xlsx</w:t>
+        <w:t>25 July 2026</w:t>
+      </w:r>
+      <w:r>
+        <w:rPr>
+          <w:rFonts w:ascii="Calibri" w:hAnsi="Calibri"/>
+          <w:color w:val="2A3730"/>
+          <w:sz w:val="21"/>
+        </w:rPr>
+        <w:t xml:space="preserve"> for cycle </w:t>
+      </w:r>
+      <w:r>
+        <w:rPr>
+          <w:rFonts w:ascii="Calibri" w:hAnsi="Calibri"/>
+          <w:b/>
+          <w:color w:val="2A3730"/>
+          <w:sz w:val="21"/>
+        </w:rPr>
+        <w:t>2026-3</w:t>
       </w:r>
       <w:r>
         <w:rPr>
@@ -706,16 +1304,614 @@
     </w:p>
     <w:p>
       <w:pPr>
-        <w:pStyle w:val="ListBullet"/>
-      </w:pPr>
-      <w:r>
-        <w:rPr>
-          <w:rFonts w:ascii="Calibri" w:hAnsi="Calibri"/>
-          <w:color w:val="2A3730"/>
-          <w:sz w:val="21"/>
-        </w:rPr>
-        <w:t xml:space="preserve"> Final average weight for completed-cycle display: </w:t>
-      </w:r>
+        <w:pStyle w:val="Heading3"/>
+      </w:pPr>
+      <w:r>
+        <w:t>A. Risk rating — Medium, 3/12</w:t>
+      </w:r>
+    </w:p>
+    <w:tbl>
+      <w:tblPr>
+        <w:tblStyle w:val="TableGrid"/>
+        <w:tblW w:type="dxa" w:w="9360"/>
+        <w:tblLayout w:type="fixed"/>
+        <w:tblLook w:firstColumn="1" w:firstRow="1" w:lastColumn="0" w:lastRow="0" w:noHBand="0" w:noVBand="1" w:val="04A0"/>
+        <w:tblInd w:w="120" w:type="dxa"/>
+      </w:tblPr>
+      <w:tblGrid>
+        <w:gridCol w:w="2500"/>
+        <w:gridCol w:w="1800"/>
+        <w:gridCol w:w="5060"/>
+      </w:tblGrid>
+      <w:tr>
+        <w:trPr>
+          <w:cantSplit/>
+          <w:tblHeader w:val="true"/>
+        </w:trPr>
+        <w:tc>
+          <w:tcPr>
+            <w:tcW w:type="dxa" w:w="2500"/>
+            <w:tcMar>
+              <w:top w:w="80" w:type="dxa"/>
+              <w:start w:w="120" w:type="dxa"/>
+              <w:bottom w:w="80" w:type="dxa"/>
+              <w:end w:w="120" w:type="dxa"/>
+            </w:tcMar>
+            <w:vAlign w:val="center"/>
+            <w:shd w:fill="286245"/>
+          </w:tcPr>
+          <w:p>
+            <w:pPr>
+              <w:keepNext/>
+              <w:keepLines/>
+              <w:spacing w:before="0" w:after="0" w:line="264" w:lineRule="auto"/>
+            </w:pPr>
+            <w:r>
+              <w:rPr>
+                <w:b/>
+              </w:rPr>
+            </w:r>
+            <w:r>
+              <w:rPr>
+                <w:rFonts w:ascii="Calibri" w:hAnsi="Calibri"/>
+                <w:b/>
+                <w:color w:val="FFFFFF"/>
+                <w:sz w:val="18"/>
+              </w:rPr>
+              <w:t>Risk check</w:t>
+            </w:r>
+          </w:p>
+        </w:tc>
+        <w:tc>
+          <w:tcPr>
+            <w:tcW w:type="dxa" w:w="1800"/>
+            <w:tcMar>
+              <w:top w:w="80" w:type="dxa"/>
+              <w:start w:w="120" w:type="dxa"/>
+              <w:bottom w:w="80" w:type="dxa"/>
+              <w:end w:w="120" w:type="dxa"/>
+            </w:tcMar>
+            <w:vAlign w:val="center"/>
+            <w:shd w:fill="286245"/>
+          </w:tcPr>
+          <w:p>
+            <w:pPr>
+              <w:keepNext/>
+              <w:keepLines/>
+              <w:spacing w:before="0" w:after="0" w:line="264" w:lineRule="auto"/>
+            </w:pPr>
+            <w:r>
+              <w:rPr>
+                <w:b/>
+              </w:rPr>
+            </w:r>
+            <w:r>
+              <w:rPr>
+                <w:rFonts w:ascii="Calibri" w:hAnsi="Calibri"/>
+                <w:b/>
+                <w:color w:val="FFFFFF"/>
+                <w:sz w:val="18"/>
+              </w:rPr>
+              <w:t>Current calculation</w:t>
+            </w:r>
+          </w:p>
+        </w:tc>
+        <w:tc>
+          <w:tcPr>
+            <w:tcW w:type="dxa" w:w="5060"/>
+            <w:tcMar>
+              <w:top w:w="80" w:type="dxa"/>
+              <w:start w:w="120" w:type="dxa"/>
+              <w:bottom w:w="80" w:type="dxa"/>
+              <w:end w:w="120" w:type="dxa"/>
+            </w:tcMar>
+            <w:vAlign w:val="center"/>
+            <w:shd w:fill="286245"/>
+          </w:tcPr>
+          <w:p>
+            <w:pPr>
+              <w:keepNext/>
+              <w:keepLines/>
+              <w:spacing w:before="0" w:after="0" w:line="264" w:lineRule="auto"/>
+            </w:pPr>
+            <w:r>
+              <w:rPr>
+                <w:b/>
+              </w:rPr>
+            </w:r>
+            <w:r>
+              <w:rPr>
+                <w:rFonts w:ascii="Calibri" w:hAnsi="Calibri"/>
+                <w:b/>
+                <w:color w:val="FFFFFF"/>
+                <w:sz w:val="18"/>
+              </w:rPr>
+              <w:t>Day 22+ threshold and score</w:t>
+            </w:r>
+          </w:p>
+        </w:tc>
+      </w:tr>
+      <w:tr>
+        <w:trPr>
+          <w:cantSplit/>
+        </w:trPr>
+        <w:tc>
+          <w:tcPr>
+            <w:tcW w:type="dxa" w:w="2500"/>
+            <w:tcMar>
+              <w:top w:w="80" w:type="dxa"/>
+              <w:start w:w="120" w:type="dxa"/>
+              <w:bottom w:w="80" w:type="dxa"/>
+              <w:end w:w="120" w:type="dxa"/>
+            </w:tcMar>
+            <w:vAlign w:val="center"/>
+          </w:tcPr>
+          <w:p>
+            <w:pPr>
+              <w:keepNext/>
+              <w:keepLines/>
+              <w:spacing w:before="0" w:after="0" w:line="264" w:lineRule="auto"/>
+            </w:pPr>
+            <w:r/>
+            <w:r>
+              <w:rPr>
+                <w:rFonts w:ascii="Calibri" w:hAnsi="Calibri"/>
+                <w:color w:val="2A3730"/>
+                <w:sz w:val="18"/>
+              </w:rPr>
+              <w:t>Weight gap</w:t>
+            </w:r>
+          </w:p>
+        </w:tc>
+        <w:tc>
+          <w:tcPr>
+            <w:tcW w:type="dxa" w:w="1800"/>
+            <w:tcMar>
+              <w:top w:w="80" w:type="dxa"/>
+              <w:start w:w="120" w:type="dxa"/>
+              <w:bottom w:w="80" w:type="dxa"/>
+              <w:end w:w="120" w:type="dxa"/>
+            </w:tcMar>
+            <w:vAlign w:val="center"/>
+          </w:tcPr>
+          <w:p>
+            <w:pPr>
+              <w:keepNext/>
+              <w:keepLines/>
+              <w:spacing w:before="0" w:after="0" w:line="264" w:lineRule="auto"/>
+            </w:pPr>
+            <w:r/>
+            <w:r>
+              <w:rPr>
+                <w:rFonts w:ascii="Calibri" w:hAnsi="Calibri"/>
+                <w:color w:val="2A3730"/>
+                <w:sz w:val="18"/>
+              </w:rPr>
+              <w:t>No measured building weight in the current cycle</w:t>
+            </w:r>
+          </w:p>
+        </w:tc>
+        <w:tc>
+          <w:tcPr>
+            <w:tcW w:type="dxa" w:w="5060"/>
+            <w:tcMar>
+              <w:top w:w="80" w:type="dxa"/>
+              <w:start w:w="120" w:type="dxa"/>
+              <w:bottom w:w="80" w:type="dxa"/>
+              <w:end w:w="120" w:type="dxa"/>
+            </w:tcMar>
+            <w:vAlign w:val="center"/>
+          </w:tcPr>
+          <w:p>
+            <w:pPr>
+              <w:keepNext/>
+              <w:keepLines/>
+              <w:spacing w:before="0" w:after="0" w:line="264" w:lineRule="auto"/>
+            </w:pPr>
+            <w:r/>
+            <w:r>
+              <w:rPr>
+                <w:rFonts w:ascii="Calibri" w:hAnsi="Calibri"/>
+                <w:color w:val="2A3730"/>
+                <w:sz w:val="18"/>
+              </w:rPr>
+              <w:t>Not scored; shown as missing rather than zero</w:t>
+            </w:r>
+          </w:p>
+        </w:tc>
+      </w:tr>
+      <w:tr>
+        <w:trPr>
+          <w:cantSplit/>
+        </w:trPr>
+        <w:tc>
+          <w:tcPr>
+            <w:tcW w:type="dxa" w:w="2500"/>
+            <w:tcMar>
+              <w:top w:w="80" w:type="dxa"/>
+              <w:start w:w="120" w:type="dxa"/>
+              <w:bottom w:w="80" w:type="dxa"/>
+              <w:end w:w="120" w:type="dxa"/>
+            </w:tcMar>
+            <w:vAlign w:val="center"/>
+            <w:shd w:fill="F4F8F5"/>
+          </w:tcPr>
+          <w:p>
+            <w:pPr>
+              <w:keepNext/>
+              <w:keepLines/>
+              <w:spacing w:before="0" w:after="0" w:line="264" w:lineRule="auto"/>
+            </w:pPr>
+            <w:r/>
+            <w:r>
+              <w:rPr>
+                <w:rFonts w:ascii="Calibri" w:hAnsi="Calibri"/>
+                <w:color w:val="2A3730"/>
+                <w:sz w:val="18"/>
+              </w:rPr>
+              <w:t>Survival reference gap</w:t>
+            </w:r>
+          </w:p>
+        </w:tc>
+        <w:tc>
+          <w:tcPr>
+            <w:tcW w:type="dxa" w:w="1800"/>
+            <w:tcMar>
+              <w:top w:w="80" w:type="dxa"/>
+              <w:start w:w="120" w:type="dxa"/>
+              <w:bottom w:w="80" w:type="dxa"/>
+              <w:end w:w="120" w:type="dxa"/>
+            </w:tcMar>
+            <w:vAlign w:val="center"/>
+            <w:shd w:fill="F4F8F5"/>
+          </w:tcPr>
+          <w:p>
+            <w:pPr>
+              <w:keepNext/>
+              <w:keepLines/>
+              <w:spacing w:before="0" w:after="0" w:line="264" w:lineRule="auto"/>
+            </w:pPr>
+            <w:r/>
+            <w:r>
+              <w:rPr>
+                <w:rFonts w:ascii="Calibri" w:hAnsi="Calibri"/>
+                <w:color w:val="2A3730"/>
+                <w:sz w:val="18"/>
+              </w:rPr>
+              <w:t xml:space="preserve">Beginning 7,114; latest population 6,763; currently alive = 6,763 ÷ 7,114 = </w:t>
+            </w:r>
+            <w:r>
+              <w:rPr>
+                <w:rFonts w:ascii="Calibri" w:hAnsi="Calibri"/>
+                <w:b/>
+                <w:color w:val="2A3730"/>
+                <w:sz w:val="18"/>
+              </w:rPr>
+              <w:t>95.07%</w:t>
+            </w:r>
+            <w:r>
+              <w:rPr>
+                <w:rFonts w:ascii="Calibri" w:hAnsi="Calibri"/>
+                <w:color w:val="2A3730"/>
+                <w:sz w:val="18"/>
+              </w:rPr>
+              <w:t xml:space="preserve">. Provisional reference = 1 − (1 − 95%) × 22 ÷ 35 = </w:t>
+            </w:r>
+            <w:r>
+              <w:rPr>
+                <w:rFonts w:ascii="Calibri" w:hAnsi="Calibri"/>
+                <w:b/>
+                <w:color w:val="2A3730"/>
+                <w:sz w:val="18"/>
+              </w:rPr>
+              <w:t>96.86%</w:t>
+            </w:r>
+            <w:r>
+              <w:rPr>
+                <w:rFonts w:ascii="Calibri" w:hAnsi="Calibri"/>
+                <w:color w:val="2A3730"/>
+                <w:sz w:val="18"/>
+              </w:rPr>
+              <w:t xml:space="preserve">. Gap = </w:t>
+            </w:r>
+            <w:r>
+              <w:rPr>
+                <w:rFonts w:ascii="Calibri" w:hAnsi="Calibri"/>
+                <w:b/>
+                <w:color w:val="2A3730"/>
+                <w:sz w:val="18"/>
+              </w:rPr>
+              <w:t>1.79 points</w:t>
+            </w:r>
+            <w:r>
+              <w:rPr>
+                <w:rFonts w:ascii="Calibri" w:hAnsi="Calibri"/>
+                <w:color w:val="2A3730"/>
+                <w:sz w:val="18"/>
+              </w:rPr>
+              <w:t>.</w:t>
+            </w:r>
+          </w:p>
+        </w:tc>
+        <w:tc>
+          <w:tcPr>
+            <w:tcW w:type="dxa" w:w="5060"/>
+            <w:tcMar>
+              <w:top w:w="80" w:type="dxa"/>
+              <w:start w:w="120" w:type="dxa"/>
+              <w:bottom w:w="80" w:type="dxa"/>
+              <w:end w:w="120" w:type="dxa"/>
+            </w:tcMar>
+            <w:vAlign w:val="center"/>
+            <w:shd w:fill="F4F8F5"/>
+          </w:tcPr>
+          <w:p>
+            <w:pPr>
+              <w:keepNext/>
+              <w:keepLines/>
+              <w:spacing w:before="0" w:after="0" w:line="264" w:lineRule="auto"/>
+            </w:pPr>
+            <w:r/>
+            <w:r>
+              <w:rPr>
+                <w:rFonts w:ascii="Calibri" w:hAnsi="Calibri"/>
+                <w:color w:val="2A3730"/>
+                <w:sz w:val="18"/>
+              </w:rPr>
+              <w:t xml:space="preserve">0: ≤0.75; 1: &gt;0.75–2; 2: &gt;2–4; 3: &gt;4 points. </w:t>
+            </w:r>
+            <w:r>
+              <w:rPr>
+                <w:rFonts w:ascii="Calibri" w:hAnsi="Calibri"/>
+                <w:b/>
+                <w:color w:val="2A3730"/>
+                <w:sz w:val="18"/>
+              </w:rPr>
+              <w:t>Score 1.</w:t>
+            </w:r>
+          </w:p>
+        </w:tc>
+      </w:tr>
+      <w:tr>
+        <w:trPr>
+          <w:cantSplit/>
+        </w:trPr>
+        <w:tc>
+          <w:tcPr>
+            <w:tcW w:type="dxa" w:w="2500"/>
+            <w:tcMar>
+              <w:top w:w="80" w:type="dxa"/>
+              <w:start w:w="120" w:type="dxa"/>
+              <w:bottom w:w="80" w:type="dxa"/>
+              <w:end w:w="120" w:type="dxa"/>
+            </w:tcMar>
+            <w:vAlign w:val="center"/>
+          </w:tcPr>
+          <w:p>
+            <w:pPr>
+              <w:keepNext/>
+              <w:keepLines/>
+              <w:spacing w:before="0" w:after="0" w:line="264" w:lineRule="auto"/>
+            </w:pPr>
+            <w:r/>
+            <w:r>
+              <w:rPr>
+                <w:rFonts w:ascii="Calibri" w:hAnsi="Calibri"/>
+                <w:color w:val="2A3730"/>
+                <w:sz w:val="18"/>
+              </w:rPr>
+              <w:t>Mortality trend</w:t>
+            </w:r>
+          </w:p>
+        </w:tc>
+        <w:tc>
+          <w:tcPr>
+            <w:tcW w:type="dxa" w:w="1800"/>
+            <w:tcMar>
+              <w:top w:w="80" w:type="dxa"/>
+              <w:start w:w="120" w:type="dxa"/>
+              <w:bottom w:w="80" w:type="dxa"/>
+              <w:end w:w="120" w:type="dxa"/>
+            </w:tcMar>
+            <w:vAlign w:val="center"/>
+          </w:tcPr>
+          <w:p>
+            <w:pPr>
+              <w:keepNext/>
+              <w:keepLines/>
+              <w:spacing w:before="0" w:after="0" w:line="264" w:lineRule="auto"/>
+            </w:pPr>
+            <w:r/>
+            <w:r>
+              <w:rPr>
+                <w:rFonts w:ascii="Calibri" w:hAnsi="Calibri"/>
+                <w:color w:val="2A3730"/>
+                <w:sz w:val="18"/>
+              </w:rPr>
+              <w:t xml:space="preserve">Recent three-day mortality = 1.36/1,000; preceding baseline = 1.51/1,000. Worsening amount = max(1.36 − 1.51, 0) = </w:t>
+            </w:r>
+            <w:r>
+              <w:rPr>
+                <w:rFonts w:ascii="Calibri" w:hAnsi="Calibri"/>
+                <w:b/>
+                <w:color w:val="2A3730"/>
+                <w:sz w:val="18"/>
+              </w:rPr>
+              <w:t>0.00/1,000</w:t>
+            </w:r>
+            <w:r>
+              <w:rPr>
+                <w:rFonts w:ascii="Calibri" w:hAnsi="Calibri"/>
+                <w:color w:val="2A3730"/>
+                <w:sz w:val="18"/>
+              </w:rPr>
+              <w:t>.</w:t>
+            </w:r>
+          </w:p>
+        </w:tc>
+        <w:tc>
+          <w:tcPr>
+            <w:tcW w:type="dxa" w:w="5060"/>
+            <w:tcMar>
+              <w:top w:w="80" w:type="dxa"/>
+              <w:start w:w="120" w:type="dxa"/>
+              <w:bottom w:w="80" w:type="dxa"/>
+              <w:end w:w="120" w:type="dxa"/>
+            </w:tcMar>
+            <w:vAlign w:val="center"/>
+          </w:tcPr>
+          <w:p>
+            <w:pPr>
+              <w:keepNext/>
+              <w:keepLines/>
+              <w:spacing w:before="0" w:after="0" w:line="264" w:lineRule="auto"/>
+            </w:pPr>
+            <w:r/>
+            <w:r>
+              <w:rPr>
+                <w:rFonts w:ascii="Calibri" w:hAnsi="Calibri"/>
+                <w:color w:val="2A3730"/>
+                <w:sz w:val="18"/>
+              </w:rPr>
+              <w:t xml:space="preserve">0: ≤0.15; 1: &gt;0.15–0.50; 2: &gt;0.50–0.95; 3: &gt;0.95/1,000. </w:t>
+            </w:r>
+            <w:r>
+              <w:rPr>
+                <w:rFonts w:ascii="Calibri" w:hAnsi="Calibri"/>
+                <w:b/>
+                <w:color w:val="2A3730"/>
+                <w:sz w:val="18"/>
+              </w:rPr>
+              <w:t>Score 0.</w:t>
+            </w:r>
+          </w:p>
+        </w:tc>
+      </w:tr>
+      <w:tr>
+        <w:trPr>
+          <w:cantSplit/>
+        </w:trPr>
+        <w:tc>
+          <w:tcPr>
+            <w:tcW w:type="dxa" w:w="2500"/>
+            <w:tcMar>
+              <w:top w:w="80" w:type="dxa"/>
+              <w:start w:w="120" w:type="dxa"/>
+              <w:bottom w:w="80" w:type="dxa"/>
+              <w:end w:w="120" w:type="dxa"/>
+            </w:tcMar>
+            <w:vAlign w:val="center"/>
+            <w:shd w:fill="F4F8F5"/>
+          </w:tcPr>
+          <w:p>
+            <w:pPr>
+              <w:keepLines/>
+              <w:spacing w:before="0" w:after="0" w:line="264" w:lineRule="auto"/>
+            </w:pPr>
+            <w:r/>
+            <w:r>
+              <w:rPr>
+                <w:rFonts w:ascii="Calibri" w:hAnsi="Calibri"/>
+                <w:color w:val="2A3730"/>
+                <w:sz w:val="18"/>
+              </w:rPr>
+              <w:t>Peer comparison</w:t>
+            </w:r>
+          </w:p>
+        </w:tc>
+        <w:tc>
+          <w:tcPr>
+            <w:tcW w:type="dxa" w:w="1800"/>
+            <w:tcMar>
+              <w:top w:w="80" w:type="dxa"/>
+              <w:start w:w="120" w:type="dxa"/>
+              <w:bottom w:w="80" w:type="dxa"/>
+              <w:end w:w="120" w:type="dxa"/>
+            </w:tcMar>
+            <w:vAlign w:val="center"/>
+            <w:shd w:fill="F4F8F5"/>
+          </w:tcPr>
+          <w:p>
+            <w:pPr>
+              <w:keepLines/>
+              <w:spacing w:before="0" w:after="0" w:line="264" w:lineRule="auto"/>
+            </w:pPr>
+            <w:r/>
+            <w:r>
+              <w:rPr>
+                <w:rFonts w:ascii="Calibri" w:hAnsi="Calibri"/>
+                <w:color w:val="2A3730"/>
+                <w:sz w:val="18"/>
+              </w:rPr>
+              <w:t xml:space="preserve">Recent mortality is </w:t>
+            </w:r>
+            <w:r>
+              <w:rPr>
+                <w:rFonts w:ascii="Calibri" w:hAnsi="Calibri"/>
+                <w:b/>
+                <w:color w:val="2A3730"/>
+                <w:sz w:val="18"/>
+              </w:rPr>
+              <w:t>0.38/1,000 worse</w:t>
+            </w:r>
+            <w:r>
+              <w:rPr>
+                <w:rFonts w:ascii="Calibri" w:hAnsi="Calibri"/>
+                <w:color w:val="2A3730"/>
+                <w:sz w:val="18"/>
+              </w:rPr>
+              <w:t xml:space="preserve"> than the median of Tags 1 and Tags 3.</w:t>
+            </w:r>
+          </w:p>
+        </w:tc>
+        <w:tc>
+          <w:tcPr>
+            <w:tcW w:type="dxa" w:w="5060"/>
+            <w:tcMar>
+              <w:top w:w="80" w:type="dxa"/>
+              <w:start w:w="120" w:type="dxa"/>
+              <w:bottom w:w="80" w:type="dxa"/>
+              <w:end w:w="120" w:type="dxa"/>
+            </w:tcMar>
+            <w:vAlign w:val="center"/>
+            <w:shd w:fill="F4F8F5"/>
+          </w:tcPr>
+          <w:p>
+            <w:pPr>
+              <w:keepLines/>
+              <w:spacing w:before="0" w:after="0" w:line="264" w:lineRule="auto"/>
+            </w:pPr>
+            <w:r/>
+            <w:r>
+              <w:rPr>
+                <w:rFonts w:ascii="Calibri" w:hAnsi="Calibri"/>
+                <w:color w:val="2A3730"/>
+                <w:sz w:val="18"/>
+              </w:rPr>
+              <w:t xml:space="preserve">0: ≤0.10; 1: &gt;0.10–0.30; 2: &gt;0.30–0.60; 3: &gt;0.60/1,000. </w:t>
+            </w:r>
+            <w:r>
+              <w:rPr>
+                <w:rFonts w:ascii="Calibri" w:hAnsi="Calibri"/>
+                <w:b/>
+                <w:color w:val="2A3730"/>
+                <w:sz w:val="18"/>
+              </w:rPr>
+              <w:t>Score 2.</w:t>
+            </w:r>
+          </w:p>
+        </w:tc>
+      </w:tr>
+    </w:tbl>
+    <w:p>
+      <w:pPr>
+        <w:spacing w:after="40"/>
+      </w:pPr>
+    </w:p>
+    <w:p>
+      <w:pPr>
+        <w:spacing w:before="0" w:after="120" w:line="288" w:lineRule="auto"/>
+      </w:pPr>
       <w:r>
         <w:rPr>
           <w:rFonts w:ascii="Calibri" w:hAnsi="Calibri"/>
@@ -723,7 +1919,58 @@
           <w:color w:val="2A3730"/>
           <w:sz w:val="21"/>
         </w:rPr>
-        <w:t>Farm Performance Summary.xlsx</w:t>
+        <w:t>Total:</w:t>
+      </w:r>
+      <w:r>
+        <w:rPr>
+          <w:rFonts w:ascii="Calibri" w:hAnsi="Calibri"/>
+          <w:color w:val="2A3730"/>
+          <w:sz w:val="21"/>
+        </w:rPr>
+        <w:t xml:space="preserve"> survival 1 + mortality 0 + peer 2 = </w:t>
+      </w:r>
+      <w:r>
+        <w:rPr>
+          <w:rFonts w:ascii="Calibri" w:hAnsi="Calibri"/>
+          <w:b/>
+          <w:color w:val="2A3730"/>
+          <w:sz w:val="21"/>
+        </w:rPr>
+        <w:t>3/12</w:t>
+      </w:r>
+      <w:r>
+        <w:rPr>
+          <w:rFonts w:ascii="Calibri" w:hAnsi="Calibri"/>
+          <w:color w:val="2A3730"/>
+          <w:sz w:val="21"/>
+        </w:rPr>
+        <w:t xml:space="preserve">. Weight is not scored. Rating bands are Low 0–1, Medium 2–3, High 4–5, and Critical 6–12. Therefore </w:t>
+      </w:r>
+      <w:r>
+        <w:rPr>
+          <w:rFonts w:ascii="Calibri" w:hAnsi="Calibri"/>
+          <w:b/>
+          <w:color w:val="2A3730"/>
+          <w:sz w:val="21"/>
+        </w:rPr>
+        <w:t>3 = Medium risk</w:t>
+      </w:r>
+      <w:r>
+        <w:rPr>
+          <w:rFonts w:ascii="Calibri" w:hAnsi="Calibri"/>
+          <w:color w:val="2A3730"/>
+          <w:sz w:val="21"/>
+        </w:rPr>
+        <w:t xml:space="preserve">, with </w:t>
+      </w:r>
+      <w:r>
+        <w:rPr>
+          <w:rFonts w:ascii="Calibri" w:hAnsi="Calibri"/>
+          <w:b/>
+          <w:color w:val="2A3730"/>
+          <w:sz w:val="21"/>
+        </w:rPr>
+        <w:t>3 of 4 checks supported by data</w:t>
       </w:r>
       <w:r>
         <w:rPr>
@@ -736,16 +1983,8 @@
     </w:p>
     <w:p>
       <w:pPr>
-        <w:pStyle w:val="ListBullet"/>
-      </w:pPr>
-      <w:r>
-        <w:rPr>
-          <w:rFonts w:ascii="Calibri" w:hAnsi="Calibri"/>
-          <w:color w:val="2A3730"/>
-          <w:sz w:val="21"/>
-        </w:rPr>
-        <w:t xml:space="preserve"> Age-specific weight targets: farm </w:t>
-      </w:r>
+        <w:spacing w:before="0" w:after="120" w:line="288" w:lineRule="auto"/>
+      </w:pPr>
       <w:r>
         <w:rPr>
           <w:rFonts w:ascii="Calibri" w:hAnsi="Calibri"/>
@@ -753,296 +1992,15 @@
           <w:color w:val="2A3730"/>
           <w:sz w:val="21"/>
         </w:rPr>
-        <w:t>Target Weights</w:t>
-      </w:r>
-      <w:r>
-        <w:rPr>
-          <w:rFonts w:ascii="Calibri" w:hAnsi="Calibri"/>
-          <w:color w:val="2A3730"/>
-          <w:sz w:val="21"/>
-        </w:rPr>
-        <w:t xml:space="preserve"> sheet.</w:t>
-      </w:r>
-    </w:p>
-    <w:p>
-      <w:pPr>
-        <w:pStyle w:val="ListBullet"/>
-      </w:pPr>
-      <w:r>
-        <w:rPr>
-          <w:rFonts w:ascii="Calibri" w:hAnsi="Calibri"/>
-          <w:color w:val="2A3730"/>
-          <w:sz w:val="21"/>
-        </w:rPr>
-        <w:t xml:space="preserve"> Early detailed weights: </w:t>
-      </w:r>
-      <w:r>
-        <w:rPr>
-          <w:rFonts w:ascii="Calibri" w:hAnsi="Calibri"/>
-          <w:b/>
-          <w:color w:val="2A3730"/>
-          <w:sz w:val="21"/>
-        </w:rPr>
-        <w:t>Weights Cleaned.xlsx</w:t>
-      </w:r>
-      <w:r>
-        <w:rPr>
-          <w:rFonts w:ascii="Calibri" w:hAnsi="Calibri"/>
-          <w:color w:val="2A3730"/>
-          <w:sz w:val="21"/>
-        </w:rPr>
-        <w:t>, available only for limited buildings/cycles.</w:t>
-      </w:r>
-    </w:p>
-    <w:p>
-      <w:pPr>
-        <w:pStyle w:val="ListBullet"/>
-      </w:pPr>
-      <w:r>
-        <w:rPr>
-          <w:rFonts w:ascii="Calibri" w:hAnsi="Calibri"/>
-          <w:color w:val="2A3730"/>
-          <w:sz w:val="21"/>
-        </w:rPr>
-        <w:t xml:space="preserve"> Farm thresholds and interventions: </w:t>
-      </w:r>
-      <w:r>
-        <w:rPr>
-          <w:rFonts w:ascii="Calibri" w:hAnsi="Calibri"/>
-          <w:b/>
-          <w:color w:val="2A3730"/>
-          <w:sz w:val="21"/>
-        </w:rPr>
-        <w:t>Farmer Validation Workbook.xlsx</w:t>
-      </w:r>
-      <w:r>
-        <w:rPr>
-          <w:rFonts w:ascii="Calibri" w:hAnsi="Calibri"/>
-          <w:color w:val="2A3730"/>
-          <w:sz w:val="21"/>
-        </w:rPr>
-        <w:t>, excluding its Risk Scoring Matrix as instructed.</w:t>
-      </w:r>
-    </w:p>
-    <w:p>
-      <w:pPr>
-        <w:spacing w:before="0" w:after="120" w:line="288" w:lineRule="auto"/>
-      </w:pPr>
-      <w:r>
-        <w:rPr>
-          <w:rFonts w:ascii="Calibri" w:hAnsi="Calibri"/>
-          <w:b/>
-          <w:color w:val="2A3730"/>
-          <w:sz w:val="21"/>
-        </w:rPr>
-        <w:t>Cleaning performed</w:t>
-      </w:r>
-    </w:p>
-    <w:p>
-      <w:pPr>
-        <w:pStyle w:val="ListBullet"/>
-      </w:pPr>
-      <w:r>
-        <w:rPr>
-          <w:rFonts w:ascii="Calibri" w:hAnsi="Calibri"/>
-          <w:color w:val="2A3730"/>
-          <w:sz w:val="21"/>
-        </w:rPr>
-        <w:t xml:space="preserve"> Started with </w:t>
-      </w:r>
-      <w:r>
-        <w:rPr>
-          <w:rFonts w:ascii="Calibri" w:hAnsi="Calibri"/>
-          <w:b/>
-          <w:color w:val="2A3730"/>
-          <w:sz w:val="21"/>
-        </w:rPr>
-        <w:t>1,785 source rows</w:t>
-      </w:r>
-      <w:r>
-        <w:rPr>
-          <w:rFonts w:ascii="Calibri" w:hAnsi="Calibri"/>
-          <w:color w:val="2A3730"/>
-          <w:sz w:val="21"/>
-        </w:rPr>
-        <w:t>.</w:t>
-      </w:r>
-    </w:p>
-    <w:p>
-      <w:pPr>
-        <w:pStyle w:val="ListBullet"/>
-      </w:pPr>
-      <w:r>
-        <w:rPr>
-          <w:rFonts w:ascii="Calibri" w:hAnsi="Calibri"/>
-          <w:color w:val="2A3730"/>
-          <w:sz w:val="21"/>
-        </w:rPr>
-        <w:t xml:space="preserve"> Consolidated </w:t>
-      </w:r>
-      <w:r>
-        <w:rPr>
-          <w:rFonts w:ascii="Calibri" w:hAnsi="Calibri"/>
-          <w:b/>
-          <w:color w:val="2A3730"/>
-          <w:sz w:val="21"/>
-        </w:rPr>
-        <w:t>119 repeated rows</w:t>
-      </w:r>
-      <w:r>
-        <w:rPr>
-          <w:rFonts w:ascii="Calibri" w:hAnsi="Calibri"/>
-          <w:color w:val="2A3730"/>
-          <w:sz w:val="21"/>
-        </w:rPr>
-        <w:t>.</w:t>
-      </w:r>
-    </w:p>
-    <w:p>
-      <w:pPr>
-        <w:pStyle w:val="ListBullet"/>
-      </w:pPr>
-      <w:r>
-        <w:rPr>
-          <w:rFonts w:ascii="Calibri" w:hAnsi="Calibri"/>
-          <w:color w:val="2A3730"/>
-          <w:sz w:val="21"/>
-        </w:rPr>
-        <w:t xml:space="preserve"> Produced </w:t>
-      </w:r>
-      <w:r>
-        <w:rPr>
-          <w:rFonts w:ascii="Calibri" w:hAnsi="Calibri"/>
-          <w:b/>
-          <w:color w:val="2A3730"/>
-          <w:sz w:val="21"/>
-        </w:rPr>
-        <w:t>1,666 unique building-day records</w:t>
-      </w:r>
-      <w:r>
-        <w:rPr>
-          <w:rFonts w:ascii="Calibri" w:hAnsi="Calibri"/>
-          <w:color w:val="2A3730"/>
-          <w:sz w:val="21"/>
-        </w:rPr>
-        <w:t>.</w:t>
-      </w:r>
-    </w:p>
-    <w:p>
-      <w:pPr>
-        <w:pStyle w:val="ListBullet"/>
-      </w:pPr>
-      <w:r>
-        <w:rPr>
-          <w:rFonts w:ascii="Calibri" w:hAnsi="Calibri"/>
-          <w:color w:val="2A3730"/>
-          <w:sz w:val="21"/>
-        </w:rPr>
-        <w:t xml:space="preserve"> Found </w:t>
-      </w:r>
-      <w:r>
-        <w:rPr>
-          <w:rFonts w:ascii="Calibri" w:hAnsi="Calibri"/>
-          <w:b/>
-          <w:color w:val="2A3730"/>
-          <w:sz w:val="21"/>
-        </w:rPr>
-        <w:t>0 blocking duplicate conflicts</w:t>
-      </w:r>
-      <w:r>
-        <w:rPr>
-          <w:rFonts w:ascii="Calibri" w:hAnsi="Calibri"/>
-          <w:color w:val="2A3730"/>
-          <w:sz w:val="21"/>
-        </w:rPr>
-        <w:t>.</w:t>
-      </w:r>
-    </w:p>
-    <w:p>
-      <w:pPr>
-        <w:pStyle w:val="ListBullet"/>
-      </w:pPr>
-      <w:r>
-        <w:rPr>
-          <w:rFonts w:ascii="Calibri" w:hAnsi="Calibri"/>
-          <w:color w:val="2A3730"/>
-          <w:sz w:val="21"/>
-        </w:rPr>
-        <w:t xml:space="preserve"> Normalized dates, building names, age, population, mortality, feed, weight, temperature, and humidity.</w:t>
-      </w:r>
-    </w:p>
-    <w:p>
-      <w:pPr>
-        <w:pStyle w:val="ListBullet"/>
-      </w:pPr>
-      <w:r>
-        <w:rPr>
-          <w:rFonts w:ascii="Calibri" w:hAnsi="Calibri"/>
-          <w:color w:val="2A3730"/>
-          <w:sz w:val="21"/>
-        </w:rPr>
-        <w:t xml:space="preserve"> Kept missing values as missing; blanks were not silently changed to zero.</w:t>
-      </w:r>
-    </w:p>
-    <w:p>
-      <w:pPr>
-        <w:spacing w:before="0" w:after="120" w:line="288" w:lineRule="auto"/>
-      </w:pPr>
-      <w:r>
-        <w:rPr>
-          <w:rFonts w:ascii="Calibri" w:hAnsi="Calibri"/>
-          <w:b/>
-          <w:color w:val="2A3730"/>
-          <w:sz w:val="21"/>
-        </w:rPr>
-        <w:t>Leakage protection</w:t>
-      </w:r>
-    </w:p>
-    <w:p>
-      <w:pPr>
-        <w:pStyle w:val="ListBullet"/>
-      </w:pPr>
-      <w:r>
-        <w:rPr>
-          <w:rFonts w:ascii="Calibri" w:hAnsi="Calibri"/>
-          <w:color w:val="2A3730"/>
-          <w:sz w:val="21"/>
-        </w:rPr>
-        <w:t xml:space="preserve"> Every prediction uses only information available by the review date.</w:t>
-      </w:r>
-    </w:p>
-    <w:p>
-      <w:pPr>
-        <w:pStyle w:val="ListBullet"/>
-      </w:pPr>
-      <w:r>
-        <w:rPr>
-          <w:rFonts w:ascii="Calibri" w:hAnsi="Calibri"/>
-          <w:color w:val="2A3730"/>
-          <w:sz w:val="21"/>
-        </w:rPr>
-        <w:t xml:space="preserve"> Model validation holds out entire harvest cycles.</w:t>
-      </w:r>
-    </w:p>
-    <w:p>
-      <w:pPr>
-        <w:pStyle w:val="ListBullet"/>
-      </w:pPr>
-      <w:r>
-        <w:rPr>
-          <w:rFonts w:ascii="Calibri" w:hAnsi="Calibri"/>
-          <w:color w:val="2A3730"/>
-          <w:sz w:val="21"/>
-        </w:rPr>
-        <w:t xml:space="preserve"> Daily rows from the same cycle never appear in both training and validation.</w:t>
-      </w:r>
-    </w:p>
-    <w:p>
-      <w:pPr>
-        <w:pStyle w:val="Heading1"/>
-      </w:pPr>
-      <w:r>
-        <w:t>4. Component 1 — Rules-based risk score</w:t>
+        <w:t>How to say this:</w:t>
+      </w:r>
+      <w:r>
+        <w:rPr>
+          <w:rFonts w:ascii="Calibri" w:hAnsi="Calibri"/>
+          <w:color w:val="2A3730"/>
+          <w:sz w:val="21"/>
+        </w:rPr>
+        <w:t xml:space="preserve"> “By Day 22, the temporary straight-line reference allows 3.14% cumulative loss, so 96.86% would remain. The record shows 95.07% remaining. The 1.79-point shortfall receives 1 point.” This reference is a configurable management benchmark, not a learned biological curve.</w:t>
       </w:r>
     </w:p>
     <w:p>
@@ -1050,41 +2008,7 @@
         <w:pStyle w:val="Heading3"/>
       </w:pPr>
       <w:r>
-        <w:t>What it answers</w:t>
-      </w:r>
-    </w:p>
-    <w:p>
-      <w:pPr>
-        <w:pStyle w:val="ListBullet"/>
-      </w:pPr>
-      <w:r>
-        <w:rPr>
-          <w:rFonts w:ascii="Calibri" w:hAnsi="Calibri"/>
-          <w:color w:val="2A3730"/>
-          <w:sz w:val="21"/>
-        </w:rPr>
-        <w:t xml:space="preserve"> Which building should management inspect first?</w:t>
-      </w:r>
-    </w:p>
-    <w:p>
-      <w:pPr>
-        <w:pStyle w:val="ListBullet"/>
-      </w:pPr>
-      <w:r>
-        <w:rPr>
-          <w:rFonts w:ascii="Calibri" w:hAnsi="Calibri"/>
-          <w:color w:val="2A3730"/>
-          <w:sz w:val="21"/>
-        </w:rPr>
-        <w:t xml:space="preserve"> Which recorded warning signs explain the concern?</w:t>
-      </w:r>
-    </w:p>
-    <w:p>
-      <w:pPr>
-        <w:pStyle w:val="Heading3"/>
-      </w:pPr>
-      <w:r>
-        <w:t>Four dimensions</w:t>
+        <w:t>B. Projected harvest recovery — 91.9%</w:t>
       </w:r>
     </w:p>
     <w:p>
@@ -1098,19 +2022,10 @@
       <w:r>
         <w:rPr>
           <w:rFonts w:ascii="Calibri" w:hAnsi="Calibri"/>
-          <w:b/>
-          <w:color w:val="2A3730"/>
-          <w:sz w:val="21"/>
-        </w:rPr>
-        <w:t>Weight gap:</w:t>
-      </w:r>
-      <w:r>
-        <w:rPr>
-          <w:rFonts w:ascii="Calibri" w:hAnsi="Calibri"/>
-          <w:color w:val="2A3730"/>
-          <w:sz w:val="21"/>
-        </w:rPr>
-        <w:t xml:space="preserve"> latest measured weight versus the target for the actual weighing day.</w:t>
+          <w:color w:val="2A3730"/>
+          <w:sz w:val="21"/>
+        </w:rPr>
+        <w:t>Canary builds the Day 22 input row: age, current survival, latest and recent mortality, mortality trend, latest and cumulative feed, and recent temperature and humidity when available.</w:t>
       </w:r>
     </w:p>
     <w:p>
@@ -1124,19 +2039,10 @@
       <w:r>
         <w:rPr>
           <w:rFonts w:ascii="Calibri" w:hAnsi="Calibri"/>
-          <w:b/>
-          <w:color w:val="2A3730"/>
-          <w:sz w:val="21"/>
-        </w:rPr>
-        <w:t>Survival path:</w:t>
-      </w:r>
-      <w:r>
-        <w:rPr>
-          <w:rFonts w:ascii="Calibri" w:hAnsi="Calibri"/>
-          <w:color w:val="2A3730"/>
-          <w:sz w:val="21"/>
-        </w:rPr>
-        <w:t xml:space="preserve"> current percentage alive versus the assumed path to 95%.</w:t>
+          <w:color w:val="2A3730"/>
+          <w:sz w:val="21"/>
+        </w:rPr>
+        <w:t>Missing values are imputed from training data and represented by explicit missing-data flags; numeric inputs are standardized.</w:t>
       </w:r>
     </w:p>
     <w:p>
@@ -1150,19 +2056,27 @@
       <w:r>
         <w:rPr>
           <w:rFonts w:ascii="Calibri" w:hAnsi="Calibri"/>
+          <w:color w:val="2A3730"/>
+          <w:sz w:val="21"/>
+        </w:rPr>
+        <w:t xml:space="preserve">The selected compact Ridge model calculates an unconstrained estimate of </w:t>
+      </w:r>
+      <w:r>
+        <w:rPr>
+          <w:rFonts w:ascii="Calibri" w:hAnsi="Calibri"/>
           <w:b/>
           <w:color w:val="2A3730"/>
           <w:sz w:val="21"/>
         </w:rPr>
-        <w:t>Mortality momentum:</w:t>
-      </w:r>
-      <w:r>
-        <w:rPr>
-          <w:rFonts w:ascii="Calibri" w:hAnsi="Calibri"/>
-          <w:color w:val="2A3730"/>
-          <w:sz w:val="21"/>
-        </w:rPr>
-        <w:t xml:space="preserve"> recent three-day mortality versus the preceding baseline.</w:t>
+        <w:t>91.8728%</w:t>
+      </w:r>
+      <w:r>
+        <w:rPr>
+          <w:rFonts w:ascii="Calibri" w:hAnsi="Calibri"/>
+          <w:color w:val="2A3730"/>
+          <w:sz w:val="21"/>
+        </w:rPr>
+        <w:t>.</w:t>
       </w:r>
     </w:p>
     <w:p>
@@ -1170,6 +2084,1616 @@
         <w:numPr>
           <w:ilvl w:val="0"/>
           <w:numId w:val="11"/>
+        </w:numPr>
+        <w:spacing w:before="0" w:after="60" w:line="283" w:lineRule="auto"/>
+      </w:pPr>
+      <w:r>
+        <w:rPr>
+          <w:rFonts w:ascii="Calibri" w:hAnsi="Calibri"/>
+          <w:color w:val="2A3730"/>
+          <w:sz w:val="21"/>
+        </w:rPr>
+        <w:t xml:space="preserve">Canary applies the accounting safeguard: final recovery cannot exceed survival already recorded today. </w:t>
+      </w:r>
+      <w:r>
+        <w:rPr>
+          <w:rFonts w:ascii="Calibri" w:hAnsi="Calibri"/>
+          <w:b/>
+          <w:color w:val="286245"/>
+          <w:sz w:val="20"/>
+        </w:rPr>
+        <w:t>min(91.8728%, 95.0661%) = 91.8728%</w:t>
+      </w:r>
+      <w:r>
+        <w:rPr>
+          <w:rFonts w:ascii="Calibri" w:hAnsi="Calibri"/>
+          <w:color w:val="2A3730"/>
+          <w:sz w:val="21"/>
+        </w:rPr>
+        <w:t>.</w:t>
+      </w:r>
+    </w:p>
+    <w:p>
+      <w:pPr>
+        <w:numPr>
+          <w:ilvl w:val="0"/>
+          <w:numId w:val="11"/>
+        </w:numPr>
+        <w:spacing w:before="0" w:after="60" w:line="283" w:lineRule="auto"/>
+      </w:pPr>
+      <w:r>
+        <w:rPr>
+          <w:rFonts w:ascii="Calibri" w:hAnsi="Calibri"/>
+          <w:color w:val="2A3730"/>
+          <w:sz w:val="21"/>
+        </w:rPr>
+        <w:t xml:space="preserve">Displayed prediction: </w:t>
+      </w:r>
+      <w:r>
+        <w:rPr>
+          <w:rFonts w:ascii="Calibri" w:hAnsi="Calibri"/>
+          <w:b/>
+          <w:color w:val="2A3730"/>
+          <w:sz w:val="21"/>
+        </w:rPr>
+        <w:t>91.9%</w:t>
+      </w:r>
+      <w:r>
+        <w:rPr>
+          <w:rFonts w:ascii="Calibri" w:hAnsi="Calibri"/>
+          <w:color w:val="2A3730"/>
+          <w:sz w:val="21"/>
+        </w:rPr>
+        <w:t xml:space="preserve">. Gap to the 95% goal: </w:t>
+      </w:r>
+      <w:r>
+        <w:rPr>
+          <w:rFonts w:ascii="Calibri" w:hAnsi="Calibri"/>
+          <w:b/>
+          <w:color w:val="2A3730"/>
+          <w:sz w:val="21"/>
+        </w:rPr>
+        <w:t>3.13 percentage points below</w:t>
+      </w:r>
+      <w:r>
+        <w:rPr>
+          <w:rFonts w:ascii="Calibri" w:hAnsi="Calibri"/>
+          <w:color w:val="2A3730"/>
+          <w:sz w:val="21"/>
+        </w:rPr>
+        <w:t>.</w:t>
+      </w:r>
+    </w:p>
+    <w:p>
+      <w:pPr>
+        <w:numPr>
+          <w:ilvl w:val="0"/>
+          <w:numId w:val="11"/>
+        </w:numPr>
+        <w:spacing w:before="0" w:after="60" w:line="283" w:lineRule="auto"/>
+      </w:pPr>
+      <w:r>
+        <w:rPr>
+          <w:rFonts w:ascii="Calibri" w:hAnsi="Calibri"/>
+          <w:color w:val="2A3730"/>
+          <w:sz w:val="21"/>
+        </w:rPr>
+        <w:t xml:space="preserve">The empirical 80% likely range is approximately </w:t>
+      </w:r>
+      <w:r>
+        <w:rPr>
+          <w:rFonts w:ascii="Calibri" w:hAnsi="Calibri"/>
+          <w:b/>
+          <w:color w:val="2A3730"/>
+          <w:sz w:val="21"/>
+        </w:rPr>
+        <w:t>89.6%–94.1%</w:t>
+      </w:r>
+      <w:r>
+        <w:rPr>
+          <w:rFonts w:ascii="Calibri" w:hAnsi="Calibri"/>
+          <w:color w:val="2A3730"/>
+          <w:sz w:val="21"/>
+        </w:rPr>
+        <w:t>.</w:t>
+      </w:r>
+    </w:p>
+    <w:p>
+      <w:pPr>
+        <w:spacing w:before="0" w:after="120" w:line="288" w:lineRule="auto"/>
+      </w:pPr>
+      <w:r>
+        <w:rPr>
+          <w:rFonts w:ascii="Calibri" w:hAnsi="Calibri"/>
+          <w:color w:val="2A3730"/>
+          <w:sz w:val="21"/>
+        </w:rPr>
+        <w:t>The forecast is a model estimate, not part of the 3/12 risk-score calculation and not proof that a particular input caused the result.</w:t>
+      </w:r>
+    </w:p>
+    <w:p>
+      <w:pPr>
+        <w:pStyle w:val="Heading3"/>
+      </w:pPr>
+      <w:r>
+        <w:t>C. Projected Day 35 average weight — unavailable for this current card</w:t>
+      </w:r>
+    </w:p>
+    <w:p>
+      <w:pPr>
+        <w:pStyle w:val="ListBullet"/>
+      </w:pPr>
+      <w:r>
+        <w:rPr>
+          <w:rFonts w:ascii="Calibri" w:hAnsi="Calibri"/>
+          <w:color w:val="2A3730"/>
+          <w:sz w:val="21"/>
+        </w:rPr>
+        <w:t xml:space="preserve"> Tags 2 has </w:t>
+      </w:r>
+      <w:r>
+        <w:rPr>
+          <w:rFonts w:ascii="Calibri" w:hAnsi="Calibri"/>
+          <w:b/>
+          <w:color w:val="2A3730"/>
+          <w:sz w:val="21"/>
+        </w:rPr>
+        <w:t>no measured building weight in cycle 2026-3</w:t>
+      </w:r>
+      <w:r>
+        <w:rPr>
+          <w:rFonts w:ascii="Calibri" w:hAnsi="Calibri"/>
+          <w:color w:val="2A3730"/>
+          <w:sz w:val="21"/>
+        </w:rPr>
+        <w:t>.</w:t>
+      </w:r>
+    </w:p>
+    <w:p>
+      <w:pPr>
+        <w:pStyle w:val="ListBullet"/>
+      </w:pPr>
+      <w:r>
+        <w:rPr>
+          <w:rFonts w:ascii="Calibri" w:hAnsi="Calibri"/>
+          <w:color w:val="2A3730"/>
+          <w:sz w:val="21"/>
+        </w:rPr>
+        <w:t xml:space="preserve"> Canary therefore displays </w:t>
+      </w:r>
+      <w:r>
+        <w:rPr>
+          <w:rFonts w:ascii="Calibri" w:hAnsi="Calibri"/>
+          <w:b/>
+          <w:color w:val="2A3730"/>
+          <w:sz w:val="21"/>
+        </w:rPr>
+        <w:t>Not available / Needs a measured weight</w:t>
+      </w:r>
+      <w:r>
+        <w:rPr>
+          <w:rFonts w:ascii="Calibri" w:hAnsi="Calibri"/>
+          <w:color w:val="2A3730"/>
+          <w:sz w:val="21"/>
+        </w:rPr>
+        <w:t xml:space="preserve"> instead of giving every building a generic prediction.</w:t>
+      </w:r>
+    </w:p>
+    <w:p>
+      <w:pPr>
+        <w:pStyle w:val="ListBullet"/>
+      </w:pPr>
+      <w:r>
+        <w:rPr>
+          <w:rFonts w:ascii="Calibri" w:hAnsi="Calibri"/>
+          <w:color w:val="2A3730"/>
+          <w:sz w:val="21"/>
+        </w:rPr>
+        <w:t xml:space="preserve"> When a measurement exists, the calculation is:</w:t>
+      </w:r>
+    </w:p>
+    <w:tbl>
+      <w:tblPr>
+        <w:tblW w:type="dxa" w:w="9360"/>
+        <w:tblLayout w:type="fixed"/>
+        <w:tblLook w:firstColumn="1" w:firstRow="1" w:lastColumn="0" w:lastRow="0" w:noHBand="0" w:noVBand="1" w:val="04A0"/>
+        <w:tblInd w:w="120" w:type="dxa"/>
+      </w:tblPr>
+      <w:tblGrid>
+        <w:gridCol w:w="9360"/>
+      </w:tblGrid>
+      <w:tr>
+        <w:trPr>
+          <w:cantSplit/>
+        </w:trPr>
+        <w:tc>
+          <w:tcPr>
+            <w:tcW w:type="dxa" w:w="9360"/>
+            <w:tcMar>
+              <w:top w:w="80" w:type="dxa"/>
+              <w:start w:w="120" w:type="dxa"/>
+              <w:bottom w:w="80" w:type="dxa"/>
+              <w:end w:w="120" w:type="dxa"/>
+            </w:tcMar>
+            <w:vAlign w:val="center"/>
+            <w:shd w:fill="F2F8D9"/>
+          </w:tcPr>
+          <w:p>
+            <w:pPr>
+              <w:spacing w:before="0" w:after="0" w:line="300" w:lineRule="auto"/>
+            </w:pPr>
+            <w:r>
+              <w:rPr>
+                <w:rFonts w:ascii="Calibri" w:hAnsi="Calibri"/>
+                <w:color w:val="173F31"/>
+                <w:sz w:val="21"/>
+              </w:rPr>
+              <w:t>Projected Day 35 weight = latest measured weight + historical remaining gain from that measurement age</w:t>
+            </w:r>
+          </w:p>
+        </w:tc>
+      </w:tr>
+    </w:tbl>
+    <w:p>
+      <w:pPr>
+        <w:spacing w:after="40"/>
+      </w:pPr>
+    </w:p>
+    <w:p>
+      <w:pPr>
+        <w:spacing w:before="0" w:after="120" w:line="288" w:lineRule="auto"/>
+      </w:pPr>
+      <w:r>
+        <w:rPr>
+          <w:rFonts w:ascii="Calibri" w:hAnsi="Calibri"/>
+          <w:b/>
+          <w:color w:val="2A3730"/>
+          <w:sz w:val="21"/>
+        </w:rPr>
+        <w:t>Illustrative recorded example:</w:t>
+      </w:r>
+      <w:r>
+        <w:rPr>
+          <w:rFonts w:ascii="Calibri" w:hAnsi="Calibri"/>
+          <w:color w:val="2A3730"/>
+          <w:sz w:val="21"/>
+        </w:rPr>
+        <w:t xml:space="preserve"> Lags 2 in cycle 2026-2 measured </w:t>
+      </w:r>
+      <w:r>
+        <w:rPr>
+          <w:rFonts w:ascii="Calibri" w:hAnsi="Calibri"/>
+          <w:b/>
+          <w:color w:val="2A3730"/>
+          <w:sz w:val="21"/>
+        </w:rPr>
+        <w:t>172.5 g on Day 14</w:t>
+      </w:r>
+      <w:r>
+        <w:rPr>
+          <w:rFonts w:ascii="Calibri" w:hAnsi="Calibri"/>
+          <w:color w:val="2A3730"/>
+          <w:sz w:val="21"/>
+        </w:rPr>
+        <w:t xml:space="preserve">. The training history's average remaining Day 14-to-35 gain is </w:t>
+      </w:r>
+      <w:r>
+        <w:rPr>
+          <w:rFonts w:ascii="Calibri" w:hAnsi="Calibri"/>
+          <w:b/>
+          <w:color w:val="2A3730"/>
+          <w:sz w:val="21"/>
+        </w:rPr>
+        <w:t>1,264.3 g</w:t>
+      </w:r>
+      <w:r>
+        <w:rPr>
+          <w:rFonts w:ascii="Calibri" w:hAnsi="Calibri"/>
+          <w:color w:val="2A3730"/>
+          <w:sz w:val="21"/>
+        </w:rPr>
+        <w:t xml:space="preserve">. The projection is therefore </w:t>
+      </w:r>
+      <w:r>
+        <w:rPr>
+          <w:rFonts w:ascii="Calibri" w:hAnsi="Calibri"/>
+          <w:b/>
+          <w:color w:val="2A3730"/>
+          <w:sz w:val="21"/>
+        </w:rPr>
+        <w:t>172.5 + 1,264.3 = 1,436.8 g</w:t>
+      </w:r>
+      <w:r>
+        <w:rPr>
+          <w:rFonts w:ascii="Calibri" w:hAnsi="Calibri"/>
+          <w:color w:val="2A3730"/>
+          <w:sz w:val="21"/>
+        </w:rPr>
+        <w:t xml:space="preserve">, or </w:t>
+      </w:r>
+      <w:r>
+        <w:rPr>
+          <w:rFonts w:ascii="Calibri" w:hAnsi="Calibri"/>
+          <w:b/>
+          <w:color w:val="2A3730"/>
+          <w:sz w:val="21"/>
+        </w:rPr>
+        <w:t>563.2 g below</w:t>
+      </w:r>
+      <w:r>
+        <w:rPr>
+          <w:rFonts w:ascii="Calibri" w:hAnsi="Calibri"/>
+          <w:color w:val="2A3730"/>
+          <w:sz w:val="21"/>
+        </w:rPr>
+        <w:t xml:space="preserve"> the 2,000 g goal. Its empirical range is approximately </w:t>
+      </w:r>
+      <w:r>
+        <w:rPr>
+          <w:rFonts w:ascii="Calibri" w:hAnsi="Calibri"/>
+          <w:b/>
+          <w:color w:val="2A3730"/>
+          <w:sz w:val="21"/>
+        </w:rPr>
+        <w:t>1,197.7–1,675.9 g</w:t>
+      </w:r>
+      <w:r>
+        <w:rPr>
+          <w:rFonts w:ascii="Calibri" w:hAnsi="Calibri"/>
+          <w:color w:val="2A3730"/>
+          <w:sz w:val="21"/>
+        </w:rPr>
+        <w:t>. This example demonstrates inference; 2026-2 cannot improve training until a reliable Day 35 outcome is supplied.</w:t>
+      </w:r>
+    </w:p>
+    <w:p>
+      <w:pPr>
+        <w:pStyle w:val="Heading3"/>
+      </w:pPr>
+      <w:r>
+        <w:t>D. Identified problem</w:t>
+      </w:r>
+    </w:p>
+    <w:p>
+      <w:pPr>
+        <w:pStyle w:val="ListBullet"/>
+      </w:pPr>
+      <w:r>
+        <w:rPr>
+          <w:rFonts w:ascii="Calibri" w:hAnsi="Calibri"/>
+          <w:color w:val="2A3730"/>
+          <w:sz w:val="21"/>
+        </w:rPr>
+        <w:t xml:space="preserve"> Formal risk pattern: </w:t>
+      </w:r>
+      <w:r>
+        <w:rPr>
+          <w:rFonts w:ascii="Calibri" w:hAnsi="Calibri"/>
+          <w:b/>
+          <w:color w:val="2A3730"/>
+          <w:sz w:val="21"/>
+        </w:rPr>
+        <w:t>Localized Building Drift</w:t>
+      </w:r>
+      <w:r>
+        <w:rPr>
+          <w:rFonts w:ascii="Calibri" w:hAnsi="Calibri"/>
+          <w:color w:val="2A3730"/>
+          <w:sz w:val="21"/>
+        </w:rPr>
+        <w:t>.</w:t>
+      </w:r>
+    </w:p>
+    <w:p>
+      <w:pPr>
+        <w:pStyle w:val="ListBullet"/>
+      </w:pPr>
+      <w:r>
+        <w:rPr>
+          <w:rFonts w:ascii="Calibri" w:hAnsi="Calibri"/>
+          <w:color w:val="2A3730"/>
+          <w:sz w:val="21"/>
+        </w:rPr>
+        <w:t xml:space="preserve"> Reason: the peer-comparison check is elevated, while the evidence does not meet the farm-wide-drift rule.</w:t>
+      </w:r>
+    </w:p>
+    <w:p>
+      <w:pPr>
+        <w:pStyle w:val="ListBullet"/>
+      </w:pPr>
+      <w:r>
+        <w:rPr>
+          <w:rFonts w:ascii="Calibri" w:hAnsi="Calibri"/>
+          <w:color w:val="2A3730"/>
+          <w:sz w:val="21"/>
+        </w:rPr>
+        <w:t xml:space="preserve"> More specific current operating alert: </w:t>
+      </w:r>
+      <w:r>
+        <w:rPr>
+          <w:rFonts w:ascii="Calibri" w:hAnsi="Calibri"/>
+          <w:b/>
+          <w:color w:val="2A3730"/>
+          <w:sz w:val="21"/>
+        </w:rPr>
+        <w:t>Feed intake is 43% below the provisional Day 22 target</w:t>
+      </w:r>
+      <w:r>
+        <w:rPr>
+          <w:rFonts w:ascii="Calibri" w:hAnsi="Calibri"/>
+          <w:color w:val="2A3730"/>
+          <w:sz w:val="21"/>
+        </w:rPr>
+        <w:t>—74 g/bird recorded versus 130 g/bird proposed.</w:t>
+      </w:r>
+    </w:p>
+    <w:p>
+      <w:pPr>
+        <w:pStyle w:val="ListBullet"/>
+      </w:pPr>
+      <w:r>
+        <w:rPr>
+          <w:rFonts w:ascii="Calibri" w:hAnsi="Calibri"/>
+          <w:color w:val="2A3730"/>
+          <w:sz w:val="21"/>
+        </w:rPr>
+        <w:t xml:space="preserve"> The operating alert is displayed as the practical main reason because it is more actionable, but it does </w:t>
+      </w:r>
+      <w:r>
+        <w:rPr>
+          <w:rFonts w:ascii="Calibri" w:hAnsi="Calibri"/>
+          <w:b/>
+          <w:color w:val="2A3730"/>
+          <w:sz w:val="21"/>
+        </w:rPr>
+        <w:t>not</w:t>
+      </w:r>
+      <w:r>
+        <w:rPr>
+          <w:rFonts w:ascii="Calibri" w:hAnsi="Calibri"/>
+          <w:color w:val="2A3730"/>
+          <w:sz w:val="21"/>
+        </w:rPr>
+        <w:t xml:space="preserve"> add points to or alter the 3/12 risk score.</w:t>
+      </w:r>
+    </w:p>
+    <w:p>
+      <w:pPr>
+        <w:pStyle w:val="Heading3"/>
+      </w:pPr>
+      <w:r>
+        <w:t>E. Proposed solution</w:t>
+      </w:r>
+    </w:p>
+    <w:p>
+      <w:pPr>
+        <w:pStyle w:val="ListBullet"/>
+      </w:pPr>
+      <w:r>
+        <w:rPr>
+          <w:rFonts w:ascii="Calibri" w:hAnsi="Calibri"/>
+          <w:color w:val="2A3730"/>
+          <w:sz w:val="21"/>
+        </w:rPr>
+        <w:t xml:space="preserve"> Medium risk sets the urgency to </w:t>
+      </w:r>
+      <w:r>
+        <w:rPr>
+          <w:rFonts w:ascii="Calibri" w:hAnsi="Calibri"/>
+          <w:b/>
+          <w:color w:val="2A3730"/>
+          <w:sz w:val="21"/>
+        </w:rPr>
+        <w:t>within 24 hours</w:t>
+      </w:r>
+      <w:r>
+        <w:rPr>
+          <w:rFonts w:ascii="Calibri" w:hAnsi="Calibri"/>
+          <w:color w:val="2A3730"/>
+          <w:sz w:val="21"/>
+        </w:rPr>
+        <w:t>.</w:t>
+      </w:r>
+    </w:p>
+    <w:p>
+      <w:pPr>
+        <w:pStyle w:val="ListBullet"/>
+      </w:pPr>
+      <w:r>
+        <w:rPr>
+          <w:rFonts w:ascii="Calibri" w:hAnsi="Calibri"/>
+          <w:color w:val="2A3730"/>
+          <w:sz w:val="21"/>
+        </w:rPr>
+        <w:t xml:space="preserve"> The current feed alert supplies the specific action: confirm the unit and reading; check feed availability and quality, feeder allocation and line operation, bird access, water access, house temperature, and flock condition.</w:t>
+      </w:r>
+    </w:p>
+    <w:p>
+      <w:pPr>
+        <w:pStyle w:val="ListBullet"/>
+      </w:pPr>
+      <w:r>
+        <w:rPr>
+          <w:rFonts w:ascii="Calibri" w:hAnsi="Calibri"/>
+          <w:color w:val="2A3730"/>
+          <w:sz w:val="21"/>
+        </w:rPr>
+        <w:t xml:space="preserve"> The fallback pattern rule is </w:t>
+      </w:r>
+      <w:r>
+        <w:rPr>
+          <w:rFonts w:ascii="Calibri" w:hAnsi="Calibri"/>
+          <w:b/>
+          <w:color w:val="2A3730"/>
+          <w:sz w:val="21"/>
+        </w:rPr>
+        <w:t>ACT-005</w:t>
+      </w:r>
+      <w:r>
+        <w:rPr>
+          <w:rFonts w:ascii="Calibri" w:hAnsi="Calibri"/>
+          <w:color w:val="2A3730"/>
+          <w:sz w:val="21"/>
+        </w:rPr>
+        <w:t>, which calls for comparison with better-performing peers and inspection for a building-specific problem.</w:t>
+      </w:r>
+    </w:p>
+    <w:p>
+      <w:pPr>
+        <w:pStyle w:val="ListBullet"/>
+      </w:pPr>
+      <w:r>
+        <w:rPr>
+          <w:rFonts w:ascii="Calibri" w:hAnsi="Calibri"/>
+          <w:color w:val="2A3730"/>
+          <w:sz w:val="21"/>
+        </w:rPr>
+        <w:t xml:space="preserve"> These rules remain preliminary until Doc Raymond approves them.</w:t>
+      </w:r>
+    </w:p>
+    <w:p>
+      <w:pPr>
+        <w:pStyle w:val="Heading3"/>
+      </w:pPr>
+      <w:r>
+        <w:t>F. Gross revenue at risk — approximately PHP 53,392</w:t>
+      </w:r>
+    </w:p>
+    <w:p>
+      <w:pPr>
+        <w:spacing w:before="0" w:after="120" w:line="288" w:lineRule="auto"/>
+      </w:pPr>
+      <w:r>
+        <w:rPr>
+          <w:rFonts w:ascii="Calibri" w:hAnsi="Calibri"/>
+          <w:color w:val="2A3730"/>
+          <w:sz w:val="21"/>
+        </w:rPr>
+        <w:t xml:space="preserve">Default planning assumptions are </w:t>
+      </w:r>
+      <w:r>
+        <w:rPr>
+          <w:rFonts w:ascii="Calibri" w:hAnsi="Calibri"/>
+          <w:b/>
+          <w:color w:val="2A3730"/>
+          <w:sz w:val="21"/>
+        </w:rPr>
+        <w:t>2.0 kg sale weight</w:t>
+      </w:r>
+      <w:r>
+        <w:rPr>
+          <w:rFonts w:ascii="Calibri" w:hAnsi="Calibri"/>
+          <w:color w:val="2A3730"/>
+          <w:sz w:val="21"/>
+        </w:rPr>
+        <w:t xml:space="preserve"> and </w:t>
+      </w:r>
+      <w:r>
+        <w:rPr>
+          <w:rFonts w:ascii="Calibri" w:hAnsi="Calibri"/>
+          <w:b/>
+          <w:color w:val="2A3730"/>
+          <w:sz w:val="21"/>
+        </w:rPr>
+        <w:t>PHP 120/kg</w:t>
+      </w:r>
+      <w:r>
+        <w:rPr>
+          <w:rFonts w:ascii="Calibri" w:hAnsi="Calibri"/>
+          <w:color w:val="2A3730"/>
+          <w:sz w:val="21"/>
+        </w:rPr>
+        <w:t xml:space="preserve">, so gross revenue per additional surviving bird is </w:t>
+      </w:r>
+      <w:r>
+        <w:rPr>
+          <w:rFonts w:ascii="Calibri" w:hAnsi="Calibri"/>
+          <w:b/>
+          <w:color w:val="286245"/>
+          <w:sz w:val="20"/>
+        </w:rPr>
+        <w:t>2.0 × 120 = PHP 240</w:t>
+      </w:r>
+      <w:r>
+        <w:rPr>
+          <w:rFonts w:ascii="Calibri" w:hAnsi="Calibri"/>
+          <w:color w:val="2A3730"/>
+          <w:sz w:val="21"/>
+        </w:rPr>
+        <w:t>.</w:t>
+      </w:r>
+    </w:p>
+    <w:p>
+      <w:pPr>
+        <w:numPr>
+          <w:ilvl w:val="0"/>
+          <w:numId w:val="12"/>
+        </w:numPr>
+        <w:spacing w:before="0" w:after="60" w:line="283" w:lineRule="auto"/>
+      </w:pPr>
+      <w:r>
+        <w:rPr>
+          <w:rFonts w:ascii="Calibri" w:hAnsi="Calibri"/>
+          <w:color w:val="2A3730"/>
+          <w:sz w:val="21"/>
+        </w:rPr>
+        <w:t xml:space="preserve">Recovery gap = </w:t>
+      </w:r>
+      <w:r>
+        <w:rPr>
+          <w:rFonts w:ascii="Calibri" w:hAnsi="Calibri"/>
+          <w:b/>
+          <w:color w:val="286245"/>
+          <w:sz w:val="20"/>
+        </w:rPr>
+        <w:t>95.0% − 91.8728% = 3.1272 percentage points</w:t>
+      </w:r>
+      <w:r>
+        <w:rPr>
+          <w:rFonts w:ascii="Calibri" w:hAnsi="Calibri"/>
+          <w:color w:val="2A3730"/>
+          <w:sz w:val="21"/>
+        </w:rPr>
+        <w:t>.</w:t>
+      </w:r>
+    </w:p>
+    <w:p>
+      <w:pPr>
+        <w:numPr>
+          <w:ilvl w:val="0"/>
+          <w:numId w:val="12"/>
+        </w:numPr>
+        <w:spacing w:before="0" w:after="60" w:line="283" w:lineRule="auto"/>
+      </w:pPr>
+      <w:r>
+        <w:rPr>
+          <w:rFonts w:ascii="Calibri" w:hAnsi="Calibri"/>
+          <w:color w:val="2A3730"/>
+          <w:sz w:val="21"/>
+        </w:rPr>
+        <w:t xml:space="preserve">Birds associated with the gap = </w:t>
+      </w:r>
+      <w:r>
+        <w:rPr>
+          <w:rFonts w:ascii="Calibri" w:hAnsi="Calibri"/>
+          <w:b/>
+          <w:color w:val="286245"/>
+          <w:sz w:val="20"/>
+        </w:rPr>
+        <w:t>7,114 × 3.1272% = 222.47 birds</w:t>
+      </w:r>
+      <w:r>
+        <w:rPr>
+          <w:rFonts w:ascii="Calibri" w:hAnsi="Calibri"/>
+          <w:color w:val="2A3730"/>
+          <w:sz w:val="21"/>
+        </w:rPr>
+        <w:t>.</w:t>
+      </w:r>
+    </w:p>
+    <w:p>
+      <w:pPr>
+        <w:numPr>
+          <w:ilvl w:val="0"/>
+          <w:numId w:val="12"/>
+        </w:numPr>
+        <w:spacing w:before="0" w:after="60" w:line="283" w:lineRule="auto"/>
+      </w:pPr>
+      <w:r>
+        <w:rPr>
+          <w:rFonts w:ascii="Calibri" w:hAnsi="Calibri"/>
+          <w:color w:val="2A3730"/>
+          <w:sz w:val="21"/>
+        </w:rPr>
+        <w:t xml:space="preserve">Gross revenue at risk = </w:t>
+      </w:r>
+      <w:r>
+        <w:rPr>
+          <w:rFonts w:ascii="Calibri" w:hAnsi="Calibri"/>
+          <w:b/>
+          <w:color w:val="286245"/>
+          <w:sz w:val="20"/>
+        </w:rPr>
+        <w:t>222.47 × PHP 240 = PHP 53,392.15</w:t>
+      </w:r>
+      <w:r>
+        <w:rPr>
+          <w:rFonts w:ascii="Calibri" w:hAnsi="Calibri"/>
+          <w:color w:val="2A3730"/>
+          <w:sz w:val="21"/>
+        </w:rPr>
+        <w:t>.</w:t>
+      </w:r>
+    </w:p>
+    <w:p>
+      <w:pPr>
+        <w:numPr>
+          <w:ilvl w:val="0"/>
+          <w:numId w:val="12"/>
+        </w:numPr>
+        <w:spacing w:before="0" w:after="60" w:line="283" w:lineRule="auto"/>
+      </w:pPr>
+      <w:r>
+        <w:rPr>
+          <w:rFonts w:ascii="Calibri" w:hAnsi="Calibri"/>
+          <w:color w:val="2A3730"/>
+          <w:sz w:val="21"/>
+        </w:rPr>
+        <w:t xml:space="preserve">Displayed rounded value = </w:t>
+      </w:r>
+      <w:r>
+        <w:rPr>
+          <w:rFonts w:ascii="Calibri" w:hAnsi="Calibri"/>
+          <w:b/>
+          <w:color w:val="2A3730"/>
+          <w:sz w:val="21"/>
+        </w:rPr>
+        <w:t>PHP 53,392</w:t>
+      </w:r>
+      <w:r>
+        <w:rPr>
+          <w:rFonts w:ascii="Calibri" w:hAnsi="Calibri"/>
+          <w:color w:val="2A3730"/>
+          <w:sz w:val="21"/>
+        </w:rPr>
+        <w:t>.</w:t>
+      </w:r>
+    </w:p>
+    <w:p>
+      <w:pPr>
+        <w:spacing w:before="0" w:after="120" w:line="288" w:lineRule="auto"/>
+      </w:pPr>
+      <w:r>
+        <w:rPr>
+          <w:rFonts w:ascii="Calibri" w:hAnsi="Calibri"/>
+          <w:color w:val="2A3730"/>
+          <w:sz w:val="21"/>
+        </w:rPr>
+        <w:t xml:space="preserve">This is gross revenue associated with closing the modeled recovery gap—not profit, guaranteed savings, or proof that Canary caused an improvement. Price and sale-weight assumptions are editable in </w:t>
+      </w:r>
+      <w:r>
+        <w:rPr>
+          <w:rFonts w:ascii="Calibri" w:hAnsi="Calibri"/>
+          <w:b/>
+          <w:color w:val="2A3730"/>
+          <w:sz w:val="21"/>
+        </w:rPr>
+        <w:t>Business Value</w:t>
+      </w:r>
+      <w:r>
+        <w:rPr>
+          <w:rFonts w:ascii="Calibri" w:hAnsi="Calibri"/>
+          <w:color w:val="2A3730"/>
+          <w:sz w:val="21"/>
+        </w:rPr>
+        <w:t>.</w:t>
+      </w:r>
+    </w:p>
+    <w:p>
+      <w:pPr>
+        <w:pStyle w:val="Heading3"/>
+      </w:pPr>
+      <w:r>
+        <w:t>Other card details to defend</w:t>
+      </w:r>
+    </w:p>
+    <w:p>
+      <w:pPr>
+        <w:pStyle w:val="ListBullet"/>
+      </w:pPr>
+      <w:r>
+        <w:rPr>
+          <w:rFonts w:ascii="Calibri" w:hAnsi="Calibri"/>
+          <w:color w:val="2A3730"/>
+          <w:sz w:val="21"/>
+        </w:rPr>
+        <w:t xml:space="preserve"> </w:t>
+      </w:r>
+      <w:r>
+        <w:rPr>
+          <w:rFonts w:ascii="Calibri" w:hAnsi="Calibri"/>
+          <w:b/>
+          <w:color w:val="2A3730"/>
+          <w:sz w:val="21"/>
+        </w:rPr>
+        <w:t>Current versus projected:</w:t>
+      </w:r>
+      <w:r>
+        <w:rPr>
+          <w:rFonts w:ascii="Calibri" w:hAnsi="Calibri"/>
+          <w:color w:val="2A3730"/>
+          <w:sz w:val="21"/>
+        </w:rPr>
+        <w:t xml:space="preserve"> current recovery is observed so far; projected recovery estimates the later outcome.</w:t>
+      </w:r>
+    </w:p>
+    <w:p>
+      <w:pPr>
+        <w:pStyle w:val="ListBullet"/>
+      </w:pPr>
+      <w:r>
+        <w:rPr>
+          <w:rFonts w:ascii="Calibri" w:hAnsi="Calibri"/>
+          <w:color w:val="2A3730"/>
+          <w:sz w:val="21"/>
+        </w:rPr>
+        <w:t xml:space="preserve"> </w:t>
+      </w:r>
+      <w:r>
+        <w:rPr>
+          <w:rFonts w:ascii="Calibri" w:hAnsi="Calibri"/>
+          <w:b/>
+          <w:color w:val="2A3730"/>
+          <w:sz w:val="21"/>
+        </w:rPr>
+        <w:t>Likely range:</w:t>
+      </w:r>
+      <w:r>
+        <w:rPr>
+          <w:rFonts w:ascii="Calibri" w:hAnsi="Calibri"/>
+          <w:color w:val="2A3730"/>
+          <w:sz w:val="21"/>
+        </w:rPr>
+        <w:t xml:space="preserve"> derived from held-out historical errors, not a guarantee.</w:t>
+      </w:r>
+    </w:p>
+    <w:p>
+      <w:pPr>
+        <w:pStyle w:val="ListBullet"/>
+      </w:pPr>
+      <w:r>
+        <w:rPr>
+          <w:rFonts w:ascii="Calibri" w:hAnsi="Calibri"/>
+          <w:color w:val="2A3730"/>
+          <w:sz w:val="21"/>
+        </w:rPr>
+        <w:t xml:space="preserve"> </w:t>
+      </w:r>
+      <w:r>
+        <w:rPr>
+          <w:rFonts w:ascii="Calibri" w:hAnsi="Calibri"/>
+          <w:b/>
+          <w:color w:val="2A3730"/>
+          <w:sz w:val="21"/>
+        </w:rPr>
+        <w:t>Data coverage:</w:t>
+      </w:r>
+      <w:r>
+        <w:rPr>
+          <w:rFonts w:ascii="Calibri" w:hAnsi="Calibri"/>
+          <w:color w:val="2A3730"/>
+          <w:sz w:val="21"/>
+        </w:rPr>
+        <w:t xml:space="preserve"> “3/4 risk checks” warns that weight evidence is missing.</w:t>
+      </w:r>
+    </w:p>
+    <w:p>
+      <w:pPr>
+        <w:pStyle w:val="ListBullet"/>
+      </w:pPr>
+      <w:r>
+        <w:rPr>
+          <w:rFonts w:ascii="Calibri" w:hAnsi="Calibri"/>
+          <w:color w:val="2A3730"/>
+          <w:sz w:val="21"/>
+        </w:rPr>
+        <w:t xml:space="preserve"> </w:t>
+      </w:r>
+      <w:r>
+        <w:rPr>
+          <w:rFonts w:ascii="Calibri" w:hAnsi="Calibri"/>
+          <w:b/>
+          <w:color w:val="2A3730"/>
+          <w:sz w:val="21"/>
+        </w:rPr>
+        <w:t>Model/rule versions:</w:t>
+      </w:r>
+      <w:r>
+        <w:rPr>
+          <w:rFonts w:ascii="Calibri" w:hAnsi="Calibri"/>
+          <w:color w:val="2A3730"/>
+          <w:sz w:val="21"/>
+        </w:rPr>
+        <w:t xml:space="preserve"> retained in Building View and Canary Methodology for reproducibility.</w:t>
+      </w:r>
+    </w:p>
+    <w:p>
+      <w:pPr>
+        <w:pStyle w:val="ListBullet"/>
+      </w:pPr>
+      <w:r>
+        <w:rPr>
+          <w:rFonts w:ascii="Calibri" w:hAnsi="Calibri"/>
+          <w:color w:val="2A3730"/>
+          <w:sz w:val="21"/>
+        </w:rPr>
+        <w:t xml:space="preserve"> </w:t>
+      </w:r>
+      <w:r>
+        <w:rPr>
+          <w:rFonts w:ascii="Calibri" w:hAnsi="Calibri"/>
+          <w:b/>
+          <w:color w:val="2A3730"/>
+          <w:sz w:val="21"/>
+        </w:rPr>
+        <w:t>Review date:</w:t>
+      </w:r>
+      <w:r>
+        <w:rPr>
+          <w:rFonts w:ascii="Calibri" w:hAnsi="Calibri"/>
+          <w:color w:val="2A3730"/>
+          <w:sz w:val="21"/>
+        </w:rPr>
+        <w:t xml:space="preserve"> freezes all calculations to information recorded on or before that date.</w:t>
+      </w:r>
+    </w:p>
+    <w:p>
+      <w:pPr>
+        <w:pStyle w:val="ListBullet"/>
+      </w:pPr>
+      <w:r>
+        <w:rPr>
+          <w:rFonts w:ascii="Calibri" w:hAnsi="Calibri"/>
+          <w:color w:val="2A3730"/>
+          <w:sz w:val="21"/>
+        </w:rPr>
+        <w:t xml:space="preserve"> </w:t>
+      </w:r>
+      <w:r>
+        <w:rPr>
+          <w:rFonts w:ascii="Calibri" w:hAnsi="Calibri"/>
+          <w:b/>
+          <w:color w:val="2A3730"/>
+          <w:sz w:val="21"/>
+        </w:rPr>
+        <w:t>Separation of layers:</w:t>
+      </w:r>
+      <w:r>
+        <w:rPr>
+          <w:rFonts w:ascii="Calibri" w:hAnsi="Calibri"/>
+          <w:color w:val="2A3730"/>
+          <w:sz w:val="21"/>
+        </w:rPr>
+        <w:t xml:space="preserve"> the risk score, forecasts, operational alerts, recommendation rules, and business-value assumptions are intentionally calculated independently and then combined only for presentation.</w:t>
+      </w:r>
+    </w:p>
+    <w:p>
+      <w:pPr>
+        <w:pStyle w:val="Heading1"/>
+      </w:pPr>
+      <w:r>
+        <w:t>3. Data foundation</w:t>
+      </w:r>
+    </w:p>
+    <w:p>
+      <w:pPr>
+        <w:pStyle w:val="ListBullet"/>
+      </w:pPr>
+      <w:r>
+        <w:rPr>
+          <w:rFonts w:ascii="Calibri" w:hAnsi="Calibri"/>
+          <w:color w:val="2A3730"/>
+          <w:sz w:val="21"/>
+        </w:rPr>
+        <w:t xml:space="preserve"> Primary daily source: </w:t>
+      </w:r>
+      <w:r>
+        <w:rPr>
+          <w:rFonts w:ascii="Calibri" w:hAnsi="Calibri"/>
+          <w:b/>
+          <w:color w:val="2A3730"/>
+          <w:sz w:val="21"/>
+        </w:rPr>
+        <w:t>FARM HARVEST DATA.xlsx</w:t>
+      </w:r>
+      <w:r>
+        <w:rPr>
+          <w:rFonts w:ascii="Calibri" w:hAnsi="Calibri"/>
+          <w:color w:val="2A3730"/>
+          <w:sz w:val="21"/>
+        </w:rPr>
+        <w:t>.</w:t>
+      </w:r>
+    </w:p>
+    <w:p>
+      <w:pPr>
+        <w:pStyle w:val="ListBullet"/>
+      </w:pPr>
+      <w:r>
+        <w:rPr>
+          <w:rFonts w:ascii="Calibri" w:hAnsi="Calibri"/>
+          <w:color w:val="2A3730"/>
+          <w:sz w:val="21"/>
+        </w:rPr>
+        <w:t xml:space="preserve"> Final average weight for completed-cycle display: </w:t>
+      </w:r>
+      <w:r>
+        <w:rPr>
+          <w:rFonts w:ascii="Calibri" w:hAnsi="Calibri"/>
+          <w:b/>
+          <w:color w:val="2A3730"/>
+          <w:sz w:val="21"/>
+        </w:rPr>
+        <w:t>Farm Performance Summary.xlsx</w:t>
+      </w:r>
+      <w:r>
+        <w:rPr>
+          <w:rFonts w:ascii="Calibri" w:hAnsi="Calibri"/>
+          <w:color w:val="2A3730"/>
+          <w:sz w:val="21"/>
+        </w:rPr>
+        <w:t>.</w:t>
+      </w:r>
+    </w:p>
+    <w:p>
+      <w:pPr>
+        <w:pStyle w:val="ListBullet"/>
+      </w:pPr>
+      <w:r>
+        <w:rPr>
+          <w:rFonts w:ascii="Calibri" w:hAnsi="Calibri"/>
+          <w:color w:val="2A3730"/>
+          <w:sz w:val="21"/>
+        </w:rPr>
+        <w:t xml:space="preserve"> Age-specific weight targets: farm </w:t>
+      </w:r>
+      <w:r>
+        <w:rPr>
+          <w:rFonts w:ascii="Calibri" w:hAnsi="Calibri"/>
+          <w:b/>
+          <w:color w:val="2A3730"/>
+          <w:sz w:val="21"/>
+        </w:rPr>
+        <w:t>Target Weights</w:t>
+      </w:r>
+      <w:r>
+        <w:rPr>
+          <w:rFonts w:ascii="Calibri" w:hAnsi="Calibri"/>
+          <w:color w:val="2A3730"/>
+          <w:sz w:val="21"/>
+        </w:rPr>
+        <w:t xml:space="preserve"> sheet.</w:t>
+      </w:r>
+    </w:p>
+    <w:p>
+      <w:pPr>
+        <w:pStyle w:val="ListBullet"/>
+      </w:pPr>
+      <w:r>
+        <w:rPr>
+          <w:rFonts w:ascii="Calibri" w:hAnsi="Calibri"/>
+          <w:color w:val="2A3730"/>
+          <w:sz w:val="21"/>
+        </w:rPr>
+        <w:t xml:space="preserve"> Early detailed weights: </w:t>
+      </w:r>
+      <w:r>
+        <w:rPr>
+          <w:rFonts w:ascii="Calibri" w:hAnsi="Calibri"/>
+          <w:b/>
+          <w:color w:val="2A3730"/>
+          <w:sz w:val="21"/>
+        </w:rPr>
+        <w:t>Weights Cleaned.xlsx</w:t>
+      </w:r>
+      <w:r>
+        <w:rPr>
+          <w:rFonts w:ascii="Calibri" w:hAnsi="Calibri"/>
+          <w:color w:val="2A3730"/>
+          <w:sz w:val="21"/>
+        </w:rPr>
+        <w:t>, available only for limited buildings/cycles.</w:t>
+      </w:r>
+    </w:p>
+    <w:p>
+      <w:pPr>
+        <w:pStyle w:val="ListBullet"/>
+      </w:pPr>
+      <w:r>
+        <w:rPr>
+          <w:rFonts w:ascii="Calibri" w:hAnsi="Calibri"/>
+          <w:color w:val="2A3730"/>
+          <w:sz w:val="21"/>
+        </w:rPr>
+        <w:t xml:space="preserve"> Farm thresholds and interventions: </w:t>
+      </w:r>
+      <w:r>
+        <w:rPr>
+          <w:rFonts w:ascii="Calibri" w:hAnsi="Calibri"/>
+          <w:b/>
+          <w:color w:val="2A3730"/>
+          <w:sz w:val="21"/>
+        </w:rPr>
+        <w:t>Farmer Validation Workbook.xlsx</w:t>
+      </w:r>
+      <w:r>
+        <w:rPr>
+          <w:rFonts w:ascii="Calibri" w:hAnsi="Calibri"/>
+          <w:color w:val="2A3730"/>
+          <w:sz w:val="21"/>
+        </w:rPr>
+        <w:t>, excluding its Risk Scoring Matrix as instructed.</w:t>
+      </w:r>
+    </w:p>
+    <w:p>
+      <w:pPr>
+        <w:spacing w:before="0" w:after="120" w:line="288" w:lineRule="auto"/>
+      </w:pPr>
+      <w:r>
+        <w:rPr>
+          <w:rFonts w:ascii="Calibri" w:hAnsi="Calibri"/>
+          <w:b/>
+          <w:color w:val="2A3730"/>
+          <w:sz w:val="21"/>
+        </w:rPr>
+        <w:t>Cleaning performed</w:t>
+      </w:r>
+    </w:p>
+    <w:p>
+      <w:pPr>
+        <w:pStyle w:val="ListBullet"/>
+      </w:pPr>
+      <w:r>
+        <w:rPr>
+          <w:rFonts w:ascii="Calibri" w:hAnsi="Calibri"/>
+          <w:color w:val="2A3730"/>
+          <w:sz w:val="21"/>
+        </w:rPr>
+        <w:t xml:space="preserve"> Started with </w:t>
+      </w:r>
+      <w:r>
+        <w:rPr>
+          <w:rFonts w:ascii="Calibri" w:hAnsi="Calibri"/>
+          <w:b/>
+          <w:color w:val="2A3730"/>
+          <w:sz w:val="21"/>
+        </w:rPr>
+        <w:t>1,785 source rows</w:t>
+      </w:r>
+      <w:r>
+        <w:rPr>
+          <w:rFonts w:ascii="Calibri" w:hAnsi="Calibri"/>
+          <w:color w:val="2A3730"/>
+          <w:sz w:val="21"/>
+        </w:rPr>
+        <w:t>.</w:t>
+      </w:r>
+    </w:p>
+    <w:p>
+      <w:pPr>
+        <w:pStyle w:val="ListBullet"/>
+      </w:pPr>
+      <w:r>
+        <w:rPr>
+          <w:rFonts w:ascii="Calibri" w:hAnsi="Calibri"/>
+          <w:color w:val="2A3730"/>
+          <w:sz w:val="21"/>
+        </w:rPr>
+        <w:t xml:space="preserve"> Consolidated </w:t>
+      </w:r>
+      <w:r>
+        <w:rPr>
+          <w:rFonts w:ascii="Calibri" w:hAnsi="Calibri"/>
+          <w:b/>
+          <w:color w:val="2A3730"/>
+          <w:sz w:val="21"/>
+        </w:rPr>
+        <w:t>119 repeated rows</w:t>
+      </w:r>
+      <w:r>
+        <w:rPr>
+          <w:rFonts w:ascii="Calibri" w:hAnsi="Calibri"/>
+          <w:color w:val="2A3730"/>
+          <w:sz w:val="21"/>
+        </w:rPr>
+        <w:t>.</w:t>
+      </w:r>
+    </w:p>
+    <w:p>
+      <w:pPr>
+        <w:pStyle w:val="ListBullet"/>
+      </w:pPr>
+      <w:r>
+        <w:rPr>
+          <w:rFonts w:ascii="Calibri" w:hAnsi="Calibri"/>
+          <w:color w:val="2A3730"/>
+          <w:sz w:val="21"/>
+        </w:rPr>
+        <w:t xml:space="preserve"> Produced </w:t>
+      </w:r>
+      <w:r>
+        <w:rPr>
+          <w:rFonts w:ascii="Calibri" w:hAnsi="Calibri"/>
+          <w:b/>
+          <w:color w:val="2A3730"/>
+          <w:sz w:val="21"/>
+        </w:rPr>
+        <w:t>1,666 unique building-day records</w:t>
+      </w:r>
+      <w:r>
+        <w:rPr>
+          <w:rFonts w:ascii="Calibri" w:hAnsi="Calibri"/>
+          <w:color w:val="2A3730"/>
+          <w:sz w:val="21"/>
+        </w:rPr>
+        <w:t>.</w:t>
+      </w:r>
+    </w:p>
+    <w:p>
+      <w:pPr>
+        <w:pStyle w:val="ListBullet"/>
+      </w:pPr>
+      <w:r>
+        <w:rPr>
+          <w:rFonts w:ascii="Calibri" w:hAnsi="Calibri"/>
+          <w:color w:val="2A3730"/>
+          <w:sz w:val="21"/>
+        </w:rPr>
+        <w:t xml:space="preserve"> Found </w:t>
+      </w:r>
+      <w:r>
+        <w:rPr>
+          <w:rFonts w:ascii="Calibri" w:hAnsi="Calibri"/>
+          <w:b/>
+          <w:color w:val="2A3730"/>
+          <w:sz w:val="21"/>
+        </w:rPr>
+        <w:t>0 blocking duplicate conflicts</w:t>
+      </w:r>
+      <w:r>
+        <w:rPr>
+          <w:rFonts w:ascii="Calibri" w:hAnsi="Calibri"/>
+          <w:color w:val="2A3730"/>
+          <w:sz w:val="21"/>
+        </w:rPr>
+        <w:t>.</w:t>
+      </w:r>
+    </w:p>
+    <w:p>
+      <w:pPr>
+        <w:pStyle w:val="ListBullet"/>
+      </w:pPr>
+      <w:r>
+        <w:rPr>
+          <w:rFonts w:ascii="Calibri" w:hAnsi="Calibri"/>
+          <w:color w:val="2A3730"/>
+          <w:sz w:val="21"/>
+        </w:rPr>
+        <w:t xml:space="preserve"> Normalized dates, building names, age, population, mortality, feed, weight, temperature, and humidity.</w:t>
+      </w:r>
+    </w:p>
+    <w:p>
+      <w:pPr>
+        <w:pStyle w:val="ListBullet"/>
+      </w:pPr>
+      <w:r>
+        <w:rPr>
+          <w:rFonts w:ascii="Calibri" w:hAnsi="Calibri"/>
+          <w:color w:val="2A3730"/>
+          <w:sz w:val="21"/>
+        </w:rPr>
+        <w:t xml:space="preserve"> Kept missing values as missing; blanks were not silently changed to zero.</w:t>
+      </w:r>
+    </w:p>
+    <w:p>
+      <w:pPr>
+        <w:pStyle w:val="ListBullet"/>
+      </w:pPr>
+      <w:r>
+        <w:rPr>
+          <w:rFonts w:ascii="Calibri" w:hAnsi="Calibri"/>
+          <w:color w:val="2A3730"/>
+          <w:sz w:val="21"/>
+        </w:rPr>
+        <w:t xml:space="preserve"> Auditable output: </w:t>
+      </w:r>
+      <w:r>
+        <w:rPr>
+          <w:rFonts w:ascii="Calibri" w:hAnsi="Calibri"/>
+          <w:b/>
+          <w:color w:val="2A3730"/>
+          <w:sz w:val="21"/>
+        </w:rPr>
+        <w:t>data/Project_Canary_Canonical_Building_Day_1666.xlsx</w:t>
+      </w:r>
+      <w:r>
+        <w:rPr>
+          <w:rFonts w:ascii="Calibri" w:hAnsi="Calibri"/>
+          <w:color w:val="2A3730"/>
+          <w:sz w:val="21"/>
+        </w:rPr>
+        <w:t>.</w:t>
+      </w:r>
+    </w:p>
+    <w:p>
+      <w:pPr>
+        <w:spacing w:before="0" w:after="120" w:line="288" w:lineRule="auto"/>
+      </w:pPr>
+      <w:r>
+        <w:rPr>
+          <w:rFonts w:ascii="Calibri" w:hAnsi="Calibri"/>
+          <w:b/>
+          <w:color w:val="2A3730"/>
+          <w:sz w:val="21"/>
+        </w:rPr>
+        <w:t>What the 119 repeated rows were</w:t>
+      </w:r>
+    </w:p>
+    <w:p>
+      <w:pPr>
+        <w:pStyle w:val="ListBullet"/>
+      </w:pPr>
+      <w:r>
+        <w:rPr>
+          <w:rFonts w:ascii="Calibri" w:hAnsi="Calibri"/>
+          <w:color w:val="2A3730"/>
+          <w:sz w:val="21"/>
+        </w:rPr>
+        <w:t xml:space="preserve"> They are 119 cycle-building-age keys that each occurred twice, or </w:t>
+      </w:r>
+      <w:r>
+        <w:rPr>
+          <w:rFonts w:ascii="Calibri" w:hAnsi="Calibri"/>
+          <w:b/>
+          <w:color w:val="2A3730"/>
+          <w:sz w:val="21"/>
+        </w:rPr>
+        <w:t>238 source rows in total</w:t>
+      </w:r>
+      <w:r>
+        <w:rPr>
+          <w:rFonts w:ascii="Calibri" w:hAnsi="Calibri"/>
+          <w:color w:val="2A3730"/>
+          <w:sz w:val="21"/>
+        </w:rPr>
+        <w:t>.</w:t>
+      </w:r>
+    </w:p>
+    <w:p>
+      <w:pPr>
+        <w:pStyle w:val="ListBullet"/>
+      </w:pPr>
+      <w:r>
+        <w:rPr>
+          <w:rFonts w:ascii="Calibri" w:hAnsi="Calibri"/>
+          <w:color w:val="2A3730"/>
+          <w:sz w:val="21"/>
+        </w:rPr>
+        <w:t xml:space="preserve"> The repeated days are 2026-2 Lags 1 Days 1–30, Lags 2 Days 1–22, Lags 3 Days 1–16, and 2026-3 Tags 1–3 Days 1–17.</w:t>
+      </w:r>
+    </w:p>
+    <w:p>
+      <w:pPr>
+        <w:pStyle w:val="ListBullet"/>
+      </w:pPr>
+      <w:r>
+        <w:rPr>
+          <w:rFonts w:ascii="Calibri" w:hAnsi="Calibri"/>
+          <w:color w:val="2A3730"/>
+          <w:sz w:val="21"/>
+        </w:rPr>
+        <w:t xml:space="preserve"> Production values matched within every repeated key; the rows contained different environmental readings, consistent with multiple environmental sections or zones.</w:t>
+      </w:r>
+    </w:p>
+    <w:p>
+      <w:pPr>
+        <w:pStyle w:val="ListBullet"/>
+      </w:pPr>
+      <w:r>
+        <w:rPr>
+          <w:rFonts w:ascii="Calibri" w:hAnsi="Calibri"/>
+          <w:color w:val="2A3730"/>
+          <w:sz w:val="21"/>
+        </w:rPr>
+        <w:t xml:space="preserve"> Example: 2026-2 Lags 1 Day 1 has identical beginning population, ending population, mortality, feed, and weight values in both source rows. The average-temperature readings are 31.85°C and 33.12°C, so the canonical average is their mean; minimum and maximum readings retain the overall minimum and maximum.</w:t>
+      </w:r>
+    </w:p>
+    <w:p>
+      <w:pPr>
+        <w:spacing w:before="0" w:after="120" w:line="288" w:lineRule="auto"/>
+      </w:pPr>
+      <w:r>
+        <w:rPr>
+          <w:rFonts w:ascii="Calibri" w:hAnsi="Calibri"/>
+          <w:b/>
+          <w:color w:val="2A3730"/>
+          <w:sz w:val="21"/>
+        </w:rPr>
+        <w:t>Leakage protection</w:t>
+      </w:r>
+    </w:p>
+    <w:p>
+      <w:pPr>
+        <w:pStyle w:val="ListBullet"/>
+      </w:pPr>
+      <w:r>
+        <w:rPr>
+          <w:rFonts w:ascii="Calibri" w:hAnsi="Calibri"/>
+          <w:color w:val="2A3730"/>
+          <w:sz w:val="21"/>
+        </w:rPr>
+        <w:t xml:space="preserve"> Every prediction uses only information available by the review date.</w:t>
+      </w:r>
+    </w:p>
+    <w:p>
+      <w:pPr>
+        <w:pStyle w:val="ListBullet"/>
+      </w:pPr>
+      <w:r>
+        <w:rPr>
+          <w:rFonts w:ascii="Calibri" w:hAnsi="Calibri"/>
+          <w:color w:val="2A3730"/>
+          <w:sz w:val="21"/>
+        </w:rPr>
+        <w:t xml:space="preserve"> Model validation holds out entire harvest cycles.</w:t>
+      </w:r>
+    </w:p>
+    <w:p>
+      <w:pPr>
+        <w:pStyle w:val="ListBullet"/>
+      </w:pPr>
+      <w:r>
+        <w:rPr>
+          <w:rFonts w:ascii="Calibri" w:hAnsi="Calibri"/>
+          <w:color w:val="2A3730"/>
+          <w:sz w:val="21"/>
+        </w:rPr>
+        <w:t xml:space="preserve"> Daily rows from the same cycle never appear in both training and validation.</w:t>
+      </w:r>
+    </w:p>
+    <w:p>
+      <w:pPr>
+        <w:pStyle w:val="Heading1"/>
+      </w:pPr>
+      <w:r>
+        <w:t>4. Component 1 — Rules-based risk score</w:t>
+      </w:r>
+    </w:p>
+    <w:p>
+      <w:pPr>
+        <w:pStyle w:val="Heading3"/>
+      </w:pPr>
+      <w:r>
+        <w:t>What it answers</w:t>
+      </w:r>
+    </w:p>
+    <w:p>
+      <w:pPr>
+        <w:pStyle w:val="ListBullet"/>
+      </w:pPr>
+      <w:r>
+        <w:rPr>
+          <w:rFonts w:ascii="Calibri" w:hAnsi="Calibri"/>
+          <w:color w:val="2A3730"/>
+          <w:sz w:val="21"/>
+        </w:rPr>
+        <w:t xml:space="preserve"> Which building should management inspect first?</w:t>
+      </w:r>
+    </w:p>
+    <w:p>
+      <w:pPr>
+        <w:pStyle w:val="ListBullet"/>
+      </w:pPr>
+      <w:r>
+        <w:rPr>
+          <w:rFonts w:ascii="Calibri" w:hAnsi="Calibri"/>
+          <w:color w:val="2A3730"/>
+          <w:sz w:val="21"/>
+        </w:rPr>
+        <w:t xml:space="preserve"> Which recorded warning signs explain the concern?</w:t>
+      </w:r>
+    </w:p>
+    <w:p>
+      <w:pPr>
+        <w:pStyle w:val="Heading3"/>
+      </w:pPr>
+      <w:r>
+        <w:t>Four dimensions</w:t>
+      </w:r>
+    </w:p>
+    <w:p>
+      <w:pPr>
+        <w:numPr>
+          <w:ilvl w:val="0"/>
+          <w:numId w:val="13"/>
+        </w:numPr>
+        <w:spacing w:before="0" w:after="60" w:line="283" w:lineRule="auto"/>
+      </w:pPr>
+      <w:r>
+        <w:rPr>
+          <w:rFonts w:ascii="Calibri" w:hAnsi="Calibri"/>
+          <w:b/>
+          <w:color w:val="2A3730"/>
+          <w:sz w:val="21"/>
+        </w:rPr>
+        <w:t>Weight gap:</w:t>
+      </w:r>
+      <w:r>
+        <w:rPr>
+          <w:rFonts w:ascii="Calibri" w:hAnsi="Calibri"/>
+          <w:color w:val="2A3730"/>
+          <w:sz w:val="21"/>
+        </w:rPr>
+        <w:t xml:space="preserve"> latest measured weight versus the target for the actual weighing day.</w:t>
+      </w:r>
+    </w:p>
+    <w:p>
+      <w:pPr>
+        <w:numPr>
+          <w:ilvl w:val="0"/>
+          <w:numId w:val="13"/>
+        </w:numPr>
+        <w:spacing w:before="0" w:after="60" w:line="283" w:lineRule="auto"/>
+      </w:pPr>
+      <w:r>
+        <w:rPr>
+          <w:rFonts w:ascii="Calibri" w:hAnsi="Calibri"/>
+          <w:b/>
+          <w:color w:val="2A3730"/>
+          <w:sz w:val="21"/>
+        </w:rPr>
+        <w:t>Survival reference gap:</w:t>
+      </w:r>
+      <w:r>
+        <w:rPr>
+          <w:rFonts w:ascii="Calibri" w:hAnsi="Calibri"/>
+          <w:color w:val="2A3730"/>
+          <w:sz w:val="21"/>
+        </w:rPr>
+        <w:t xml:space="preserve"> current percentage alive versus a provisional straight-line path to 95% on Day 35.</w:t>
+      </w:r>
+    </w:p>
+    <w:p>
+      <w:pPr>
+        <w:numPr>
+          <w:ilvl w:val="0"/>
+          <w:numId w:val="13"/>
+        </w:numPr>
+        <w:spacing w:before="0" w:after="60" w:line="283" w:lineRule="auto"/>
+      </w:pPr>
+      <w:r>
+        <w:rPr>
+          <w:rFonts w:ascii="Calibri" w:hAnsi="Calibri"/>
+          <w:b/>
+          <w:color w:val="2A3730"/>
+          <w:sz w:val="21"/>
+        </w:rPr>
+        <w:t>Mortality momentum:</w:t>
+      </w:r>
+      <w:r>
+        <w:rPr>
+          <w:rFonts w:ascii="Calibri" w:hAnsi="Calibri"/>
+          <w:color w:val="2A3730"/>
+          <w:sz w:val="21"/>
+        </w:rPr>
+        <w:t xml:space="preserve"> recent three-day mortality versus the preceding baseline.</w:t>
+      </w:r>
+    </w:p>
+    <w:p>
+      <w:pPr>
+        <w:numPr>
+          <w:ilvl w:val="0"/>
+          <w:numId w:val="13"/>
         </w:numPr>
         <w:spacing w:before="0" w:after="60" w:line="283" w:lineRule="auto"/>
       </w:pPr>
@@ -1773,10 +4297,16 @@
     </w:p>
     <w:p>
       <w:pPr>
-        <w:pStyle w:val="Heading3"/>
-      </w:pPr>
-      <w:r>
-        <w:t>How to explain a High/Critical label</w:t>
+        <w:spacing w:before="0" w:after="120" w:line="288" w:lineRule="auto"/>
+      </w:pPr>
+      <w:r>
+        <w:rPr>
+          <w:rFonts w:ascii="Calibri" w:hAnsi="Calibri"/>
+          <w:b/>
+          <w:color w:val="2A3730"/>
+          <w:sz w:val="21"/>
+        </w:rPr>
+        <w:t>Survival-reference formula</w:t>
       </w:r>
     </w:p>
     <w:tbl>
@@ -1790,6 +4320,120 @@
         <w:gridCol w:w="9360"/>
       </w:tblGrid>
       <w:tr>
+        <w:trPr>
+          <w:cantSplit/>
+        </w:trPr>
+        <w:tc>
+          <w:tcPr>
+            <w:tcW w:type="dxa" w:w="9360"/>
+            <w:tcMar>
+              <w:top w:w="80" w:type="dxa"/>
+              <w:start w:w="120" w:type="dxa"/>
+              <w:bottom w:w="80" w:type="dxa"/>
+              <w:end w:w="120" w:type="dxa"/>
+            </w:tcMar>
+            <w:vAlign w:val="center"/>
+            <w:shd w:fill="F2F8D9"/>
+          </w:tcPr>
+          <w:p>
+            <w:pPr>
+              <w:spacing w:before="0" w:after="0" w:line="300" w:lineRule="auto"/>
+            </w:pPr>
+            <w:r>
+              <w:rPr>
+                <w:rFonts w:ascii="Calibri" w:hAnsi="Calibri"/>
+                <w:color w:val="173F31"/>
+                <w:sz w:val="21"/>
+              </w:rPr>
+              <w:t>Reference survival on Day d = 100% − (5% × min(d, 35) ÷ 35)</w:t>
+            </w:r>
+          </w:p>
+        </w:tc>
+      </w:tr>
+    </w:tbl>
+    <w:p>
+      <w:pPr>
+        <w:spacing w:after="40"/>
+      </w:pPr>
+    </w:p>
+    <w:p>
+      <w:pPr>
+        <w:pStyle w:val="ListBullet"/>
+      </w:pPr>
+      <w:r>
+        <w:rPr>
+          <w:rFonts w:ascii="Calibri" w:hAnsi="Calibri"/>
+          <w:color w:val="2A3730"/>
+          <w:sz w:val="21"/>
+        </w:rPr>
+        <w:t xml:space="preserve"> Day 22: </w:t>
+      </w:r>
+      <w:r>
+        <w:rPr>
+          <w:rFonts w:ascii="Calibri" w:hAnsi="Calibri"/>
+          <w:b/>
+          <w:color w:val="286245"/>
+          <w:sz w:val="20"/>
+        </w:rPr>
+        <w:t>100% − (5% × 22 ÷ 35) = 96.86%</w:t>
+      </w:r>
+      <w:r>
+        <w:rPr>
+          <w:rFonts w:ascii="Calibri" w:hAnsi="Calibri"/>
+          <w:color w:val="2A3730"/>
+          <w:sz w:val="21"/>
+        </w:rPr>
+        <w:t>.</w:t>
+      </w:r>
+    </w:p>
+    <w:p>
+      <w:pPr>
+        <w:pStyle w:val="ListBullet"/>
+      </w:pPr>
+      <w:r>
+        <w:rPr>
+          <w:rFonts w:ascii="Calibri" w:hAnsi="Calibri"/>
+          <w:color w:val="2A3730"/>
+          <w:sz w:val="21"/>
+        </w:rPr>
+        <w:t xml:space="preserve"> This simply spreads the allowed 5% loss evenly through Day 35.</w:t>
+      </w:r>
+    </w:p>
+    <w:p>
+      <w:pPr>
+        <w:pStyle w:val="ListBullet"/>
+      </w:pPr>
+      <w:r>
+        <w:rPr>
+          <w:rFonts w:ascii="Calibri" w:hAnsi="Calibri"/>
+          <w:color w:val="2A3730"/>
+          <w:sz w:val="21"/>
+        </w:rPr>
+        <w:t xml:space="preserve"> It is not learned from the historical data and is not claimed to be a biological mortality curve.</w:t>
+      </w:r>
+    </w:p>
+    <w:p>
+      <w:pPr>
+        <w:pStyle w:val="Heading3"/>
+      </w:pPr>
+      <w:r>
+        <w:t>How to explain a High/Critical label</w:t>
+      </w:r>
+    </w:p>
+    <w:tbl>
+      <w:tblPr>
+        <w:tblW w:type="dxa" w:w="9360"/>
+        <w:tblLayout w:type="fixed"/>
+        <w:tblLook w:firstColumn="1" w:firstRow="1" w:lastColumn="0" w:lastRow="0" w:noHBand="0" w:noVBand="1" w:val="04A0"/>
+        <w:tblInd w:w="120" w:type="dxa"/>
+      </w:tblPr>
+      <w:tblGrid>
+        <w:gridCol w:w="9360"/>
+      </w:tblGrid>
+      <w:tr>
+        <w:trPr>
+          <w:cantSplit/>
+        </w:trPr>
         <w:tc>
           <w:tcPr>
             <w:tcW w:type="dxa" w:w="9360"/>
@@ -2226,32 +4870,6 @@
           <w:sz w:val="21"/>
         </w:rPr>
         <w:t xml:space="preserve"> Flock age.</w:t>
-      </w:r>
-    </w:p>
-    <w:p>
-      <w:pPr>
-        <w:pStyle w:val="ListBullet"/>
-      </w:pPr>
-      <w:r>
-        <w:rPr>
-          <w:rFonts w:ascii="Calibri" w:hAnsi="Calibri"/>
-          <w:color w:val="2A3730"/>
-          <w:sz w:val="21"/>
-        </w:rPr>
-        <w:t xml:space="preserve"> Beginning population.</w:t>
-      </w:r>
-    </w:p>
-    <w:p>
-      <w:pPr>
-        <w:pStyle w:val="ListBullet"/>
-      </w:pPr>
-      <w:r>
-        <w:rPr>
-          <w:rFonts w:ascii="Calibri" w:hAnsi="Calibri"/>
-          <w:color w:val="2A3730"/>
-          <w:sz w:val="21"/>
-        </w:rPr>
-        <w:t xml:space="preserve"> Tags/Lagundi building indicator.</w:t>
       </w:r>
     </w:p>
     <w:p>
@@ -2502,7 +5120,7 @@
                 <w:color w:val="2A3730"/>
                 <w:sz w:val="18"/>
               </w:rPr>
-              <w:t>Trend-naive forecast</w:t>
+              <w:t>Current-survival projection</w:t>
             </w:r>
           </w:p>
         </w:tc>
@@ -2558,7 +5176,7 @@
                 <w:color w:val="2A3730"/>
                 <w:sz w:val="18"/>
               </w:rPr>
-              <w:t>Weakest</w:t>
+              <w:t>Transparent but weak</w:t>
             </w:r>
           </w:p>
         </w:tc>
@@ -2853,6 +5471,7 @@
           </w:tcPr>
           <w:p>
             <w:pPr>
+              <w:keepNext/>
               <w:keepLines/>
               <w:spacing w:before="0" w:after="0" w:line="264" w:lineRule="auto"/>
             </w:pPr>
@@ -2860,7 +5479,6 @@
             <w:r>
               <w:rPr>
                 <w:rFonts w:ascii="Calibri" w:hAnsi="Calibri"/>
-                <w:b/>
                 <w:color w:val="2A3730"/>
                 <w:sz w:val="18"/>
               </w:rPr>
@@ -2881,6 +5499,7 @@
           </w:tcPr>
           <w:p>
             <w:pPr>
+              <w:keepNext/>
               <w:keepLines/>
               <w:spacing w:before="0" w:after="0" w:line="264" w:lineRule="auto"/>
             </w:pPr>
@@ -2888,7 +5507,6 @@
             <w:r>
               <w:rPr>
                 <w:rFonts w:ascii="Calibri" w:hAnsi="Calibri"/>
-                <w:b/>
                 <w:color w:val="2A3730"/>
                 <w:sz w:val="18"/>
               </w:rPr>
@@ -2909,6 +5527,98 @@
           </w:tcPr>
           <w:p>
             <w:pPr>
+              <w:keepNext/>
+              <w:keepLines/>
+              <w:spacing w:before="0" w:after="0" w:line="264" w:lineRule="auto"/>
+            </w:pPr>
+            <w:r/>
+            <w:r>
+              <w:rPr>
+                <w:rFonts w:ascii="Calibri" w:hAnsi="Calibri"/>
+                <w:color w:val="2A3730"/>
+                <w:sz w:val="18"/>
+              </w:rPr>
+              <w:t>Competitive</w:t>
+            </w:r>
+          </w:p>
+        </w:tc>
+      </w:tr>
+      <w:tr>
+        <w:trPr>
+          <w:cantSplit/>
+        </w:trPr>
+        <w:tc>
+          <w:tcPr>
+            <w:tcW w:type="dxa" w:w="2500"/>
+            <w:tcMar>
+              <w:top w:w="80" w:type="dxa"/>
+              <w:start w:w="120" w:type="dxa"/>
+              <w:bottom w:w="80" w:type="dxa"/>
+              <w:end w:w="120" w:type="dxa"/>
+            </w:tcMar>
+            <w:vAlign w:val="center"/>
+            <w:shd w:fill="F4F8F5"/>
+          </w:tcPr>
+          <w:p>
+            <w:pPr>
+              <w:keepLines/>
+              <w:spacing w:before="0" w:after="0" w:line="264" w:lineRule="auto"/>
+            </w:pPr>
+            <w:r/>
+            <w:r>
+              <w:rPr>
+                <w:rFonts w:ascii="Calibri" w:hAnsi="Calibri"/>
+                <w:b/>
+                <w:color w:val="2A3730"/>
+                <w:sz w:val="18"/>
+              </w:rPr>
+              <w:t>Compact Ridge without weight, inventory, or building identity</w:t>
+            </w:r>
+          </w:p>
+        </w:tc>
+        <w:tc>
+          <w:tcPr>
+            <w:tcW w:type="dxa" w:w="1800"/>
+            <w:tcMar>
+              <w:top w:w="80" w:type="dxa"/>
+              <w:start w:w="120" w:type="dxa"/>
+              <w:bottom w:w="80" w:type="dxa"/>
+              <w:end w:w="120" w:type="dxa"/>
+            </w:tcMar>
+            <w:vAlign w:val="center"/>
+            <w:shd w:fill="F4F8F5"/>
+          </w:tcPr>
+          <w:p>
+            <w:pPr>
+              <w:keepLines/>
+              <w:spacing w:before="0" w:after="0" w:line="264" w:lineRule="auto"/>
+            </w:pPr>
+            <w:r/>
+            <w:r>
+              <w:rPr>
+                <w:rFonts w:ascii="Calibri" w:hAnsi="Calibri"/>
+                <w:b/>
+                <w:color w:val="2A3730"/>
+                <w:sz w:val="18"/>
+              </w:rPr>
+              <w:t>1.32 pts</w:t>
+            </w:r>
+          </w:p>
+        </w:tc>
+        <w:tc>
+          <w:tcPr>
+            <w:tcW w:type="dxa" w:w="5060"/>
+            <w:tcMar>
+              <w:top w:w="80" w:type="dxa"/>
+              <w:start w:w="120" w:type="dxa"/>
+              <w:bottom w:w="80" w:type="dxa"/>
+              <w:end w:w="120" w:type="dxa"/>
+            </w:tcMar>
+            <w:vAlign w:val="center"/>
+            <w:shd w:fill="F4F8F5"/>
+          </w:tcPr>
+          <w:p>
+            <w:pPr>
               <w:keepLines/>
               <w:spacing w:before="0" w:after="0" w:line="264" w:lineRule="auto"/>
             </w:pPr>
@@ -2936,7 +5646,7 @@
         <w:pStyle w:val="Heading3"/>
       </w:pPr>
       <w:r>
-        <w:t>Why Ridge without weight won</w:t>
+        <w:t>Why compact Ridge won</w:t>
       </w:r>
     </w:p>
     <w:p>
@@ -2962,7 +5672,7 @@
           <w:color w:val="2A3730"/>
           <w:sz w:val="21"/>
         </w:rPr>
-        <w:t xml:space="preserve"> Compact and explainable.</w:t>
+        <w:t xml:space="preserve"> Within 5% of the best cycle-balanced candidate.</w:t>
       </w:r>
     </w:p>
     <w:p>
@@ -2975,7 +5685,7 @@
           <w:color w:val="2A3730"/>
           <w:sz w:val="21"/>
         </w:rPr>
-        <w:t xml:space="preserve"> More stable and simpler than a tree-based alternative.</w:t>
+        <w:t xml:space="preserve"> More compact and explainable than the tree model.</w:t>
       </w:r>
     </w:p>
     <w:p>
@@ -2988,7 +5698,20 @@
           <w:color w:val="2A3730"/>
           <w:sz w:val="21"/>
         </w:rPr>
-        <w:t xml:space="preserve"> Avoided keeping weight features that did not improve unseen-cycle performance.</w:t>
+        <w:t xml:space="preserve"> Removed weight, raw beginning inventory, and Tags/Lagundi identity because those inputs did not strengthen the defensible held-out result.</w:t>
+      </w:r>
+    </w:p>
+    <w:p>
+      <w:pPr>
+        <w:pStyle w:val="ListBullet"/>
+      </w:pPr>
+      <w:r>
+        <w:rPr>
+          <w:rFonts w:ascii="Calibri" w:hAnsi="Calibri"/>
+          <w:color w:val="2A3730"/>
+          <w:sz w:val="21"/>
+        </w:rPr>
+        <w:t xml:space="preserve"> Kept current survival because final recovery uses the same beginning-population denominator: final recovery cannot exceed the share still alive today.</w:t>
       </w:r>
     </w:p>
     <w:p>
@@ -3108,7 +5831,7 @@
           <w:color w:val="2A3730"/>
           <w:sz w:val="21"/>
         </w:rPr>
-        <w:t>1.34 recovery points</w:t>
+        <w:t>1.32 recovery points</w:t>
       </w:r>
       <w:r>
         <w:rPr>
@@ -3138,7 +5861,7 @@
           <w:color w:val="2A3730"/>
           <w:sz w:val="21"/>
         </w:rPr>
-        <w:t>1.69 recovery points</w:t>
+        <w:t>1.76 recovery points</w:t>
       </w:r>
       <w:r>
         <w:rPr>
@@ -3168,7 +5891,7 @@
           <w:color w:val="2A3730"/>
           <w:sz w:val="21"/>
         </w:rPr>
-        <w:t>1.44 recovery points</w:t>
+        <w:t>1.43 recovery points</w:t>
       </w:r>
       <w:r>
         <w:rPr>
@@ -3518,7 +6241,7 @@
                 <w:color w:val="2A3730"/>
                 <w:sz w:val="18"/>
               </w:rPr>
-              <w:t>22.2%</w:t>
+              <w:t>26.9%</w:t>
             </w:r>
           </w:p>
         </w:tc>
@@ -3580,7 +6303,7 @@
                 <w:color w:val="2A3730"/>
                 <w:sz w:val="18"/>
               </w:rPr>
-              <w:t>Beginning population</w:t>
+              <w:t>Recent 3-day mortality</w:t>
             </w:r>
           </w:p>
         </w:tc>
@@ -3609,7 +6332,7 @@
                 <w:color w:val="2A3730"/>
                 <w:sz w:val="18"/>
               </w:rPr>
-              <w:t>12.7%</w:t>
+              <w:t>9.8%</w:t>
             </w:r>
           </w:p>
         </w:tc>
@@ -3638,7 +6361,7 @@
                 <w:color w:val="2A3730"/>
                 <w:sz w:val="18"/>
               </w:rPr>
-              <w:t>Higher lowers the fitted estimate</w:t>
+              <w:t>Higher lowers the estimate</w:t>
             </w:r>
           </w:p>
         </w:tc>
@@ -3699,7 +6422,7 @@
                 <w:color w:val="2A3730"/>
                 <w:sz w:val="18"/>
               </w:rPr>
-              <w:t>8.7%</w:t>
+              <w:t>9.4%</w:t>
             </w:r>
           </w:p>
         </w:tc>
@@ -3761,7 +6484,7 @@
                 <w:color w:val="2A3730"/>
                 <w:sz w:val="18"/>
               </w:rPr>
-              <w:t>Lagundi-building indicator</w:t>
+              <w:t>Flock age</w:t>
             </w:r>
           </w:p>
         </w:tc>
@@ -3790,7 +6513,7 @@
                 <w:color w:val="2A3730"/>
                 <w:sz w:val="18"/>
               </w:rPr>
-              <w:t>7.2%</w:t>
+              <w:t>9.4%</w:t>
             </w:r>
           </w:p>
         </w:tc>
@@ -3819,7 +6542,7 @@
                 <w:color w:val="2A3730"/>
                 <w:sz w:val="18"/>
               </w:rPr>
-              <w:t>Lagundi lowers the fitted estimate</w:t>
+              <w:t>Higher raises the fitted estimate</w:t>
             </w:r>
           </w:p>
         </w:tc>
@@ -3851,7 +6574,7 @@
                 <w:color w:val="2A3730"/>
                 <w:sz w:val="18"/>
               </w:rPr>
-              <w:t>Flock age</w:t>
+              <w:t>Mortality-trend feature</w:t>
             </w:r>
           </w:p>
         </w:tc>
@@ -3878,7 +6601,7 @@
                 <w:color w:val="2A3730"/>
                 <w:sz w:val="18"/>
               </w:rPr>
-              <w:t>6.6%</w:t>
+              <w:t>9.1%</w:t>
             </w:r>
           </w:p>
         </w:tc>
@@ -3905,7 +6628,7 @@
                 <w:color w:val="2A3730"/>
                 <w:sz w:val="18"/>
               </w:rPr>
-              <w:t>Higher raises the estimate</w:t>
+              <w:t>Fitted positive; interpret cautiously because mortality features overlap</w:t>
             </w:r>
           </w:p>
         </w:tc>
@@ -3940,7 +6663,7 @@
           <w:color w:val="2A3730"/>
           <w:sz w:val="21"/>
         </w:rPr>
-        <w:t xml:space="preserve"> Temperature and humidity values together represent only about </w:t>
+        <w:t xml:space="preserve"> Temperature and humidity values together represent about </w:t>
       </w:r>
       <w:r>
         <w:rPr>
@@ -3949,7 +6672,7 @@
           <w:color w:val="2A3730"/>
           <w:sz w:val="21"/>
         </w:rPr>
-        <w:t>2.4%</w:t>
+        <w:t>4.6%</w:t>
       </w:r>
       <w:r>
         <w:rPr>
@@ -3979,7 +6702,7 @@
           <w:color w:val="2A3730"/>
           <w:sz w:val="21"/>
         </w:rPr>
-        <w:t>23.4%</w:t>
+        <w:t>24.4%</w:t>
       </w:r>
       <w:r>
         <w:rPr>
@@ -4365,7 +7088,7 @@
       <w:pPr>
         <w:numPr>
           <w:ilvl w:val="0"/>
-          <w:numId w:val="12"/>
+          <w:numId w:val="14"/>
         </w:numPr>
         <w:spacing w:before="0" w:after="60" w:line="283" w:lineRule="auto"/>
       </w:pPr>
@@ -4382,7 +7105,7 @@
       <w:pPr>
         <w:numPr>
           <w:ilvl w:val="0"/>
-          <w:numId w:val="12"/>
+          <w:numId w:val="14"/>
         </w:numPr>
         <w:spacing w:before="0" w:after="60" w:line="283" w:lineRule="auto"/>
       </w:pPr>
@@ -4422,7 +7145,7 @@
           <w:color w:val="2A3730"/>
           <w:sz w:val="21"/>
         </w:rPr>
-        <w:t>five pooled candidate methods</w:t>
+        <w:t>seven pooled candidate methods</w:t>
       </w:r>
       <w:r>
         <w:rPr>
@@ -4511,7 +7234,6 @@
           </w:tcPr>
           <w:p>
             <w:pPr>
-              <w:keepNext/>
               <w:keepLines/>
               <w:spacing w:before="0" w:after="0" w:line="264" w:lineRule="auto"/>
             </w:pPr>
@@ -4545,7 +7267,6 @@
           </w:tcPr>
           <w:p>
             <w:pPr>
-              <w:keepNext/>
               <w:keepLines/>
               <w:spacing w:before="0" w:after="0" w:line="264" w:lineRule="auto"/>
             </w:pPr>
@@ -4583,7 +7304,6 @@
           </w:tcPr>
           <w:p>
             <w:pPr>
-              <w:keepNext/>
               <w:keepLines/>
               <w:spacing w:before="0" w:after="0" w:line="264" w:lineRule="auto"/>
             </w:pPr>
@@ -4611,7 +7331,6 @@
           </w:tcPr>
           <w:p>
             <w:pPr>
-              <w:keepNext/>
               <w:keepLines/>
               <w:spacing w:before="0" w:after="0" w:line="264" w:lineRule="auto"/>
             </w:pPr>
@@ -4645,7 +7364,6 @@
           </w:tcPr>
           <w:p>
             <w:pPr>
-              <w:keepNext/>
               <w:keepLines/>
               <w:spacing w:before="0" w:after="0" w:line="264" w:lineRule="auto"/>
             </w:pPr>
@@ -4674,7 +7392,6 @@
           </w:tcPr>
           <w:p>
             <w:pPr>
-              <w:keepNext/>
               <w:keepLines/>
               <w:spacing w:before="0" w:after="0" w:line="264" w:lineRule="auto"/>
             </w:pPr>
@@ -4707,7 +7424,6 @@
           </w:tcPr>
           <w:p>
             <w:pPr>
-              <w:keepNext/>
               <w:keepLines/>
               <w:spacing w:before="0" w:after="0" w:line="264" w:lineRule="auto"/>
             </w:pPr>
@@ -4735,7 +7451,6 @@
           </w:tcPr>
           <w:p>
             <w:pPr>
-              <w:keepNext/>
               <w:keepLines/>
               <w:spacing w:before="0" w:after="0" w:line="264" w:lineRule="auto"/>
             </w:pPr>
@@ -4769,7 +7484,6 @@
           </w:tcPr>
           <w:p>
             <w:pPr>
-              <w:keepNext/>
               <w:keepLines/>
               <w:spacing w:before="0" w:after="0" w:line="264" w:lineRule="auto"/>
             </w:pPr>
@@ -4799,7 +7513,6 @@
           </w:tcPr>
           <w:p>
             <w:pPr>
-              <w:keepNext/>
               <w:keepLines/>
               <w:spacing w:before="0" w:after="0" w:line="264" w:lineRule="auto"/>
             </w:pPr>
@@ -4875,6 +7588,126 @@
           </w:p>
         </w:tc>
       </w:tr>
+      <w:tr>
+        <w:trPr>
+          <w:cantSplit/>
+        </w:trPr>
+        <w:tc>
+          <w:tcPr>
+            <w:tcW w:type="dxa" w:w="3000"/>
+            <w:tcMar>
+              <w:top w:w="80" w:type="dxa"/>
+              <w:start w:w="120" w:type="dxa"/>
+              <w:bottom w:w="80" w:type="dxa"/>
+              <w:end w:w="120" w:type="dxa"/>
+            </w:tcMar>
+            <w:vAlign w:val="center"/>
+            <w:shd w:fill="F4F8F5"/>
+          </w:tcPr>
+          <w:p>
+            <w:pPr>
+              <w:keepLines/>
+              <w:spacing w:before="0" w:after="0" w:line="264" w:lineRule="auto"/>
+            </w:pPr>
+            <w:r/>
+            <w:r>
+              <w:rPr>
+                <w:rFonts w:ascii="Calibri" w:hAnsi="Calibri"/>
+                <w:color w:val="2A3730"/>
+                <w:sz w:val="19"/>
+              </w:rPr>
+              <w:t>Random Forest</w:t>
+            </w:r>
+          </w:p>
+        </w:tc>
+        <w:tc>
+          <w:tcPr>
+            <w:tcW w:type="dxa" w:w="6360"/>
+            <w:tcMar>
+              <w:top w:w="80" w:type="dxa"/>
+              <w:start w:w="120" w:type="dxa"/>
+              <w:bottom w:w="80" w:type="dxa"/>
+              <w:end w:w="120" w:type="dxa"/>
+            </w:tcMar>
+            <w:vAlign w:val="center"/>
+            <w:shd w:fill="F4F8F5"/>
+          </w:tcPr>
+          <w:p>
+            <w:pPr>
+              <w:keepLines/>
+              <w:spacing w:before="0" w:after="0" w:line="264" w:lineRule="auto"/>
+            </w:pPr>
+            <w:r/>
+            <w:r>
+              <w:rPr>
+                <w:rFonts w:ascii="Calibri" w:hAnsi="Calibri"/>
+                <w:color w:val="2A3730"/>
+                <w:sz w:val="19"/>
+              </w:rPr>
+              <w:t>253 g</w:t>
+            </w:r>
+          </w:p>
+        </w:tc>
+      </w:tr>
+      <w:tr>
+        <w:trPr>
+          <w:cantSplit/>
+        </w:trPr>
+        <w:tc>
+          <w:tcPr>
+            <w:tcW w:type="dxa" w:w="3000"/>
+            <w:tcMar>
+              <w:top w:w="80" w:type="dxa"/>
+              <w:start w:w="120" w:type="dxa"/>
+              <w:bottom w:w="80" w:type="dxa"/>
+              <w:end w:w="120" w:type="dxa"/>
+            </w:tcMar>
+            <w:vAlign w:val="center"/>
+          </w:tcPr>
+          <w:p>
+            <w:pPr>
+              <w:keepLines/>
+              <w:spacing w:before="0" w:after="0" w:line="264" w:lineRule="auto"/>
+            </w:pPr>
+            <w:r/>
+            <w:r>
+              <w:rPr>
+                <w:rFonts w:ascii="Calibri" w:hAnsi="Calibri"/>
+                <w:color w:val="2A3730"/>
+                <w:sz w:val="19"/>
+              </w:rPr>
+              <w:t>Gradient-boosted trees</w:t>
+            </w:r>
+          </w:p>
+        </w:tc>
+        <w:tc>
+          <w:tcPr>
+            <w:tcW w:type="dxa" w:w="6360"/>
+            <w:tcMar>
+              <w:top w:w="80" w:type="dxa"/>
+              <w:start w:w="120" w:type="dxa"/>
+              <w:bottom w:w="80" w:type="dxa"/>
+              <w:end w:w="120" w:type="dxa"/>
+            </w:tcMar>
+            <w:vAlign w:val="center"/>
+          </w:tcPr>
+          <w:p>
+            <w:pPr>
+              <w:keepLines/>
+              <w:spacing w:before="0" w:after="0" w:line="264" w:lineRule="auto"/>
+            </w:pPr>
+            <w:r/>
+            <w:r>
+              <w:rPr>
+                <w:rFonts w:ascii="Calibri" w:hAnsi="Calibri"/>
+                <w:color w:val="2A3730"/>
+                <w:sz w:val="19"/>
+              </w:rPr>
+              <w:t>293 g</w:t>
+            </w:r>
+          </w:p>
+        </w:tc>
+      </w:tr>
     </w:tbl>
     <w:p>
       <w:pPr>
@@ -5029,6 +7862,9 @@
         <w:gridCol w:w="9360"/>
       </w:tblGrid>
       <w:tr>
+        <w:trPr>
+          <w:cantSplit/>
+        </w:trPr>
         <w:tc>
           <w:tcPr>
             <w:tcW w:type="dxa" w:w="9360"/>
@@ -5072,7 +7908,148 @@
           <w:color w:val="2A3730"/>
           <w:sz w:val="21"/>
         </w:rPr>
-        <w:t xml:space="preserve"> Example: if the latest weight is 1,100 g on Day 21 and historical Day 21-to-35 remaining gain is 700 g, the projection is 1,800 g.</w:t>
+        <w:t xml:space="preserve"> For each eligible historical building, Canary calculates </w:t>
+      </w:r>
+      <w:r>
+        <w:rPr>
+          <w:rFonts w:ascii="Calibri" w:hAnsi="Calibri"/>
+          <w:b/>
+          <w:color w:val="286245"/>
+          <w:sz w:val="20"/>
+        </w:rPr>
+        <w:t>observed Day 35 weight − weight at the checkpoint</w:t>
+      </w:r>
+      <w:r>
+        <w:rPr>
+          <w:rFonts w:ascii="Calibri" w:hAnsi="Calibri"/>
+          <w:color w:val="2A3730"/>
+          <w:sz w:val="21"/>
+        </w:rPr>
+        <w:t>, then averages those remaining gains across the training buildings.</w:t>
+      </w:r>
+    </w:p>
+    <w:p>
+      <w:pPr>
+        <w:pStyle w:val="ListBullet"/>
+      </w:pPr>
+      <w:r>
+        <w:rPr>
+          <w:rFonts w:ascii="Calibri" w:hAnsi="Calibri"/>
+          <w:color w:val="2A3730"/>
+          <w:sz w:val="21"/>
+        </w:rPr>
+        <w:t xml:space="preserve"> With all eligible historical labels fitted for deployment, the mean allowances are approximately </w:t>
+      </w:r>
+      <w:r>
+        <w:rPr>
+          <w:rFonts w:ascii="Calibri" w:hAnsi="Calibri"/>
+          <w:b/>
+          <w:color w:val="2A3730"/>
+          <w:sz w:val="21"/>
+        </w:rPr>
+        <w:t>1,420 g from Day 7</w:t>
+      </w:r>
+      <w:r>
+        <w:rPr>
+          <w:rFonts w:ascii="Calibri" w:hAnsi="Calibri"/>
+          <w:color w:val="2A3730"/>
+          <w:sz w:val="21"/>
+        </w:rPr>
+        <w:t xml:space="preserve">, </w:t>
+      </w:r>
+      <w:r>
+        <w:rPr>
+          <w:rFonts w:ascii="Calibri" w:hAnsi="Calibri"/>
+          <w:b/>
+          <w:color w:val="2A3730"/>
+          <w:sz w:val="21"/>
+        </w:rPr>
+        <w:t>1,264 g from Day 14</w:t>
+      </w:r>
+      <w:r>
+        <w:rPr>
+          <w:rFonts w:ascii="Calibri" w:hAnsi="Calibri"/>
+          <w:color w:val="2A3730"/>
+          <w:sz w:val="21"/>
+        </w:rPr>
+        <w:t xml:space="preserve">, </w:t>
+      </w:r>
+      <w:r>
+        <w:rPr>
+          <w:rFonts w:ascii="Calibri" w:hAnsi="Calibri"/>
+          <w:b/>
+          <w:color w:val="2A3730"/>
+          <w:sz w:val="21"/>
+        </w:rPr>
+        <w:t>983 g from Day 21</w:t>
+      </w:r>
+      <w:r>
+        <w:rPr>
+          <w:rFonts w:ascii="Calibri" w:hAnsi="Calibri"/>
+          <w:color w:val="2A3730"/>
+          <w:sz w:val="21"/>
+        </w:rPr>
+        <w:t xml:space="preserve">, and </w:t>
+      </w:r>
+      <w:r>
+        <w:rPr>
+          <w:rFonts w:ascii="Calibri" w:hAnsi="Calibri"/>
+          <w:b/>
+          <w:color w:val="2A3730"/>
+          <w:sz w:val="21"/>
+        </w:rPr>
+        <w:t>637 g from Day 28</w:t>
+      </w:r>
+      <w:r>
+        <w:rPr>
+          <w:rFonts w:ascii="Calibri" w:hAnsi="Calibri"/>
+          <w:color w:val="2A3730"/>
+          <w:sz w:val="21"/>
+        </w:rPr>
+        <w:t>.</w:t>
+      </w:r>
+    </w:p>
+    <w:p>
+      <w:pPr>
+        <w:pStyle w:val="ListBullet"/>
+      </w:pPr>
+      <w:r>
+        <w:rPr>
+          <w:rFonts w:ascii="Calibri" w:hAnsi="Calibri"/>
+          <w:color w:val="2A3730"/>
+          <w:sz w:val="21"/>
+        </w:rPr>
+        <w:t xml:space="preserve"> Example: if the latest weight is 1,100 g on Day 21, the projection is </w:t>
+      </w:r>
+      <w:r>
+        <w:rPr>
+          <w:rFonts w:ascii="Calibri" w:hAnsi="Calibri"/>
+          <w:b/>
+          <w:color w:val="286245"/>
+          <w:sz w:val="20"/>
+        </w:rPr>
+        <w:t>1,100 + 983 = 2,083 g</w:t>
+      </w:r>
+      <w:r>
+        <w:rPr>
+          <w:rFonts w:ascii="Calibri" w:hAnsi="Calibri"/>
+          <w:color w:val="2A3730"/>
+          <w:sz w:val="21"/>
+        </w:rPr>
+        <w:t>.</w:t>
+      </w:r>
+    </w:p>
+    <w:p>
+      <w:pPr>
+        <w:pStyle w:val="ListBullet"/>
+      </w:pPr>
+      <w:r>
+        <w:rPr>
+          <w:rFonts w:ascii="Calibri" w:hAnsi="Calibri"/>
+          <w:color w:val="2A3730"/>
+          <w:sz w:val="21"/>
+        </w:rPr>
+        <w:t xml:space="preserve"> During validation, the gain allowance is recalculated without the held-out cycle. The 983 g value is the final deployment fit, not a value leaked into its own test cycle.</w:t>
       </w:r>
     </w:p>
     <w:p>
@@ -5558,6 +8535,9 @@
         <w:gridCol w:w="9360"/>
       </w:tblGrid>
       <w:tr>
+        <w:trPr>
+          <w:cantSplit/>
+        </w:trPr>
         <w:tc>
           <w:tcPr>
             <w:tcW w:type="dxa" w:w="9360"/>
@@ -5580,7 +8560,7 @@
                 <w:color w:val="173F31"/>
                 <w:sz w:val="21"/>
               </w:rPr>
-              <w:t>"We did not assume machine learning must win. We compared five approaches, including Ridge regression, using complete-cycle-held-out validation. The simpler historical remaining-gain method produced the best validated error, so Canary deploys that method. It pools eligible buildings because the sample is too small for reliable building-specific models, while every forecast still starts from that building's own latest measured weight."</w:t>
+              <w:t>"We did not assume machine learning must win. We compared seven approaches, including Ridge, Random Forest, and gradient-boosted trees, using complete-cycle-held-out validation. The simpler historical remaining-gain method produced the best overall validated error and stayed within 5% of the best cycle-balanced result, so Canary deploys it. The method pools eligible buildings because the sample is too small for reliable building-specific models, while every forecast still starts from that building's own latest measured weight."</w:t>
             </w:r>
           </w:p>
         </w:tc>
@@ -6553,6 +9533,9 @@
         <w:gridCol w:w="9360"/>
       </w:tblGrid>
       <w:tr>
+        <w:trPr>
+          <w:cantSplit/>
+        </w:trPr>
         <w:tc>
           <w:tcPr>
             <w:tcW w:type="dxa" w:w="9360"/>
@@ -6575,7 +9558,7 @@
                 <w:color w:val="173F31"/>
                 <w:sz w:val="21"/>
               </w:rPr>
-              <w:t>“Temperature is 28°C on Day 22; the provisional target is 20°C and acceptable range is 18–22°C. Verify the reading at bird height, then check fans, inlets or curtains, cooling pads, airflow, and water availability. Bring conditions toward the approved range. Canary does not claim heat caused the performance result.”</w:t>
+              <w:t>“Temperature is above the approved age-based range. Verify the reading at bird height, then check fans, inlets or curtains, cooling pads, airflow, and water availability. Bring conditions toward the approved range. Canary does not claim heat caused the performance result.”</w:t>
             </w:r>
           </w:p>
         </w:tc>
@@ -6734,6 +9717,28 @@
     </w:p>
     <w:p>
       <w:pPr>
+        <w:spacing w:before="0" w:after="120" w:line="288" w:lineRule="auto"/>
+      </w:pPr>
+      <w:r>
+        <w:rPr>
+          <w:rFonts w:ascii="Calibri" w:hAnsi="Calibri"/>
+          <w:b/>
+          <w:color w:val="2A3730"/>
+          <w:sz w:val="21"/>
+        </w:rPr>
+        <w:t>Current architecture verdict:</w:t>
+      </w:r>
+      <w:r>
+        <w:rPr>
+          <w:rFonts w:ascii="Calibri" w:hAnsi="Calibri"/>
+          <w:color w:val="2A3730"/>
+          <w:sz w:val="21"/>
+        </w:rPr>
+        <w:t xml:space="preserve"> keep environment out of the 0–12 outcome-warning score for this capstone, but use supported operating alerts as the owner-facing reason and action. This is more actionable without double-counting the same outcome or pretending that an association is a proven cause.</w:t>
+      </w:r>
+    </w:p>
+    <w:p>
+      <w:pPr>
         <w:pStyle w:val="Heading1"/>
       </w:pPr>
       <w:r>
@@ -7455,7 +10460,7 @@
       <w:pPr>
         <w:numPr>
           <w:ilvl w:val="0"/>
-          <w:numId w:val="13"/>
+          <w:numId w:val="15"/>
         </w:numPr>
         <w:spacing w:before="0" w:after="60" w:line="283" w:lineRule="auto"/>
       </w:pPr>
@@ -7481,7 +10486,7 @@
       <w:pPr>
         <w:numPr>
           <w:ilvl w:val="0"/>
-          <w:numId w:val="13"/>
+          <w:numId w:val="15"/>
         </w:numPr>
         <w:spacing w:before="0" w:after="60" w:line="283" w:lineRule="auto"/>
       </w:pPr>
@@ -7507,7 +10512,7 @@
       <w:pPr>
         <w:numPr>
           <w:ilvl w:val="0"/>
-          <w:numId w:val="13"/>
+          <w:numId w:val="15"/>
         </w:numPr>
         <w:spacing w:before="0" w:after="60" w:line="283" w:lineRule="auto"/>
       </w:pPr>
@@ -7533,7 +10538,7 @@
       <w:pPr>
         <w:numPr>
           <w:ilvl w:val="0"/>
-          <w:numId w:val="13"/>
+          <w:numId w:val="15"/>
         </w:numPr>
         <w:spacing w:before="0" w:after="60" w:line="283" w:lineRule="auto"/>
       </w:pPr>
@@ -7559,7 +10564,7 @@
       <w:pPr>
         <w:numPr>
           <w:ilvl w:val="0"/>
-          <w:numId w:val="13"/>
+          <w:numId w:val="15"/>
         </w:numPr>
         <w:spacing w:before="0" w:after="60" w:line="283" w:lineRule="auto"/>
       </w:pPr>
@@ -7585,7 +10590,7 @@
       <w:pPr>
         <w:numPr>
           <w:ilvl w:val="0"/>
-          <w:numId w:val="13"/>
+          <w:numId w:val="15"/>
         </w:numPr>
         <w:spacing w:before="0" w:after="60" w:line="283" w:lineRule="auto"/>
       </w:pPr>
@@ -7611,7 +10616,7 @@
       <w:pPr>
         <w:numPr>
           <w:ilvl w:val="0"/>
-          <w:numId w:val="13"/>
+          <w:numId w:val="15"/>
         </w:numPr>
         <w:spacing w:before="0" w:after="60" w:line="283" w:lineRule="auto"/>
       </w:pPr>
@@ -7637,7 +10642,7 @@
       <w:pPr>
         <w:numPr>
           <w:ilvl w:val="0"/>
-          <w:numId w:val="13"/>
+          <w:numId w:val="15"/>
         </w:numPr>
         <w:spacing w:before="0" w:after="60" w:line="283" w:lineRule="auto"/>
       </w:pPr>
@@ -7663,7 +10668,7 @@
       <w:pPr>
         <w:numPr>
           <w:ilvl w:val="0"/>
-          <w:numId w:val="13"/>
+          <w:numId w:val="15"/>
         </w:numPr>
         <w:spacing w:before="0" w:after="60" w:line="283" w:lineRule="auto"/>
       </w:pPr>
@@ -7963,6 +10968,9 @@
         <w:gridCol w:w="9360"/>
       </w:tblGrid>
       <w:tr>
+        <w:trPr>
+          <w:cantSplit/>
+        </w:trPr>
         <w:tc>
           <w:tcPr>
             <w:tcW w:type="dxa" w:w="9360"/>
@@ -8087,6 +11095,9 @@
         <w:gridCol w:w="9360"/>
       </w:tblGrid>
       <w:tr>
+        <w:trPr>
+          <w:cantSplit/>
+        </w:trPr>
         <w:tc>
           <w:tcPr>
             <w:tcW w:type="dxa" w:w="9360"/>
@@ -8435,6 +11446,38 @@
   </w:abstractNum>
   <w:num w:numId="13">
     <w:abstractNumId w:val="12"/>
+  </w:num>
+  <w:abstractNum w:abstractNumId="13">
+    <w:multiLevelType w:val="singleLevel"/>
+    <w:lvl w:ilvl="0">
+      <w:start w:val="1"/>
+      <w:numFmt w:val="decimal"/>
+      <w:lvlText w:val="%1."/>
+      <w:lvlJc w:val="left"/>
+      <w:suff w:val="space"/>
+      <w:pPr>
+        <w:ind w:left="540" w:hanging="270"/>
+      </w:pPr>
+    </w:lvl>
+  </w:abstractNum>
+  <w:num w:numId="14">
+    <w:abstractNumId w:val="13"/>
+  </w:num>
+  <w:abstractNum w:abstractNumId="14">
+    <w:multiLevelType w:val="singleLevel"/>
+    <w:lvl w:ilvl="0">
+      <w:start w:val="1"/>
+      <w:numFmt w:val="decimal"/>
+      <w:lvlText w:val="%1."/>
+      <w:lvlJc w:val="left"/>
+      <w:suff w:val="space"/>
+      <w:pPr>
+        <w:ind w:left="540" w:hanging="270"/>
+      </w:pPr>
+    </w:lvl>
+  </w:abstractNum>
+  <w:num w:numId="15">
+    <w:abstractNumId w:val="14"/>
   </w:num>
 </w:numbering>
 </file>

</xml_diff>

<commit_message>
Aug 10, 3:57 update
feat: add transparent model audit evidence and capstone validation workflow

- export model-ready outcome and training datasets
- add recovery and Day 35 model notebooks
- report cycle-level and horizon-level performance
- add methodology downloads and data lineage
- add safe teammate model comparison protocol
- synchronize defense cheat sheet and model manifests
- pass full tests and 45 capstone validation checks
</commit_message>
<xml_diff>
--- a/docs/Project_Canary_Defense_Cheat_Sheet.docx
+++ b/docs/Project_Canary_Defense_Cheat_Sheet.docx
@@ -95,6 +95,218 @@
       <w:pPr>
         <w:spacing w:before="0" w:after="80" w:line="300" w:lineRule="auto"/>
       </w:pPr>
+    </w:p>
+    <w:p>
+      <w:pPr>
+        <w:pStyle w:val="Heading1"/>
+      </w:pPr>
+      <w:r>
+        <w:t>New transparent evidence package</w:t>
+      </w:r>
+    </w:p>
+    <w:p>
+      <w:pPr>
+        <w:spacing w:before="0" w:after="120" w:line="288" w:lineRule="auto"/>
+      </w:pPr>
+      <w:r>
+        <w:rPr>
+          <w:rFonts w:ascii="Calibri" w:hAnsi="Calibri"/>
+          <w:color w:val="2A3730"/>
+          <w:sz w:val="21"/>
+        </w:rPr>
+        <w:t>Canary no longer asks the panel to trust an in-memory transformation. The repository includes:</w:t>
+      </w:r>
+    </w:p>
+    <w:p>
+      <w:pPr>
+        <w:pStyle w:val="ListBullet"/>
+      </w:pPr>
+      <w:r>
+        <w:rPr>
+          <w:rFonts w:ascii="Calibri" w:hAnsi="Calibri"/>
+          <w:color w:val="2A3730"/>
+          <w:sz w:val="21"/>
+        </w:rPr>
+        <w:t xml:space="preserve"> </w:t>
+      </w:r>
+      <w:r>
+        <w:rPr>
+          <w:rFonts w:ascii="Calibri" w:hAnsi="Calibri"/>
+          <w:b/>
+          <w:color w:val="286245"/>
+          <w:sz w:val="20"/>
+        </w:rPr>
+        <w:t>outputs/model_ready/Project_Canary_Model_Ready_Data.xlsx</w:t>
+      </w:r>
+    </w:p>
+    <w:p>
+      <w:pPr>
+        <w:spacing w:before="0" w:after="120" w:line="288" w:lineRule="auto"/>
+      </w:pPr>
+      <w:r>
+        <w:rPr>
+          <w:rFonts w:ascii="Calibri" w:hAnsi="Calibri"/>
+          <w:color w:val="2A3730"/>
+          <w:sz w:val="21"/>
+        </w:rPr>
+        <w:t xml:space="preserve">  - Data Dictionary</w:t>
+      </w:r>
+    </w:p>
+    <w:p>
+      <w:pPr>
+        <w:spacing w:before="0" w:after="120" w:line="288" w:lineRule="auto"/>
+      </w:pPr>
+      <w:r>
+        <w:rPr>
+          <w:rFonts w:ascii="Calibri" w:hAnsi="Calibri"/>
+          <w:color w:val="2A3730"/>
+          <w:sz w:val="21"/>
+        </w:rPr>
+        <w:t xml:space="preserve">  - 31 union building-outcome rows, including 25 recovery-eligible outcomes and 31 Day 35 weight outcomes</w:t>
+      </w:r>
+    </w:p>
+    <w:p>
+      <w:pPr>
+        <w:spacing w:before="0" w:after="120" w:line="288" w:lineRule="auto"/>
+      </w:pPr>
+      <w:r>
+        <w:rPr>
+          <w:rFonts w:ascii="Calibri" w:hAnsi="Calibri"/>
+          <w:color w:val="2A3730"/>
+          <w:sz w:val="21"/>
+        </w:rPr>
+        <w:t xml:space="preserve">  - the exact 122 recovery-training snapshots</w:t>
+      </w:r>
+    </w:p>
+    <w:p>
+      <w:pPr>
+        <w:spacing w:before="0" w:after="120" w:line="288" w:lineRule="auto"/>
+      </w:pPr>
+      <w:r>
+        <w:rPr>
+          <w:rFonts w:ascii="Calibri" w:hAnsi="Calibri"/>
+          <w:color w:val="2A3730"/>
+          <w:sz w:val="21"/>
+        </w:rPr>
+        <w:t xml:space="preserve">  - the exact 124 Day 35 weight-training rows</w:t>
+      </w:r>
+    </w:p>
+    <w:p>
+      <w:pPr>
+        <w:spacing w:before="0" w:after="120" w:line="288" w:lineRule="auto"/>
+      </w:pPr>
+      <w:r>
+        <w:rPr>
+          <w:rFonts w:ascii="Calibri" w:hAnsi="Calibri"/>
+          <w:color w:val="2A3730"/>
+          <w:sz w:val="21"/>
+        </w:rPr>
+        <w:t xml:space="preserve">  - all 1,122 leakage-safe daily recovery candidates before checkpoint balancing</w:t>
+      </w:r>
+    </w:p>
+    <w:p>
+      <w:pPr>
+        <w:pStyle w:val="ListBullet"/>
+      </w:pPr>
+      <w:r>
+        <w:rPr>
+          <w:rFonts w:ascii="Calibri" w:hAnsi="Calibri"/>
+          <w:color w:val="2A3730"/>
+          <w:sz w:val="21"/>
+        </w:rPr>
+        <w:t xml:space="preserve"> </w:t>
+      </w:r>
+      <w:r>
+        <w:rPr>
+          <w:rFonts w:ascii="Calibri" w:hAnsi="Calibri"/>
+          <w:b/>
+          <w:color w:val="286245"/>
+          <w:sz w:val="20"/>
+        </w:rPr>
+        <w:t>outputs/model_ready/recovery_training.csv</w:t>
+      </w:r>
+    </w:p>
+    <w:p>
+      <w:pPr>
+        <w:pStyle w:val="ListBullet"/>
+      </w:pPr>
+      <w:r>
+        <w:rPr>
+          <w:rFonts w:ascii="Calibri" w:hAnsi="Calibri"/>
+          <w:color w:val="2A3730"/>
+          <w:sz w:val="21"/>
+        </w:rPr>
+        <w:t xml:space="preserve"> </w:t>
+      </w:r>
+      <w:r>
+        <w:rPr>
+          <w:rFonts w:ascii="Calibri" w:hAnsi="Calibri"/>
+          <w:b/>
+          <w:color w:val="286245"/>
+          <w:sz w:val="20"/>
+        </w:rPr>
+        <w:t>outputs/model_ready/day35_weight_training.csv</w:t>
+      </w:r>
+    </w:p>
+    <w:p>
+      <w:pPr>
+        <w:pStyle w:val="ListBullet"/>
+      </w:pPr>
+      <w:r>
+        <w:rPr>
+          <w:rFonts w:ascii="Calibri" w:hAnsi="Calibri"/>
+          <w:color w:val="2A3730"/>
+          <w:sz w:val="21"/>
+        </w:rPr>
+        <w:t xml:space="preserve"> two executed notebooks that rebuild the workflow and verify their rows against these exports</w:t>
+      </w:r>
+    </w:p>
+    <w:p>
+      <w:pPr>
+        <w:spacing w:before="0" w:after="120" w:line="288" w:lineRule="auto"/>
+      </w:pPr>
+      <w:r>
+        <w:rPr>
+          <w:rFonts w:ascii="Calibri" w:hAnsi="Calibri"/>
+          <w:color w:val="2A3730"/>
+          <w:sz w:val="21"/>
+        </w:rPr>
+        <w:t>One building-outcome row is the final historical evidence for one building-cycle. A training snapshot is an earlier decision point containing only what management could have known on that review date. The snapshot design is what lets Canary evaluate Day 7, 14, 21, and 28 forecasts without exposing later measurements.</w:t>
+      </w:r>
+    </w:p>
+    <w:p>
+      <w:pPr>
+        <w:spacing w:before="0" w:after="120" w:line="288" w:lineRule="auto"/>
+      </w:pPr>
+      <w:r>
+        <w:rPr>
+          <w:rFonts w:ascii="Calibri" w:hAnsi="Calibri"/>
+          <w:color w:val="2A3730"/>
+          <w:sz w:val="21"/>
+        </w:rPr>
+        <w:t>The versioned model manifests are the single source for metrics displayed in the app, notebooks, and defense material. The app now shows overall, Day 14, forecast-horizon, and held-out-cycle results.</w:t>
+      </w:r>
+    </w:p>
+    <w:p>
+      <w:pPr>
+        <w:pStyle w:val="Heading3"/>
+      </w:pPr>
+      <w:r>
+        <w:t>Teammate-model comparison</w:t>
+      </w:r>
+    </w:p>
+    <w:p>
+      <w:pPr>
+        <w:spacing w:before="0" w:after="120" w:line="288" w:lineRule="auto"/>
+      </w:pPr>
+      <w:r>
+        <w:rPr>
+          <w:rFonts w:ascii="Calibri" w:hAnsi="Calibri"/>
+          <w:color w:val="2A3730"/>
+          <w:sz w:val="21"/>
+        </w:rPr>
+        <w:t>The comparison framework is ready, but the actual comparison is pending the teammate’s notebook, trusted model artifact, environment file, and preprocessing/feature specification. Canary first inventories the pickle without executing it, then reproduces the notebook approach on the canonical exports. The model must pass the same complete-cycle holdouts and leakage rules before it can replace a champion.</w:t>
+      </w:r>
     </w:p>
     <w:p>
       <w:pPr>
@@ -2184,7 +2396,7 @@
                 <w:color w:val="2A3730"/>
                 <w:sz w:val="18"/>
               </w:rPr>
-              <w:t>Is the recorded house environment outside the provisional limit?</w:t>
+              <w:t>Is the recorded house environment outside the age-specific tropical range?</w:t>
             </w:r>
           </w:p>
         </w:tc>
@@ -2212,7 +2424,7 @@
                 <w:color w:val="2A3730"/>
                 <w:sz w:val="18"/>
               </w:rPr>
-              <w:t>Worse of daily temperature range and humidity deviation</w:t>
+              <w:t>Worse of average-temperature deviation and humidity deviation</w:t>
             </w:r>
           </w:p>
         </w:tc>
@@ -3091,7 +3303,63 @@
                 <w:color w:val="2A3730"/>
                 <w:sz w:val="18"/>
               </w:rPr>
-              <w:t>Daily temperature range</w:t>
+              <w:t>Temperature outside age range</w:t>
+            </w:r>
+          </w:p>
+        </w:tc>
+        <w:tc>
+          <w:tcPr>
+            <w:tcW w:type="dxa" w:w="1872"/>
+            <w:tcMar>
+              <w:top w:w="80" w:type="dxa"/>
+              <w:start w:w="120" w:type="dxa"/>
+              <w:bottom w:w="80" w:type="dxa"/>
+              <w:end w:w="120" w:type="dxa"/>
+            </w:tcMar>
+            <w:vAlign w:val="center"/>
+          </w:tcPr>
+          <w:p>
+            <w:pPr>
+              <w:keepNext/>
+              <w:keepLines/>
+              <w:spacing w:before="0" w:after="0" w:line="264" w:lineRule="auto"/>
+            </w:pPr>
+            <w:r/>
+            <w:r>
+              <w:rPr>
+                <w:rFonts w:ascii="Calibri" w:hAnsi="Calibri"/>
+                <w:color w:val="2A3730"/>
+                <w:sz w:val="18"/>
+              </w:rPr>
+              <w:t>0°C</w:t>
+            </w:r>
+          </w:p>
+        </w:tc>
+        <w:tc>
+          <w:tcPr>
+            <w:tcW w:type="dxa" w:w="1872"/>
+            <w:tcMar>
+              <w:top w:w="80" w:type="dxa"/>
+              <w:start w:w="120" w:type="dxa"/>
+              <w:bottom w:w="80" w:type="dxa"/>
+              <w:end w:w="120" w:type="dxa"/>
+            </w:tcMar>
+            <w:vAlign w:val="center"/>
+          </w:tcPr>
+          <w:p>
+            <w:pPr>
+              <w:keepNext/>
+              <w:keepLines/>
+              <w:spacing w:before="0" w:after="0" w:line="264" w:lineRule="auto"/>
+            </w:pPr>
+            <w:r/>
+            <w:r>
+              <w:rPr>
+                <w:rFonts w:ascii="Calibri" w:hAnsi="Calibri"/>
+                <w:color w:val="2A3730"/>
+                <w:sz w:val="18"/>
+              </w:rPr>
+              <w:t>1°C</w:t>
             </w:r>
           </w:p>
         </w:tc>
@@ -3147,63 +3415,7 @@
                 <w:color w:val="2A3730"/>
                 <w:sz w:val="18"/>
               </w:rPr>
-              <w:t>3°C</w:t>
-            </w:r>
-          </w:p>
-        </w:tc>
-        <w:tc>
-          <w:tcPr>
-            <w:tcW w:type="dxa" w:w="1872"/>
-            <w:tcMar>
-              <w:top w:w="80" w:type="dxa"/>
-              <w:start w:w="120" w:type="dxa"/>
-              <w:bottom w:w="80" w:type="dxa"/>
-              <w:end w:w="120" w:type="dxa"/>
-            </w:tcMar>
-            <w:vAlign w:val="center"/>
-          </w:tcPr>
-          <w:p>
-            <w:pPr>
-              <w:keepNext/>
-              <w:keepLines/>
-              <w:spacing w:before="0" w:after="0" w:line="264" w:lineRule="auto"/>
-            </w:pPr>
-            <w:r/>
-            <w:r>
-              <w:rPr>
-                <w:rFonts w:ascii="Calibri" w:hAnsi="Calibri"/>
-                <w:color w:val="2A3730"/>
-                <w:sz w:val="18"/>
-              </w:rPr>
-              <w:t>5°C</w:t>
-            </w:r>
-          </w:p>
-        </w:tc>
-        <w:tc>
-          <w:tcPr>
-            <w:tcW w:type="dxa" w:w="1872"/>
-            <w:tcMar>
-              <w:top w:w="80" w:type="dxa"/>
-              <w:start w:w="120" w:type="dxa"/>
-              <w:bottom w:w="80" w:type="dxa"/>
-              <w:end w:w="120" w:type="dxa"/>
-            </w:tcMar>
-            <w:vAlign w:val="center"/>
-          </w:tcPr>
-          <w:p>
-            <w:pPr>
-              <w:keepNext/>
-              <w:keepLines/>
-              <w:spacing w:before="0" w:after="0" w:line="264" w:lineRule="auto"/>
-            </w:pPr>
-            <w:r/>
-            <w:r>
-              <w:rPr>
-                <w:rFonts w:ascii="Calibri" w:hAnsi="Calibri"/>
-                <w:color w:val="2A3730"/>
-                <w:sz w:val="18"/>
-              </w:rPr>
-              <w:t>5°C</w:t>
+              <w:t>2°C</w:t>
             </w:r>
           </w:p>
         </w:tc>
@@ -3264,7 +3476,7 @@
                 <w:color w:val="2A3730"/>
                 <w:sz w:val="18"/>
               </w:rPr>
-              <w:t>0.1 points</w:t>
+              <w:t>0 points</w:t>
             </w:r>
           </w:p>
         </w:tc>
@@ -3369,7 +3581,7 @@
           <w:color w:val="2A3730"/>
           <w:sz w:val="21"/>
         </w:rPr>
-        <w:t xml:space="preserve">Humidity reference bands are 60–70% for Days 1–7, 55–65% for Days 8–14, and 50–60% from Day 15 onward. The environmental score is the </w:t>
+        <w:t xml:space="preserve">Temperature reference bands are 29–33°C for Days 1–6; 26–29°C for Days 7–13; 25–28°C for Days 14–20; 24–27°C for Days 21–27; and 24–26°C for Days 28–35. Humidity is 60–70% for Days 1–7 and 50–65% from Day 8 onward. The Day 35 bands are carried after Day 35 provisionally. The environmental score is the </w:t>
       </w:r>
       <w:r>
         <w:rPr>
@@ -3386,7 +3598,7 @@
           <w:color w:val="2A3730"/>
           <w:sz w:val="21"/>
         </w:rPr>
-        <w:t xml:space="preserve"> of the temperature-range and humidity scores, so related environmental evidence is not counted twice.</w:t>
+        <w:t xml:space="preserve"> of the temperature and humidity scores, so related environmental evidence is not counted twice.</w:t>
       </w:r>
     </w:p>
     <w:p>
@@ -3800,12 +4012,12 @@
         <w:pStyle w:val="Heading3"/>
       </w:pPr>
       <w:r>
-        <w:t>Honest limitation</w:t>
+        <w:t>Environmental freshness and honest limitation</w:t>
       </w:r>
     </w:p>
     <w:p>
       <w:pPr>
-        <w:spacing w:before="0" w:after="120" w:line="288" w:lineRule="auto"/>
+        <w:pStyle w:val="ListBullet"/>
       </w:pPr>
       <w:r>
         <w:rPr>
@@ -3813,7 +4025,7 @@
           <w:color w:val="2A3730"/>
           <w:sz w:val="21"/>
         </w:rPr>
-        <w:t xml:space="preserve">Risk thresholds are provisional until Doc Raymond signs them off. Environmental coverage is about </w:t>
+        <w:t xml:space="preserve"> Direct environmental readings cover </w:t>
       </w:r>
       <w:r>
         <w:rPr>
@@ -3822,7 +4034,7 @@
           <w:color w:val="2A3730"/>
           <w:sz w:val="21"/>
         </w:rPr>
-        <w:t>42%</w:t>
+        <w:t>706 of 1,666 building-days (42.4%)</w:t>
       </w:r>
       <w:r>
         <w:rPr>
@@ -3830,7 +4042,20 @@
           <w:color w:val="2A3730"/>
           <w:sz w:val="21"/>
         </w:rPr>
-        <w:t xml:space="preserve"> of canonical building-days. The proposed 2/3/5°C temperature-range rule would place </w:t>
+        <w:t>.</w:t>
+      </w:r>
+    </w:p>
+    <w:p>
+      <w:pPr>
+        <w:pStyle w:val="ListBullet"/>
+      </w:pPr>
+      <w:r>
+        <w:rPr>
+          <w:rFonts w:ascii="Calibri" w:hAnsi="Calibri"/>
+          <w:color w:val="2A3730"/>
+          <w:sz w:val="21"/>
+        </w:rPr>
+        <w:t xml:space="preserve"> With Canary's maximum two-day carry-forward rule, </w:t>
       </w:r>
       <w:r>
         <w:rPr>
@@ -3839,7 +4064,7 @@
           <w:color w:val="2A3730"/>
           <w:sz w:val="21"/>
         </w:rPr>
-        <w:t>540 of 696</w:t>
+        <w:t>768 building-days (46.1%)</w:t>
       </w:r>
       <w:r>
         <w:rPr>
@@ -3847,7 +4072,63 @@
           <w:color w:val="2A3730"/>
           <w:sz w:val="21"/>
         </w:rPr>
-        <w:t xml:space="preserve"> recorded days above the 5°C boundary, so it clearly requires calibration before farm reliance. The score represents operational concern, not a statistical probability of missing a goal.</w:t>
+        <w:t xml:space="preserve"> have sufficiently current environmental evidence.</w:t>
+      </w:r>
+    </w:p>
+    <w:p>
+      <w:pPr>
+        <w:pStyle w:val="ListBullet"/>
+      </w:pPr>
+      <w:r>
+        <w:rPr>
+          <w:rFonts w:ascii="Calibri" w:hAnsi="Calibri"/>
+          <w:color w:val="2A3730"/>
+          <w:sz w:val="21"/>
+        </w:rPr>
+        <w:t xml:space="preserve"> A stale value is never scored as safe. The dashboard shows the last environmental measurement day, its age, and why it was excluded.</w:t>
+      </w:r>
+    </w:p>
+    <w:p>
+      <w:pPr>
+        <w:pStyle w:val="ListBullet"/>
+      </w:pPr>
+      <w:r>
+        <w:rPr>
+          <w:rFonts w:ascii="Calibri" w:hAnsi="Calibri"/>
+          <w:color w:val="2A3730"/>
+          <w:sz w:val="21"/>
+        </w:rPr>
+        <w:t xml:space="preserve"> Example: on 2026-3 Day 22, the latest environment reading is from Day 17. At five days old it exceeds the two-day limit, so the dimension is </w:t>
+      </w:r>
+      <w:r>
+        <w:rPr>
+          <w:rFonts w:ascii="Calibri" w:hAnsi="Calibri"/>
+          <w:b/>
+          <w:color w:val="2A3730"/>
+          <w:sz w:val="21"/>
+        </w:rPr>
+        <w:t>Not scored</w:t>
+      </w:r>
+      <w:r>
+        <w:rPr>
+          <w:rFonts w:ascii="Calibri" w:hAnsi="Calibri"/>
+          <w:color w:val="2A3730"/>
+          <w:sz w:val="21"/>
+        </w:rPr>
+        <w:t>.</w:t>
+      </w:r>
+    </w:p>
+    <w:p>
+      <w:pPr>
+        <w:spacing w:before="0" w:after="120" w:line="288" w:lineRule="auto"/>
+      </w:pPr>
+      <w:r>
+        <w:rPr>
+          <w:rFonts w:ascii="Calibri" w:hAnsi="Calibri"/>
+          <w:color w:val="2A3730"/>
+          <w:sz w:val="21"/>
+        </w:rPr>
+        <w:t>Risk thresholds are provisional until Doc Raymond signs them off. The tropical operating bands have been supplied; the remaining validation question is how far outside a band should count as mild, moderate, or severe, and whether the Day 35 range should be carried forward. The score represents operational concern, not a statistical probability of missing a goal.</w:t>
       </w:r>
     </w:p>
     <w:p>
@@ -4445,7 +4726,7 @@
                 <w:color w:val="2A3730"/>
                 <w:sz w:val="18"/>
               </w:rPr>
-              <w:t>about 295 g</w:t>
+              <w:t>about 322 g</w:t>
             </w:r>
           </w:p>
         </w:tc>
@@ -4885,7 +5166,7 @@
                 <w:color w:val="2A3730"/>
                 <w:sz w:val="18"/>
               </w:rPr>
-              <w:t>about 203 g</w:t>
+              <w:t>about 206 g</w:t>
             </w:r>
           </w:p>
         </w:tc>
@@ -5154,7 +5435,7 @@
           <w:color w:val="2A3730"/>
           <w:sz w:val="21"/>
         </w:rPr>
-        <w:t xml:space="preserve"> and 26 misses. The model catches misses well but recognizes only about 20% of the small hit group. Do not oversell target-hit classification.</w:t>
+        <w:t xml:space="preserve"> and 26 misses. Across all four checkpoints, the model catches misses well but recognizes only about 15% of the small hit group; at Day 14 it recognizes about 20%. Do not oversell target-hit classification.</w:t>
       </w:r>
     </w:p>
     <w:p>
@@ -6333,6 +6614,70 @@
           <w:sz w:val="21"/>
         </w:rPr>
         <w:t>Compact Ridge was selected because it had the lowest overall MAE, remained close to the best cycle-balanced candidate, and avoided questionable identity and raw-inventory features.</w:t>
+      </w:r>
+    </w:p>
+    <w:p>
+      <w:pPr>
+        <w:spacing w:before="0" w:after="120" w:line="288" w:lineRule="auto"/>
+      </w:pPr>
+      <w:r>
+        <w:rPr>
+          <w:rFonts w:ascii="Calibri" w:hAnsi="Calibri"/>
+          <w:color w:val="2A3730"/>
+          <w:sz w:val="21"/>
+        </w:rPr>
+        <w:t xml:space="preserve">Random Forest had the best cycle-balanced MAE at about </w:t>
+      </w:r>
+      <w:r>
+        <w:rPr>
+          <w:rFonts w:ascii="Calibri" w:hAnsi="Calibri"/>
+          <w:b/>
+          <w:color w:val="2A3730"/>
+          <w:sz w:val="21"/>
+        </w:rPr>
+        <w:t>1.33 points</w:t>
+      </w:r>
+      <w:r>
+        <w:rPr>
+          <w:rFonts w:ascii="Calibri" w:hAnsi="Calibri"/>
+          <w:color w:val="2A3730"/>
+          <w:sz w:val="21"/>
+        </w:rPr>
+        <w:t xml:space="preserve">. Compact Ridge was about </w:t>
+      </w:r>
+      <w:r>
+        <w:rPr>
+          <w:rFonts w:ascii="Calibri" w:hAnsi="Calibri"/>
+          <w:b/>
+          <w:color w:val="2A3730"/>
+          <w:sz w:val="21"/>
+        </w:rPr>
+        <w:t>1.42 points</w:t>
+      </w:r>
+      <w:r>
+        <w:rPr>
+          <w:rFonts w:ascii="Calibri" w:hAnsi="Calibri"/>
+          <w:color w:val="2A3730"/>
+          <w:sz w:val="21"/>
+        </w:rPr>
+        <w:t xml:space="preserve">, which is within the predeclared 10% simplicity tolerance, and it had the best overall row-level MAE at about </w:t>
+      </w:r>
+      <w:r>
+        <w:rPr>
+          <w:rFonts w:ascii="Calibri" w:hAnsi="Calibri"/>
+          <w:b/>
+          <w:color w:val="2A3730"/>
+          <w:sz w:val="21"/>
+        </w:rPr>
+        <w:t>1.32 points</w:t>
+      </w:r>
+      <w:r>
+        <w:rPr>
+          <w:rFonts w:ascii="Calibri" w:hAnsi="Calibri"/>
+          <w:color w:val="2A3730"/>
+          <w:sz w:val="21"/>
+        </w:rPr>
+        <w:t>. Ridge was therefore selected for stability and interpretability on a small dataset—not because it won every metric.</w:t>
       </w:r>
     </w:p>
     <w:p>
@@ -7626,14 +7971,53 @@
     </w:p>
     <w:p>
       <w:pPr>
-        <w:pStyle w:val="Heading1"/>
-      </w:pPr>
-      <w:r>
-        <w:t>11. Environment and actionability</w:t>
+        <w:spacing w:before="0" w:after="120" w:line="288" w:lineRule="auto"/>
+      </w:pPr>
+      <w:r>
+        <w:rPr>
+          <w:rFonts w:ascii="Calibri" w:hAnsi="Calibri"/>
+          <w:b/>
+          <w:color w:val="2A3730"/>
+          <w:sz w:val="21"/>
+        </w:rPr>
+        <w:t>Provenance:</w:t>
+      </w:r>
+      <w:r>
+        <w:rPr>
+          <w:rFonts w:ascii="Calibri" w:hAnsi="Calibri"/>
+          <w:color w:val="2A3730"/>
+          <w:sz w:val="21"/>
+        </w:rPr>
+        <w:t xml:space="preserve"> DOC-002 through DOC-010 retain trigger and action concepts from Doc Raymond's Farmer Validation Workbook. The Canary team expanded them into clearer dashboard wording, inspection checklists, and escalation guidance. DOC-001 and DOC-011 are team-authored safety fallbacks. All wording remains marked </w:t>
+      </w:r>
+      <w:r>
+        <w:rPr>
+          <w:rFonts w:ascii="Calibri" w:hAnsi="Calibri"/>
+          <w:b/>
+          <w:color w:val="2A3730"/>
+          <w:sz w:val="21"/>
+        </w:rPr>
+        <w:t>Pending Review</w:t>
+      </w:r>
+      <w:r>
+        <w:rPr>
+          <w:rFonts w:ascii="Calibri" w:hAnsi="Calibri"/>
+          <w:color w:val="2A3730"/>
+          <w:sz w:val="21"/>
+        </w:rPr>
+        <w:t xml:space="preserve"> until Doc Raymond approves it and an approval date is recorded.</w:t>
       </w:r>
     </w:p>
     <w:p>
       <w:pPr>
+        <w:pStyle w:val="Heading1"/>
+      </w:pPr>
+      <w:r>
+        <w:t>11. Environment and actionability</w:t>
+      </w:r>
+    </w:p>
+    <w:p>
+      <w:pPr>
         <w:spacing w:before="0" w:after="120" w:line="288" w:lineRule="auto"/>
       </w:pPr>
       <w:r>
@@ -7642,7 +8026,7 @@
           <w:color w:val="2A3730"/>
           <w:sz w:val="21"/>
         </w:rPr>
-        <w:t>Temperature range and humidity now contribute through one combined environmental risk dimension. Specific operating alerts remain visible in the building investigation view.</w:t>
+        <w:t>Average-temperature deviation and humidity deviation now contribute through one combined environmental risk dimension. Specific operating alerts remain visible in the building investigation view.</w:t>
       </w:r>
     </w:p>
     <w:p>
@@ -7655,7 +8039,7 @@
           <w:color w:val="2A3730"/>
           <w:sz w:val="21"/>
         </w:rPr>
-        <w:t>Current absolute-temperature references remain provisional:</w:t>
+        <w:t>Current tropical temperature references are:</w:t>
       </w:r>
     </w:p>
     <w:p>
@@ -7668,7 +8052,7 @@
           <w:color w:val="2A3730"/>
           <w:sz w:val="21"/>
         </w:rPr>
-        <w:t xml:space="preserve"> Days 1–7: 29–33°C</w:t>
+        <w:t xml:space="preserve"> Days 1–6: 29–33°C</w:t>
       </w:r>
     </w:p>
     <w:p>
@@ -7681,7 +8065,7 @@
           <w:color w:val="2A3730"/>
           <w:sz w:val="21"/>
         </w:rPr>
-        <w:t xml:space="preserve"> Days 8–14: 25.5–29.5°C</w:t>
+        <w:t xml:space="preserve"> Days 7–13: 26–29°C</w:t>
       </w:r>
     </w:p>
     <w:p>
@@ -7694,12 +8078,12 @@
           <w:color w:val="2A3730"/>
           <w:sz w:val="21"/>
         </w:rPr>
-        <w:t xml:space="preserve"> Days 15–21: 26–28.5°C</w:t>
+        <w:t xml:space="preserve"> Days 14–20: 25–28°C</w:t>
       </w:r>
     </w:p>
     <w:p>
       <w:pPr>
-        <w:spacing w:before="0" w:after="120" w:line="288" w:lineRule="auto"/>
+        <w:pStyle w:val="ListBullet"/>
       </w:pPr>
       <w:r>
         <w:rPr>
@@ -7707,7 +8091,33 @@
           <w:color w:val="2A3730"/>
           <w:sz w:val="21"/>
         </w:rPr>
-        <w:t>No automatic absolute-temperature alert is issued after Day 21 until the farm approves a later-age range. The formal environmental score currently uses daily temperature range, not an unapproved absolute temperature target. Humidity and feed alerts are also provisional. Water and THI require reliable inputs and approved formulas.</w:t>
+        <w:t xml:space="preserve"> Days 21–27: 24–27°C</w:t>
+      </w:r>
+    </w:p>
+    <w:p>
+      <w:pPr>
+        <w:pStyle w:val="ListBullet"/>
+      </w:pPr>
+      <w:r>
+        <w:rPr>
+          <w:rFonts w:ascii="Calibri" w:hAnsi="Calibri"/>
+          <w:color w:val="2A3730"/>
+          <w:sz w:val="21"/>
+        </w:rPr>
+        <w:t xml:space="preserve"> Days 28–35: 24–26°C</w:t>
+      </w:r>
+    </w:p>
+    <w:p>
+      <w:pPr>
+        <w:spacing w:before="0" w:after="120" w:line="288" w:lineRule="auto"/>
+      </w:pPr>
+      <w:r>
+        <w:rPr>
+          <w:rFonts w:ascii="Calibri" w:hAnsi="Calibri"/>
+          <w:color w:val="2A3730"/>
+          <w:sz w:val="21"/>
+        </w:rPr>
+        <w:t>The Day 28–35 band is carried forward after Day 35 so monitoring does not stop; this carry-forward and the 1/2/3-point severity distances require farm approval. Humidity uses 60–70% on Days 1–7 and 50–65% from Day 8 onward. Feed alerts remain provisional. Water and THI require reliable inputs and approved formulas.</w:t>
       </w:r>
     </w:p>
     <w:p>
@@ -8516,7 +8926,7 @@
                 <w:color w:val="2A3730"/>
                 <w:sz w:val="18"/>
               </w:rPr>
-              <w:t>no sufficiently current environmental reading</w:t>
+              <w:t>last reading Day 17; five days old, above the two-day freshness limit</w:t>
             </w:r>
           </w:p>
         </w:tc>
@@ -9311,7 +9721,7 @@
         <w:pStyle w:val="Heading3"/>
       </w:pPr>
       <w:r>
-        <w:t>“Do temperature and humidity drive the forecast?”</w:t>
+        <w:t>“Why did you select Ridge when Random Forest had the best cycle-balanced recovery MAE?”</w:t>
       </w:r>
     </w:p>
     <w:p>
@@ -9324,7 +9734,28 @@
           <w:color w:val="2A3730"/>
           <w:sz w:val="21"/>
         </w:rPr>
-        <w:t>They are recovery-model inputs and operating checks. Temperature range and humidity also form one provisional environmental risk dimension. Sparse coverage prevents causal claims: use them to guide inspection, not to promise that one adjustment will change the outcome.</w:t>
+        <w:t>Random Forest's cycle-balanced MAE was about 1.33 points. Compact Ridge was about 1.42 points, within the predeclared 10% simplicity tolerance, while having the best overall MAE at about 1.32 points. On only 25 building outcomes, Ridge is easier to explain and less likely to overfit. We disclose both results instead of claiming Ridge won every metric.</w:t>
+      </w:r>
+    </w:p>
+    <w:p>
+      <w:pPr>
+        <w:pStyle w:val="Heading3"/>
+      </w:pPr>
+      <w:r>
+        <w:t>“Do temperature and humidity drive the forecast?”</w:t>
+      </w:r>
+    </w:p>
+    <w:p>
+      <w:pPr>
+        <w:spacing w:before="0" w:after="120" w:line="288" w:lineRule="auto"/>
+      </w:pPr>
+      <w:r>
+        <w:rPr>
+          <w:rFonts w:ascii="Calibri" w:hAnsi="Calibri"/>
+          <w:color w:val="2A3730"/>
+          <w:sz w:val="21"/>
+        </w:rPr>
+        <w:t>They are recovery-model inputs and operating checks. Average-temperature and humidity deviations also form one provisional environmental risk dimension. Sparse coverage prevents causal claims: use them to guide inspection, not to promise that one adjustment will change the outcome.</w:t>
       </w:r>
     </w:p>
     <w:p>
@@ -9648,11 +10079,6 @@
         </w:tc>
       </w:tr>
     </w:tbl>
-    <w:p>
-      <w:pPr>
-        <w:spacing w:after="40"/>
-      </w:pPr>
-    </w:p>
     <w:sectPr>
       <w:headerReference w:type="default" r:id="rId9"/>
       <w:footerReference w:type="default" r:id="rId10"/>

</xml_diff>

<commit_message>
docs: finalize and synchronize Canary defense study guide
docs: finalize and synchronize Canary defense study guide
</commit_message>
<xml_diff>
--- a/docs/Project_Canary_Defense_Cheat_Sheet.docx
+++ b/docs/Project_Canary_Defense_Cheat_Sheet.docx
@@ -101,6 +101,494 @@
         <w:pStyle w:val="Heading1"/>
       </w:pPr>
       <w:r>
+        <w:t>Memorize This — One-Page Defense Summary</w:t>
+      </w:r>
+    </w:p>
+    <w:p>
+      <w:pPr>
+        <w:pStyle w:val="Heading3"/>
+      </w:pPr>
+      <w:r>
+        <w:t>The 20-second answer</w:t>
+      </w:r>
+    </w:p>
+    <w:p>
+      <w:pPr>
+        <w:spacing w:before="0" w:after="120" w:line="288" w:lineRule="auto"/>
+      </w:pPr>
+      <w:r>
+        <w:rPr>
+          <w:rFonts w:ascii="Calibri" w:hAnsi="Calibri"/>
+          <w:b/>
+          <w:color w:val="2A3730"/>
+          <w:sz w:val="21"/>
+        </w:rPr>
+        <w:t>Project Canary is an early-warning and decision-support system for a broiler farm.</w:t>
+      </w:r>
+      <w:r>
+        <w:rPr>
+          <w:rFonts w:ascii="Calibri" w:hAnsi="Calibri"/>
+          <w:color w:val="2A3730"/>
+          <w:sz w:val="21"/>
+        </w:rPr>
+        <w:t xml:space="preserve"> It identifies which buildings need attention, explains the recorded warning signs, forecasts Day 35 average weight and final harvest recovery, and recommends what management should inspect next.</w:t>
+      </w:r>
+    </w:p>
+    <w:p>
+      <w:pPr>
+        <w:pStyle w:val="Heading3"/>
+      </w:pPr>
+      <w:r>
+        <w:t>The two targets</w:t>
+      </w:r>
+    </w:p>
+    <w:p>
+      <w:pPr>
+        <w:pStyle w:val="ListBullet"/>
+      </w:pPr>
+      <w:r>
+        <w:rPr>
+          <w:rFonts w:ascii="Calibri" w:hAnsi="Calibri"/>
+          <w:color w:val="2A3730"/>
+          <w:sz w:val="21"/>
+        </w:rPr>
+        <w:t xml:space="preserve"> </w:t>
+      </w:r>
+      <w:r>
+        <w:rPr>
+          <w:rFonts w:ascii="Calibri" w:hAnsi="Calibri"/>
+          <w:b/>
+          <w:color w:val="2A3730"/>
+          <w:sz w:val="21"/>
+        </w:rPr>
+        <w:t>1,800 g average weight on Day 35</w:t>
+      </w:r>
+    </w:p>
+    <w:p>
+      <w:pPr>
+        <w:pStyle w:val="ListBullet"/>
+      </w:pPr>
+      <w:r>
+        <w:rPr>
+          <w:rFonts w:ascii="Calibri" w:hAnsi="Calibri"/>
+          <w:color w:val="2A3730"/>
+          <w:sz w:val="21"/>
+        </w:rPr>
+        <w:t xml:space="preserve"> </w:t>
+      </w:r>
+      <w:r>
+        <w:rPr>
+          <w:rFonts w:ascii="Calibri" w:hAnsi="Calibri"/>
+          <w:b/>
+          <w:color w:val="2A3730"/>
+          <w:sz w:val="21"/>
+        </w:rPr>
+        <w:t>95% harvest recovery</w:t>
+      </w:r>
+      <w:r>
+        <w:rPr>
+          <w:rFonts w:ascii="Calibri" w:hAnsi="Calibri"/>
+          <w:color w:val="2A3730"/>
+          <w:sz w:val="21"/>
+        </w:rPr>
+        <w:t>, defined for this capstone as ending or surviving birds divided by beginning population</w:t>
+      </w:r>
+    </w:p>
+    <w:p>
+      <w:pPr>
+        <w:pStyle w:val="Heading3"/>
+      </w:pPr>
+      <w:r>
+        <w:t>The three engines</w:t>
+      </w:r>
+    </w:p>
+    <w:p>
+      <w:pPr>
+        <w:pStyle w:val="ListBullet"/>
+      </w:pPr>
+      <w:r>
+        <w:rPr>
+          <w:rFonts w:ascii="Calibri" w:hAnsi="Calibri"/>
+          <w:color w:val="2A3730"/>
+          <w:sz w:val="21"/>
+        </w:rPr>
+        <w:t xml:space="preserve"> </w:t>
+      </w:r>
+      <w:r>
+        <w:rPr>
+          <w:rFonts w:ascii="Calibri" w:hAnsi="Calibri"/>
+          <w:b/>
+          <w:color w:val="2A3730"/>
+          <w:sz w:val="21"/>
+        </w:rPr>
+        <w:t>Risk score:</w:t>
+      </w:r>
+      <w:r>
+        <w:rPr>
+          <w:rFonts w:ascii="Calibri" w:hAnsi="Calibri"/>
+          <w:color w:val="2A3730"/>
+          <w:sz w:val="21"/>
+        </w:rPr>
+        <w:t xml:space="preserve"> four transparent rules—weight gap, population loss, daily mortality, and environmental conditions—produce a 0–12 operational-priority score and a Low/Medium/High/Critical label.</w:t>
+      </w:r>
+    </w:p>
+    <w:p>
+      <w:pPr>
+        <w:pStyle w:val="ListBullet"/>
+      </w:pPr>
+      <w:r>
+        <w:rPr>
+          <w:rFonts w:ascii="Calibri" w:hAnsi="Calibri"/>
+          <w:color w:val="2A3730"/>
+          <w:sz w:val="21"/>
+        </w:rPr>
+        <w:t xml:space="preserve"> </w:t>
+      </w:r>
+      <w:r>
+        <w:rPr>
+          <w:rFonts w:ascii="Calibri" w:hAnsi="Calibri"/>
+          <w:b/>
+          <w:color w:val="2A3730"/>
+          <w:sz w:val="21"/>
+        </w:rPr>
+        <w:t>Predictive models:</w:t>
+      </w:r>
+      <w:r>
+        <w:rPr>
+          <w:rFonts w:ascii="Calibri" w:hAnsi="Calibri"/>
+          <w:color w:val="2A3730"/>
+          <w:sz w:val="21"/>
+        </w:rPr>
+        <w:t xml:space="preserve"> Compact Ridge models separately estimate Day 35 weight and final recovery using only evidence available by the selected review date.</w:t>
+      </w:r>
+    </w:p>
+    <w:p>
+      <w:pPr>
+        <w:pStyle w:val="ListBullet"/>
+      </w:pPr>
+      <w:r>
+        <w:rPr>
+          <w:rFonts w:ascii="Calibri" w:hAnsi="Calibri"/>
+          <w:color w:val="2A3730"/>
+          <w:sz w:val="21"/>
+        </w:rPr>
+        <w:t xml:space="preserve"> </w:t>
+      </w:r>
+      <w:r>
+        <w:rPr>
+          <w:rFonts w:ascii="Calibri" w:hAnsi="Calibri"/>
+          <w:b/>
+          <w:color w:val="2A3730"/>
+          <w:sz w:val="21"/>
+        </w:rPr>
+        <w:t>Recommendations:</w:t>
+      </w:r>
+      <w:r>
+        <w:rPr>
+          <w:rFonts w:ascii="Calibri" w:hAnsi="Calibri"/>
+          <w:color w:val="2A3730"/>
+          <w:sz w:val="21"/>
+        </w:rPr>
+        <w:t xml:space="preserve"> a deterministic playbook maps the strongest recorded trigger to a farm-informed inspection, urgency, and escalation rule.</w:t>
+      </w:r>
+    </w:p>
+    <w:p>
+      <w:pPr>
+        <w:pStyle w:val="Heading3"/>
+      </w:pPr>
+      <w:r>
+        <w:t>Numbers to remember</w:t>
+      </w:r>
+    </w:p>
+    <w:p>
+      <w:pPr>
+        <w:pStyle w:val="ListBullet"/>
+      </w:pPr>
+      <w:r>
+        <w:rPr>
+          <w:rFonts w:ascii="Calibri" w:hAnsi="Calibri"/>
+          <w:color w:val="2A3730"/>
+          <w:sz w:val="21"/>
+        </w:rPr>
+        <w:t xml:space="preserve"> Clean data: </w:t>
+      </w:r>
+      <w:r>
+        <w:rPr>
+          <w:rFonts w:ascii="Calibri" w:hAnsi="Calibri"/>
+          <w:b/>
+          <w:color w:val="2A3730"/>
+          <w:sz w:val="21"/>
+        </w:rPr>
+        <w:t>1,785 source rows → 1,666 unique building-days</w:t>
+      </w:r>
+    </w:p>
+    <w:p>
+      <w:pPr>
+        <w:pStyle w:val="ListBullet"/>
+      </w:pPr>
+      <w:r>
+        <w:rPr>
+          <w:rFonts w:ascii="Calibri" w:hAnsi="Calibri"/>
+          <w:color w:val="2A3730"/>
+          <w:sz w:val="21"/>
+        </w:rPr>
+        <w:t xml:space="preserve"> Weight model: </w:t>
+      </w:r>
+      <w:r>
+        <w:rPr>
+          <w:rFonts w:ascii="Calibri" w:hAnsi="Calibri"/>
+          <w:b/>
+          <w:color w:val="2A3730"/>
+          <w:sz w:val="21"/>
+        </w:rPr>
+        <w:t>31 outcomes, 124 snapshots, about 172 g MAE; Day 14 MAE about 167 g</w:t>
+      </w:r>
+    </w:p>
+    <w:p>
+      <w:pPr>
+        <w:pStyle w:val="ListBullet"/>
+      </w:pPr>
+      <w:r>
+        <w:rPr>
+          <w:rFonts w:ascii="Calibri" w:hAnsi="Calibri"/>
+          <w:color w:val="2A3730"/>
+          <w:sz w:val="21"/>
+        </w:rPr>
+        <w:t xml:space="preserve"> Recovery model: </w:t>
+      </w:r>
+      <w:r>
+        <w:rPr>
+          <w:rFonts w:ascii="Calibri" w:hAnsi="Calibri"/>
+          <w:b/>
+          <w:color w:val="2A3730"/>
+          <w:sz w:val="21"/>
+        </w:rPr>
+        <w:t>25 outcomes, 122 snapshots, about 1.32 percentage-point MAE; Day 14 MAE about 1.43 points</w:t>
+      </w:r>
+    </w:p>
+    <w:p>
+      <w:pPr>
+        <w:pStyle w:val="ListBullet"/>
+      </w:pPr>
+      <w:r>
+        <w:rPr>
+          <w:rFonts w:ascii="Calibri" w:hAnsi="Calibri"/>
+          <w:color w:val="2A3730"/>
+          <w:sz w:val="21"/>
+        </w:rPr>
+        <w:t xml:space="preserve"> Validation: </w:t>
+      </w:r>
+      <w:r>
+        <w:rPr>
+          <w:rFonts w:ascii="Calibri" w:hAnsi="Calibri"/>
+          <w:b/>
+          <w:color w:val="2A3730"/>
+          <w:sz w:val="21"/>
+        </w:rPr>
+        <w:t>leave one complete harvest cycle out</w:t>
+      </w:r>
+      <w:r>
+        <w:rPr>
+          <w:rFonts w:ascii="Calibri" w:hAnsi="Calibri"/>
+          <w:color w:val="2A3730"/>
+          <w:sz w:val="21"/>
+        </w:rPr>
+        <w:t>, train on the others, and repeat—never split related daily rows randomly</w:t>
+      </w:r>
+    </w:p>
+    <w:p>
+      <w:pPr>
+        <w:pStyle w:val="Heading3"/>
+      </w:pPr>
+      <w:r>
+        <w:t>What to say carefully</w:t>
+      </w:r>
+    </w:p>
+    <w:p>
+      <w:pPr>
+        <w:pStyle w:val="ListBullet"/>
+      </w:pPr>
+      <w:r>
+        <w:rPr>
+          <w:rFonts w:ascii="Calibri" w:hAnsi="Calibri"/>
+          <w:color w:val="2A3730"/>
+          <w:sz w:val="21"/>
+        </w:rPr>
+        <w:t xml:space="preserve"> The </w:t>
+      </w:r>
+      <w:r>
+        <w:rPr>
+          <w:rFonts w:ascii="Calibri" w:hAnsi="Calibri"/>
+          <w:b/>
+          <w:color w:val="2A3730"/>
+          <w:sz w:val="21"/>
+        </w:rPr>
+        <w:t>risk score is operational concern, not a probability</w:t>
+      </w:r>
+      <w:r>
+        <w:rPr>
+          <w:rFonts w:ascii="Calibri" w:hAnsi="Calibri"/>
+          <w:color w:val="2A3730"/>
+          <w:sz w:val="21"/>
+        </w:rPr>
+        <w:t xml:space="preserve"> of missing a target.</w:t>
+      </w:r>
+    </w:p>
+    <w:p>
+      <w:pPr>
+        <w:pStyle w:val="ListBullet"/>
+      </w:pPr>
+      <w:r>
+        <w:rPr>
+          <w:rFonts w:ascii="Calibri" w:hAnsi="Calibri"/>
+          <w:color w:val="2A3730"/>
+          <w:sz w:val="21"/>
+        </w:rPr>
+        <w:t xml:space="preserve"> Forecasts are </w:t>
+      </w:r>
+      <w:r>
+        <w:rPr>
+          <w:rFonts w:ascii="Calibri" w:hAnsi="Calibri"/>
+          <w:b/>
+          <w:color w:val="2A3730"/>
+          <w:sz w:val="21"/>
+        </w:rPr>
+        <w:t>limited-data estimates, not guarantees</w:t>
+      </w:r>
+      <w:r>
+        <w:rPr>
+          <w:rFonts w:ascii="Calibri" w:hAnsi="Calibri"/>
+          <w:color w:val="2A3730"/>
+          <w:sz w:val="21"/>
+        </w:rPr>
+        <w:t>.</w:t>
+      </w:r>
+    </w:p>
+    <w:p>
+      <w:pPr>
+        <w:pStyle w:val="ListBullet"/>
+      </w:pPr>
+      <w:r>
+        <w:rPr>
+          <w:rFonts w:ascii="Calibri" w:hAnsi="Calibri"/>
+          <w:color w:val="2A3730"/>
+          <w:sz w:val="21"/>
+        </w:rPr>
+        <w:t xml:space="preserve"> Recovery is trained on a </w:t>
+      </w:r>
+      <w:r>
+        <w:rPr>
+          <w:rFonts w:ascii="Calibri" w:hAnsi="Calibri"/>
+          <w:b/>
+          <w:color w:val="2A3730"/>
+          <w:sz w:val="21"/>
+        </w:rPr>
+        <w:t>last-recorded population proxy</w:t>
+      </w:r>
+      <w:r>
+        <w:rPr>
+          <w:rFonts w:ascii="Calibri" w:hAnsi="Calibri"/>
+          <w:color w:val="2A3730"/>
+          <w:sz w:val="21"/>
+        </w:rPr>
+        <w:t>, not a verified harvest-event count.</w:t>
+      </w:r>
+    </w:p>
+    <w:p>
+      <w:pPr>
+        <w:pStyle w:val="ListBullet"/>
+      </w:pPr>
+      <w:r>
+        <w:rPr>
+          <w:rFonts w:ascii="Calibri" w:hAnsi="Calibri"/>
+          <w:color w:val="2A3730"/>
+          <w:sz w:val="21"/>
+        </w:rPr>
+        <w:t xml:space="preserve"> Feature importance shows </w:t>
+      </w:r>
+      <w:r>
+        <w:rPr>
+          <w:rFonts w:ascii="Calibri" w:hAnsi="Calibri"/>
+          <w:b/>
+          <w:color w:val="2A3730"/>
+          <w:sz w:val="21"/>
+        </w:rPr>
+        <w:t>model association, not causation</w:t>
+      </w:r>
+      <w:r>
+        <w:rPr>
+          <w:rFonts w:ascii="Calibri" w:hAnsi="Calibri"/>
+          <w:color w:val="2A3730"/>
+          <w:sz w:val="21"/>
+        </w:rPr>
+        <w:t>.</w:t>
+      </w:r>
+    </w:p>
+    <w:p>
+      <w:pPr>
+        <w:pStyle w:val="ListBullet"/>
+      </w:pPr>
+      <w:r>
+        <w:rPr>
+          <w:rFonts w:ascii="Calibri" w:hAnsi="Calibri"/>
+          <w:color w:val="2A3730"/>
+          <w:sz w:val="21"/>
+        </w:rPr>
+        <w:t xml:space="preserve"> Recommendations are </w:t>
+      </w:r>
+      <w:r>
+        <w:rPr>
+          <w:rFonts w:ascii="Calibri" w:hAnsi="Calibri"/>
+          <w:b/>
+          <w:color w:val="2A3730"/>
+          <w:sz w:val="21"/>
+        </w:rPr>
+        <w:t>inspection guidance, not disease diagnosis or automatic treatment</w:t>
+      </w:r>
+      <w:r>
+        <w:rPr>
+          <w:rFonts w:ascii="Calibri" w:hAnsi="Calibri"/>
+          <w:color w:val="2A3730"/>
+          <w:sz w:val="21"/>
+        </w:rPr>
+        <w:t>.</w:t>
+      </w:r>
+    </w:p>
+    <w:p>
+      <w:pPr>
+        <w:pStyle w:val="ListBullet"/>
+      </w:pPr>
+      <w:r>
+        <w:rPr>
+          <w:rFonts w:ascii="Calibri" w:hAnsi="Calibri"/>
+          <w:color w:val="2A3730"/>
+          <w:sz w:val="21"/>
+        </w:rPr>
+        <w:t xml:space="preserve"> The recovery model is useful as a continuous estimate, but it is </w:t>
+      </w:r>
+      <w:r>
+        <w:rPr>
+          <w:rFonts w:ascii="Calibri" w:hAnsi="Calibri"/>
+          <w:b/>
+          <w:color w:val="2A3730"/>
+          <w:sz w:val="21"/>
+        </w:rPr>
+        <w:t>not proven as a 95% hit-versus-miss classifier</w:t>
+      </w:r>
+      <w:r>
+        <w:rPr>
+          <w:rFonts w:ascii="Calibri" w:hAnsi="Calibri"/>
+          <w:color w:val="2A3730"/>
+          <w:sz w:val="21"/>
+        </w:rPr>
+        <w:t>.</w:t>
+      </w:r>
+    </w:p>
+    <w:p>
+      <w:pPr>
+        <w:pStyle w:val="Heading1"/>
+      </w:pPr>
+      <w:r>
         <w:t>New transparent evidence package</w:t>
       </w:r>
     </w:p>
@@ -313,7 +801,7 @@
         <w:pStyle w:val="Heading1"/>
       </w:pPr>
       <w:r>
-        <w:t>1. The 20-second answer</w:t>
+        <w:t>1. Project overview and scope</w:t>
       </w:r>
     </w:p>
     <w:p>
@@ -893,6 +1381,566 @@
           <w:sz w:val="21"/>
         </w:rPr>
         <w:t xml:space="preserve"> the risk score and predictions are separate. A forecast does not add points to the risk score.</w:t>
+      </w:r>
+    </w:p>
+    <w:p>
+      <w:pPr>
+        <w:pStyle w:val="Heading1"/>
+      </w:pPr>
+      <w:r>
+        <w:t>3A. Explain Every Engine in Five Steps</w:t>
+      </w:r>
+    </w:p>
+    <w:p>
+      <w:pPr>
+        <w:pStyle w:val="Heading3"/>
+      </w:pPr>
+      <w:r>
+        <w:t>Engine 1 — Rules-based risk scoring</w:t>
+      </w:r>
+    </w:p>
+    <w:p>
+      <w:pPr>
+        <w:numPr>
+          <w:ilvl w:val="0"/>
+          <w:numId w:val="10"/>
+        </w:numPr>
+        <w:spacing w:before="0" w:after="60" w:line="283" w:lineRule="auto"/>
+      </w:pPr>
+      <w:r>
+        <w:rPr>
+          <w:rFonts w:ascii="Calibri" w:hAnsi="Calibri"/>
+          <w:b/>
+          <w:color w:val="2A3730"/>
+          <w:sz w:val="21"/>
+        </w:rPr>
+        <w:t>Question:</w:t>
+      </w:r>
+      <w:r>
+        <w:rPr>
+          <w:rFonts w:ascii="Calibri" w:hAnsi="Calibri"/>
+          <w:color w:val="2A3730"/>
+          <w:sz w:val="21"/>
+        </w:rPr>
+        <w:t xml:space="preserve"> Which building needs management attention first, and which recorded conditions explain the concern?</w:t>
+      </w:r>
+    </w:p>
+    <w:p>
+      <w:pPr>
+        <w:numPr>
+          <w:ilvl w:val="0"/>
+          <w:numId w:val="10"/>
+        </w:numPr>
+        <w:spacing w:before="0" w:after="60" w:line="283" w:lineRule="auto"/>
+      </w:pPr>
+      <w:r>
+        <w:rPr>
+          <w:rFonts w:ascii="Calibri" w:hAnsi="Calibri"/>
+          <w:b/>
+          <w:color w:val="2A3730"/>
+          <w:sz w:val="21"/>
+        </w:rPr>
+        <w:t>Inputs:</w:t>
+      </w:r>
+      <w:r>
+        <w:rPr>
+          <w:rFonts w:ascii="Calibri" w:hAnsi="Calibri"/>
+          <w:color w:val="2A3730"/>
+          <w:sz w:val="21"/>
+        </w:rPr>
+        <w:t xml:space="preserve"> Latest weight versus its age target, cumulative population loss, latest daily mortality, and sufficiently fresh temperature/humidity evidence.</w:t>
+      </w:r>
+    </w:p>
+    <w:p>
+      <w:pPr>
+        <w:numPr>
+          <w:ilvl w:val="0"/>
+          <w:numId w:val="10"/>
+        </w:numPr>
+        <w:spacing w:before="0" w:after="60" w:line="283" w:lineRule="auto"/>
+      </w:pPr>
+      <w:r>
+        <w:rPr>
+          <w:rFonts w:ascii="Calibri" w:hAnsi="Calibri"/>
+          <w:b/>
+          <w:color w:val="2A3730"/>
+          <w:sz w:val="21"/>
+        </w:rPr>
+        <w:t>Process:</w:t>
+      </w:r>
+      <w:r>
+        <w:rPr>
+          <w:rFonts w:ascii="Calibri" w:hAnsi="Calibri"/>
+          <w:color w:val="2A3730"/>
+          <w:sz w:val="21"/>
+        </w:rPr>
+        <w:t xml:space="preserve"> Score each available dimension from 0 to 3, add the points, map the total to Low/Medium/High/Critical, and expose every measurement, threshold, and point contribution.</w:t>
+      </w:r>
+    </w:p>
+    <w:p>
+      <w:pPr>
+        <w:numPr>
+          <w:ilvl w:val="0"/>
+          <w:numId w:val="10"/>
+        </w:numPr>
+        <w:spacing w:before="0" w:after="60" w:line="283" w:lineRule="auto"/>
+      </w:pPr>
+      <w:r>
+        <w:rPr>
+          <w:rFonts w:ascii="Calibri" w:hAnsi="Calibri"/>
+          <w:b/>
+          <w:color w:val="2A3730"/>
+          <w:sz w:val="21"/>
+        </w:rPr>
+        <w:t>Output:</w:t>
+      </w:r>
+      <w:r>
+        <w:rPr>
+          <w:rFonts w:ascii="Calibri" w:hAnsi="Calibri"/>
+          <w:color w:val="2A3730"/>
+          <w:sz w:val="21"/>
+        </w:rPr>
+        <w:t xml:space="preserve"> A 0–12 risk score, priority label, leading trigger, and deterministic “why.”</w:t>
+      </w:r>
+    </w:p>
+    <w:p>
+      <w:pPr>
+        <w:numPr>
+          <w:ilvl w:val="0"/>
+          <w:numId w:val="10"/>
+        </w:numPr>
+        <w:spacing w:before="0" w:after="60" w:line="283" w:lineRule="auto"/>
+      </w:pPr>
+      <w:r>
+        <w:rPr>
+          <w:rFonts w:ascii="Calibri" w:hAnsi="Calibri"/>
+          <w:b/>
+          <w:color w:val="2A3730"/>
+          <w:sz w:val="21"/>
+        </w:rPr>
+        <w:t>Limitation:</w:t>
+      </w:r>
+      <w:r>
+        <w:rPr>
+          <w:rFonts w:ascii="Calibri" w:hAnsi="Calibri"/>
+          <w:color w:val="2A3730"/>
+          <w:sz w:val="21"/>
+        </w:rPr>
+        <w:t xml:space="preserve"> It is an expert-rule priority score—not a trained probability. Missing evidence can leave the total incomplete, and provisional thresholds still require farm approval.</w:t>
+      </w:r>
+    </w:p>
+    <w:p>
+      <w:pPr>
+        <w:pStyle w:val="Heading3"/>
+      </w:pPr>
+      <w:r>
+        <w:t>Engine 2A — Day 35 weight forecasting</w:t>
+      </w:r>
+    </w:p>
+    <w:p>
+      <w:pPr>
+        <w:numPr>
+          <w:ilvl w:val="0"/>
+          <w:numId w:val="11"/>
+        </w:numPr>
+        <w:spacing w:before="0" w:after="60" w:line="283" w:lineRule="auto"/>
+      </w:pPr>
+      <w:r>
+        <w:rPr>
+          <w:rFonts w:ascii="Calibri" w:hAnsi="Calibri"/>
+          <w:b/>
+          <w:color w:val="2A3730"/>
+          <w:sz w:val="21"/>
+        </w:rPr>
+        <w:t>Question:</w:t>
+      </w:r>
+      <w:r>
+        <w:rPr>
+          <w:rFonts w:ascii="Calibri" w:hAnsi="Calibri"/>
+          <w:color w:val="2A3730"/>
+          <w:sz w:val="21"/>
+        </w:rPr>
+        <w:t xml:space="preserve"> Using only bodyweight information known today, what average building weight should we expect on Day 35?</w:t>
+      </w:r>
+    </w:p>
+    <w:p>
+      <w:pPr>
+        <w:numPr>
+          <w:ilvl w:val="0"/>
+          <w:numId w:val="11"/>
+        </w:numPr>
+        <w:spacing w:before="0" w:after="60" w:line="283" w:lineRule="auto"/>
+      </w:pPr>
+      <w:r>
+        <w:rPr>
+          <w:rFonts w:ascii="Calibri" w:hAnsi="Calibri"/>
+          <w:b/>
+          <w:color w:val="2A3730"/>
+          <w:sz w:val="21"/>
+        </w:rPr>
+        <w:t>Inputs:</w:t>
+      </w:r>
+      <w:r>
+        <w:rPr>
+          <w:rFonts w:ascii="Calibri" w:hAnsi="Calibri"/>
+          <w:color w:val="2A3730"/>
+          <w:sz w:val="21"/>
+        </w:rPr>
+        <w:t xml:space="preserve"> Available Day 7/14/21/28 weights, current measurement day and weight, progress versus the age target, recent gain, cumulative gain, and availability indicators.</w:t>
+      </w:r>
+    </w:p>
+    <w:p>
+      <w:pPr>
+        <w:numPr>
+          <w:ilvl w:val="0"/>
+          <w:numId w:val="11"/>
+        </w:numPr>
+        <w:spacing w:before="0" w:after="60" w:line="283" w:lineRule="auto"/>
+      </w:pPr>
+      <w:r>
+        <w:rPr>
+          <w:rFonts w:ascii="Calibri" w:hAnsi="Calibri"/>
+          <w:b/>
+          <w:color w:val="2A3730"/>
+          <w:sz w:val="21"/>
+        </w:rPr>
+        <w:t>Process:</w:t>
+      </w:r>
+      <w:r>
+        <w:rPr>
+          <w:rFonts w:ascii="Calibri" w:hAnsi="Calibri"/>
+          <w:color w:val="2A3730"/>
+          <w:sz w:val="21"/>
+        </w:rPr>
+        <w:t xml:space="preserve"> Create leakage-safe checkpoint snapshots, impute missing numeric values within each training fold, standardize the Ridge inputs, leave one complete cycle out at a time, and compare Ridge with tree models and transparent baselines.</w:t>
+      </w:r>
+    </w:p>
+    <w:p>
+      <w:pPr>
+        <w:numPr>
+          <w:ilvl w:val="0"/>
+          <w:numId w:val="11"/>
+        </w:numPr>
+        <w:spacing w:before="0" w:after="60" w:line="283" w:lineRule="auto"/>
+      </w:pPr>
+      <w:r>
+        <w:rPr>
+          <w:rFonts w:ascii="Calibri" w:hAnsi="Calibri"/>
+          <w:b/>
+          <w:color w:val="2A3730"/>
+          <w:sz w:val="21"/>
+        </w:rPr>
+        <w:t>Output:</w:t>
+      </w:r>
+      <w:r>
+        <w:rPr>
+          <w:rFonts w:ascii="Calibri" w:hAnsi="Calibri"/>
+          <w:color w:val="2A3730"/>
+          <w:sz w:val="21"/>
+        </w:rPr>
+        <w:t xml:space="preserve"> Projected Day 35 weight, gap to 1,800 g, uncertainty range, model version, and explanatory feature reliance.</w:t>
+      </w:r>
+    </w:p>
+    <w:p>
+      <w:pPr>
+        <w:numPr>
+          <w:ilvl w:val="0"/>
+          <w:numId w:val="11"/>
+        </w:numPr>
+        <w:spacing w:before="0" w:after="60" w:line="283" w:lineRule="auto"/>
+      </w:pPr>
+      <w:r>
+        <w:rPr>
+          <w:rFonts w:ascii="Calibri" w:hAnsi="Calibri"/>
+          <w:b/>
+          <w:color w:val="2A3730"/>
+          <w:sz w:val="21"/>
+        </w:rPr>
+        <w:t>Limitation:</w:t>
+      </w:r>
+      <w:r>
+        <w:rPr>
+          <w:rFonts w:ascii="Calibri" w:hAnsi="Calibri"/>
+          <w:color w:val="2A3730"/>
+          <w:sz w:val="21"/>
+        </w:rPr>
+        <w:t xml:space="preserve"> Only 31 independent outcomes and five historical target hits exist. The estimate is useful for planning, but target-hit classification and unusual future conditions remain uncertain.</w:t>
+      </w:r>
+    </w:p>
+    <w:p>
+      <w:pPr>
+        <w:pStyle w:val="Heading3"/>
+      </w:pPr>
+      <w:r>
+        <w:t>Engine 2B — Harvest-recovery forecasting</w:t>
+      </w:r>
+    </w:p>
+    <w:p>
+      <w:pPr>
+        <w:numPr>
+          <w:ilvl w:val="0"/>
+          <w:numId w:val="12"/>
+        </w:numPr>
+        <w:spacing w:before="0" w:after="60" w:line="283" w:lineRule="auto"/>
+      </w:pPr>
+      <w:r>
+        <w:rPr>
+          <w:rFonts w:ascii="Calibri" w:hAnsi="Calibri"/>
+          <w:b/>
+          <w:color w:val="2A3730"/>
+          <w:sz w:val="21"/>
+        </w:rPr>
+        <w:t>Question:</w:t>
+      </w:r>
+      <w:r>
+        <w:rPr>
+          <w:rFonts w:ascii="Calibri" w:hAnsi="Calibri"/>
+          <w:color w:val="2A3730"/>
+          <w:sz w:val="21"/>
+        </w:rPr>
+        <w:t xml:space="preserve"> Using only daily flock evidence known today, what final recovery should we expect?</w:t>
+      </w:r>
+    </w:p>
+    <w:p>
+      <w:pPr>
+        <w:numPr>
+          <w:ilvl w:val="0"/>
+          <w:numId w:val="12"/>
+        </w:numPr>
+        <w:spacing w:before="0" w:after="60" w:line="283" w:lineRule="auto"/>
+      </w:pPr>
+      <w:r>
+        <w:rPr>
+          <w:rFonts w:ascii="Calibri" w:hAnsi="Calibri"/>
+          <w:b/>
+          <w:color w:val="2A3730"/>
+          <w:sz w:val="21"/>
+        </w:rPr>
+        <w:t>Inputs:</w:t>
+      </w:r>
+      <w:r>
+        <w:rPr>
+          <w:rFonts w:ascii="Calibri" w:hAnsi="Calibri"/>
+          <w:color w:val="2A3730"/>
+          <w:sz w:val="21"/>
+        </w:rPr>
+        <w:t xml:space="preserve"> Cycle day, current percentage alive, daily and recent mortality, mortality trend, feed measures, recent temperature/humidity, and missing-data indicators.</w:t>
+      </w:r>
+    </w:p>
+    <w:p>
+      <w:pPr>
+        <w:numPr>
+          <w:ilvl w:val="0"/>
+          <w:numId w:val="12"/>
+        </w:numPr>
+        <w:spacing w:before="0" w:after="60" w:line="283" w:lineRule="auto"/>
+      </w:pPr>
+      <w:r>
+        <w:rPr>
+          <w:rFonts w:ascii="Calibri" w:hAnsi="Calibri"/>
+          <w:b/>
+          <w:color w:val="2A3730"/>
+          <w:sz w:val="21"/>
+        </w:rPr>
+        <w:t>Process:</w:t>
+      </w:r>
+      <w:r>
+        <w:rPr>
+          <w:rFonts w:ascii="Calibri" w:hAnsi="Calibri"/>
+          <w:color w:val="2A3730"/>
+          <w:sz w:val="21"/>
+        </w:rPr>
+        <w:t xml:space="preserve"> Build balanced as-of snapshots, median-impute within each training fold, standardize Ridge inputs, leave one complete cycle out at a time, and compare compact/full Ridge variants, Random Forest, and simple baselines.</w:t>
+      </w:r>
+    </w:p>
+    <w:p>
+      <w:pPr>
+        <w:numPr>
+          <w:ilvl w:val="0"/>
+          <w:numId w:val="12"/>
+        </w:numPr>
+        <w:spacing w:before="0" w:after="60" w:line="283" w:lineRule="auto"/>
+      </w:pPr>
+      <w:r>
+        <w:rPr>
+          <w:rFonts w:ascii="Calibri" w:hAnsi="Calibri"/>
+          <w:b/>
+          <w:color w:val="2A3730"/>
+          <w:sz w:val="21"/>
+        </w:rPr>
+        <w:t>Output:</w:t>
+      </w:r>
+      <w:r>
+        <w:rPr>
+          <w:rFonts w:ascii="Calibri" w:hAnsi="Calibri"/>
+          <w:color w:val="2A3730"/>
+          <w:sz w:val="21"/>
+        </w:rPr>
+        <w:t xml:space="preserve"> Projected final recovery, gap to 95%, uncertainty range, model version, and explanatory feature reliance.</w:t>
+      </w:r>
+    </w:p>
+    <w:p>
+      <w:pPr>
+        <w:numPr>
+          <w:ilvl w:val="0"/>
+          <w:numId w:val="12"/>
+        </w:numPr>
+        <w:spacing w:before="0" w:after="60" w:line="283" w:lineRule="auto"/>
+      </w:pPr>
+      <w:r>
+        <w:rPr>
+          <w:rFonts w:ascii="Calibri" w:hAnsi="Calibri"/>
+          <w:b/>
+          <w:color w:val="2A3730"/>
+          <w:sz w:val="21"/>
+        </w:rPr>
+        <w:t>Limitation:</w:t>
+      </w:r>
+      <w:r>
+        <w:rPr>
+          <w:rFonts w:ascii="Calibri" w:hAnsi="Calibri"/>
+          <w:color w:val="2A3730"/>
+          <w:sz w:val="21"/>
+        </w:rPr>
+        <w:t xml:space="preserve"> The Y label is a last-recorded population proxy from only 25 outcomes. The model estimates the continuous rate, but it did not beat the majority baseline for identifying which flocks will reach 95%.</w:t>
+      </w:r>
+    </w:p>
+    <w:p>
+      <w:pPr>
+        <w:pStyle w:val="Heading3"/>
+      </w:pPr>
+      <w:r>
+        <w:t>Engine 3 — Recommendation playbook</w:t>
+      </w:r>
+    </w:p>
+    <w:p>
+      <w:pPr>
+        <w:numPr>
+          <w:ilvl w:val="0"/>
+          <w:numId w:val="13"/>
+        </w:numPr>
+        <w:spacing w:before="0" w:after="60" w:line="283" w:lineRule="auto"/>
+      </w:pPr>
+      <w:r>
+        <w:rPr>
+          <w:rFonts w:ascii="Calibri" w:hAnsi="Calibri"/>
+          <w:b/>
+          <w:color w:val="2A3730"/>
+          <w:sz w:val="21"/>
+        </w:rPr>
+        <w:t>Question:</w:t>
+      </w:r>
+      <w:r>
+        <w:rPr>
+          <w:rFonts w:ascii="Calibri" w:hAnsi="Calibri"/>
+          <w:color w:val="2A3730"/>
+          <w:sz w:val="21"/>
+        </w:rPr>
+        <w:t xml:space="preserve"> Given the strongest recorded problem, what should management inspect next and how urgently?</w:t>
+      </w:r>
+    </w:p>
+    <w:p>
+      <w:pPr>
+        <w:numPr>
+          <w:ilvl w:val="0"/>
+          <w:numId w:val="13"/>
+        </w:numPr>
+        <w:spacing w:before="0" w:after="60" w:line="283" w:lineRule="auto"/>
+      </w:pPr>
+      <w:r>
+        <w:rPr>
+          <w:rFonts w:ascii="Calibri" w:hAnsi="Calibri"/>
+          <w:b/>
+          <w:color w:val="2A3730"/>
+          <w:sz w:val="21"/>
+        </w:rPr>
+        <w:t>Inputs:</w:t>
+      </w:r>
+      <w:r>
+        <w:rPr>
+          <w:rFonts w:ascii="Calibri" w:hAnsi="Calibri"/>
+          <w:color w:val="2A3730"/>
+          <w:sz w:val="21"/>
+        </w:rPr>
+        <w:t xml:space="preserve"> Leading scored trigger, specific operating alerts, risk severity, data freshness, and Doc Raymond’s intervention mappings.</w:t>
+      </w:r>
+    </w:p>
+    <w:p>
+      <w:pPr>
+        <w:numPr>
+          <w:ilvl w:val="0"/>
+          <w:numId w:val="13"/>
+        </w:numPr>
+        <w:spacing w:before="0" w:after="60" w:line="283" w:lineRule="auto"/>
+      </w:pPr>
+      <w:r>
+        <w:rPr>
+          <w:rFonts w:ascii="Calibri" w:hAnsi="Calibri"/>
+          <w:b/>
+          <w:color w:val="2A3730"/>
+          <w:sz w:val="21"/>
+        </w:rPr>
+        <w:t>Process:</w:t>
+      </w:r>
+      <w:r>
+        <w:rPr>
+          <w:rFonts w:ascii="Calibri" w:hAnsi="Calibri"/>
+          <w:color w:val="2A3730"/>
+          <w:sz w:val="21"/>
+        </w:rPr>
+        <w:t xml:space="preserve"> Select the strongest evidence-backed trigger, look up the deterministic rule ID, attach the approved or pending checklist, and set urgency from the risk label.</w:t>
+      </w:r>
+    </w:p>
+    <w:p>
+      <w:pPr>
+        <w:numPr>
+          <w:ilvl w:val="0"/>
+          <w:numId w:val="13"/>
+        </w:numPr>
+        <w:spacing w:before="0" w:after="60" w:line="283" w:lineRule="auto"/>
+      </w:pPr>
+      <w:r>
+        <w:rPr>
+          <w:rFonts w:ascii="Calibri" w:hAnsi="Calibri"/>
+          <w:b/>
+          <w:color w:val="2A3730"/>
+          <w:sz w:val="21"/>
+        </w:rPr>
+        <w:t>Output:</w:t>
+      </w:r>
+      <w:r>
+        <w:rPr>
+          <w:rFonts w:ascii="Calibri" w:hAnsi="Calibri"/>
+          <w:color w:val="2A3730"/>
+          <w:sz w:val="21"/>
+        </w:rPr>
+        <w:t xml:space="preserve"> Plain-language problem, next inspection, response time, escalation guidance, rule ID, and approval status.</w:t>
+      </w:r>
+    </w:p>
+    <w:p>
+      <w:pPr>
+        <w:numPr>
+          <w:ilvl w:val="0"/>
+          <w:numId w:val="13"/>
+        </w:numPr>
+        <w:spacing w:before="0" w:after="60" w:line="283" w:lineRule="auto"/>
+      </w:pPr>
+      <w:r>
+        <w:rPr>
+          <w:rFonts w:ascii="Calibri" w:hAnsi="Calibri"/>
+          <w:b/>
+          <w:color w:val="2A3730"/>
+          <w:sz w:val="21"/>
+        </w:rPr>
+        <w:t>Limitation:</w:t>
+      </w:r>
+      <w:r>
+        <w:rPr>
+          <w:rFonts w:ascii="Calibri" w:hAnsi="Calibri"/>
+          <w:color w:val="2A3730"/>
+          <w:sz w:val="21"/>
+        </w:rPr>
+        <w:t xml:space="preserve"> The rule suggests what to verify; it does not prove the root cause, prescribe medication, automatically adjust equipment, or guarantee target recovery.</w:t>
       </w:r>
     </w:p>
     <w:p>
@@ -5209,6 +6257,117 @@
         <w:pStyle w:val="Heading3"/>
       </w:pPr>
       <w:r>
+        <w:t>Why Ridge instead of ordinary linear regression?</w:t>
+      </w:r>
+    </w:p>
+    <w:p>
+      <w:pPr>
+        <w:spacing w:before="0" w:after="120" w:line="288" w:lineRule="auto"/>
+      </w:pPr>
+      <w:r>
+        <w:rPr>
+          <w:rFonts w:ascii="Calibri" w:hAnsi="Calibri"/>
+          <w:color w:val="2A3730"/>
+          <w:sz w:val="21"/>
+        </w:rPr>
+        <w:t xml:space="preserve">Ridge </w:t>
+      </w:r>
+      <w:r>
+        <w:rPr>
+          <w:rFonts w:ascii="Calibri" w:hAnsi="Calibri"/>
+          <w:b/>
+          <w:color w:val="2A3730"/>
+          <w:sz w:val="21"/>
+        </w:rPr>
+        <w:t>is a linear regression model</w:t>
+      </w:r>
+      <w:r>
+        <w:rPr>
+          <w:rFonts w:ascii="Calibri" w:hAnsi="Calibri"/>
+          <w:color w:val="2A3730"/>
+          <w:sz w:val="21"/>
+        </w:rPr>
+        <w:t>, with an L2 penalty that shrinks unstable coefficients. Plain ordinary least squares (OLS) was not retained as a separate reported candidate in the current comparison. That is a transparent scope choice—not evidence that OLS was tested and lost.</w:t>
+      </w:r>
+    </w:p>
+    <w:p>
+      <w:pPr>
+        <w:spacing w:before="0" w:after="120" w:line="288" w:lineRule="auto"/>
+      </w:pPr>
+      <w:r>
+        <w:rPr>
+          <w:rFonts w:ascii="Calibri" w:hAnsi="Calibri"/>
+          <w:color w:val="2A3730"/>
+          <w:sz w:val="21"/>
+        </w:rPr>
+        <w:t>Ridge was the more defensible linear candidate because the effective sample is small and several inputs—checkpoint weights, current weight, target progress, and growth rates—are correlated. With these conditions, unregularized OLS can fit large, unstable coefficients that change sharply across held-out cycles. Ridge keeps the linear relationship easy to explain while reducing that variance.</w:t>
+      </w:r>
+    </w:p>
+    <w:p>
+      <w:pPr>
+        <w:spacing w:before="0" w:after="120" w:line="288" w:lineRule="auto"/>
+      </w:pPr>
+      <w:r>
+        <w:rPr>
+          <w:rFonts w:ascii="Calibri" w:hAnsi="Calibri"/>
+          <w:color w:val="2A3730"/>
+          <w:sz w:val="21"/>
+        </w:rPr>
+        <w:t>The formal baselines answer simpler questions: historical mean, target-curve ratio, recent linear ADG, and historical remaining gain for weight; historical mean and current-survival trend for recovery. The panel-safe answer is:</w:t>
+      </w:r>
+    </w:p>
+    <w:tbl>
+      <w:tblPr>
+        <w:tblW w:type="dxa" w:w="9360"/>
+        <w:tblLayout w:type="fixed"/>
+        <w:tblLook w:firstColumn="1" w:firstRow="1" w:lastColumn="0" w:lastRow="0" w:noHBand="0" w:noVBand="1" w:val="04A0"/>
+        <w:tblInd w:w="120" w:type="dxa"/>
+      </w:tblPr>
+      <w:tblGrid>
+        <w:gridCol w:w="9360"/>
+      </w:tblGrid>
+      <w:tr>
+        <w:trPr>
+          <w:cantSplit/>
+        </w:trPr>
+        <w:tc>
+          <w:tcPr>
+            <w:tcW w:type="dxa" w:w="9360"/>
+            <w:tcMar>
+              <w:top w:w="80" w:type="dxa"/>
+              <w:start w:w="120" w:type="dxa"/>
+              <w:bottom w:w="80" w:type="dxa"/>
+              <w:end w:w="120" w:type="dxa"/>
+            </w:tcMar>
+            <w:vAlign w:val="center"/>
+            <w:shd w:fill="F2F8D9"/>
+          </w:tcPr>
+          <w:p>
+            <w:pPr>
+              <w:spacing w:before="0" w:after="0" w:line="300" w:lineRule="auto"/>
+            </w:pPr>
+            <w:r>
+              <w:rPr>
+                <w:rFonts w:ascii="Calibri" w:hAnsi="Calibri"/>
+                <w:color w:val="173F31"/>
+                <w:sz w:val="21"/>
+              </w:rPr>
+              <w:t>We used transparent operational formulas as baselines and Ridge as the regularized linear ML candidate. Ordinary least squares was not separately reported because the dataset is small and the inputs are correlated; we disclose that choice instead of claiming OLS performed worse. A future audit can add OLS under the identical complete-cycle holdouts.</w:t>
+            </w:r>
+          </w:p>
+        </w:tc>
+      </w:tr>
+    </w:tbl>
+    <w:p>
+      <w:pPr>
+        <w:spacing w:after="40"/>
+      </w:pPr>
+    </w:p>
+    <w:p>
+      <w:pPr>
+        <w:pStyle w:val="Heading3"/>
+      </w:pPr>
+      <w:r>
         <w:t>Validation and selection</w:t>
       </w:r>
     </w:p>
@@ -5597,7 +6756,7 @@
       <w:pPr>
         <w:numPr>
           <w:ilvl w:val="0"/>
-          <w:numId w:val="10"/>
+          <w:numId w:val="14"/>
         </w:numPr>
         <w:spacing w:before="0" w:after="60" w:line="283" w:lineRule="auto"/>
       </w:pPr>
@@ -5614,7 +6773,7 @@
       <w:pPr>
         <w:numPr>
           <w:ilvl w:val="0"/>
-          <w:numId w:val="10"/>
+          <w:numId w:val="14"/>
         </w:numPr>
         <w:spacing w:before="0" w:after="60" w:line="283" w:lineRule="auto"/>
       </w:pPr>
@@ -5631,7 +6790,7 @@
       <w:pPr>
         <w:numPr>
           <w:ilvl w:val="0"/>
-          <w:numId w:val="10"/>
+          <w:numId w:val="14"/>
         </w:numPr>
         <w:spacing w:before="0" w:after="60" w:line="283" w:lineRule="auto"/>
       </w:pPr>
@@ -5665,7 +6824,7 @@
       <w:pPr>
         <w:numPr>
           <w:ilvl w:val="0"/>
-          <w:numId w:val="10"/>
+          <w:numId w:val="14"/>
         </w:numPr>
         <w:spacing w:before="0" w:after="60" w:line="283" w:lineRule="auto"/>
       </w:pPr>
@@ -5682,7 +6841,7 @@
       <w:pPr>
         <w:numPr>
           <w:ilvl w:val="0"/>
-          <w:numId w:val="10"/>
+          <w:numId w:val="14"/>
         </w:numPr>
         <w:spacing w:before="0" w:after="60" w:line="283" w:lineRule="auto"/>
       </w:pPr>
@@ -9658,7 +10817,7 @@
         <w:pStyle w:val="Heading3"/>
       </w:pPr>
       <w:r>
-        <w:t>“Why not just use average daily gain?”</w:t>
+        <w:t>“Why did you not report ordinary linear regression as a baseline?”</w:t>
       </w:r>
     </w:p>
     <w:p>
@@ -9671,7 +10830,7 @@
           <w:color w:val="2A3730"/>
           <w:sz w:val="21"/>
         </w:rPr>
-        <w:t>Straight-line ADG assumes the recent growth rate continues unchanged. In held-out testing its MAE was about 432 g, far worse than Ridge at about 172 g.</w:t>
+        <w:t>Ridge is the regularized linear-regression candidate. Plain OLS was not separately retained in the recorded comparison because the effective outcome sample is small and the checkpoint/growth inputs are correlated, which can make unregularized coefficients unstable. Canary instead used simple operational formulas as baselines. We state this as a limitation and do not claim OLS was tested and lost.</w:t>
       </w:r>
     </w:p>
     <w:p>
@@ -9679,7 +10838,7 @@
         <w:pStyle w:val="Heading3"/>
       </w:pPr>
       <w:r>
-        <w:t>“Why keep historical remaining gain?”</w:t>
+        <w:t>“Why not just use average daily gain?”</w:t>
       </w:r>
     </w:p>
     <w:p>
@@ -9692,7 +10851,7 @@
           <w:color w:val="2A3730"/>
           <w:sz w:val="21"/>
         </w:rPr>
-        <w:t>It is transparent, strong, and easy to audit. It is the benchmark the ML model must beat. Ridge beat it beyond the 5% tolerance, so Ridge is champion today.</w:t>
+        <w:t>Straight-line ADG assumes the recent growth rate continues unchanged. In held-out testing its MAE was about 432 g, far worse than Ridge at about 172 g.</w:t>
       </w:r>
     </w:p>
     <w:p>
@@ -9700,7 +10859,7 @@
         <w:pStyle w:val="Heading3"/>
       </w:pPr>
       <w:r>
-        <w:t>“Can we trust the recovery model?”</w:t>
+        <w:t>“Why keep historical remaining gain?”</w:t>
       </w:r>
     </w:p>
     <w:p>
@@ -9713,7 +10872,7 @@
           <w:color w:val="2A3730"/>
           <w:sz w:val="21"/>
         </w:rPr>
-        <w:t>Trust it as a limited-data continuous estimate with about 1.3 points MAE—not as proof that a building will hit 95%. It did not beat the majority baseline for target classification.</w:t>
+        <w:t>It is transparent, strong, and easy to audit. It is the benchmark the ML model must beat. Ridge beat it beyond the 5% tolerance, so Ridge is champion today.</w:t>
       </w:r>
     </w:p>
     <w:p>
@@ -9721,7 +10880,7 @@
         <w:pStyle w:val="Heading3"/>
       </w:pPr>
       <w:r>
-        <w:t>“Why did you select Ridge when Random Forest had the best cycle-balanced recovery MAE?”</w:t>
+        <w:t>“Can we trust the recovery model?”</w:t>
       </w:r>
     </w:p>
     <w:p>
@@ -9734,7 +10893,7 @@
           <w:color w:val="2A3730"/>
           <w:sz w:val="21"/>
         </w:rPr>
-        <w:t>Random Forest's cycle-balanced MAE was about 1.33 points. Compact Ridge was about 1.42 points, within the predeclared 10% simplicity tolerance, while having the best overall MAE at about 1.32 points. On only 25 building outcomes, Ridge is easier to explain and less likely to overfit. We disclose both results instead of claiming Ridge won every metric.</w:t>
+        <w:t>Trust it as a limited-data continuous estimate with about 1.3 points MAE—not as proof that a building will hit 95%. It did not beat the majority baseline for target classification.</w:t>
       </w:r>
     </w:p>
     <w:p>
@@ -9742,7 +10901,7 @@
         <w:pStyle w:val="Heading3"/>
       </w:pPr>
       <w:r>
-        <w:t>“Do temperature and humidity drive the forecast?”</w:t>
+        <w:t>“Why did you select Ridge when Random Forest had the best cycle-balanced recovery MAE?”</w:t>
       </w:r>
     </w:p>
     <w:p>
@@ -9755,7 +10914,7 @@
           <w:color w:val="2A3730"/>
           <w:sz w:val="21"/>
         </w:rPr>
-        <w:t>They are recovery-model inputs and operating checks. Average-temperature and humidity deviations also form one provisional environmental risk dimension. Sparse coverage prevents causal claims: use them to guide inspection, not to promise that one adjustment will change the outcome.</w:t>
+        <w:t>Random Forest's cycle-balanced MAE was about 1.33 points. Compact Ridge was about 1.42 points, within the predeclared 10% simplicity tolerance, while having the best overall MAE at about 1.32 points. On only 25 building outcomes, Ridge is easier to explain and less likely to overfit. We disclose both results instead of claiming Ridge won every metric.</w:t>
       </w:r>
     </w:p>
     <w:p>
@@ -9763,7 +10922,7 @@
         <w:pStyle w:val="Heading3"/>
       </w:pPr>
       <w:r>
-        <w:t>“Is the app production ready?”</w:t>
+        <w:t>“Do temperature and humidity drive the forecast?”</w:t>
       </w:r>
     </w:p>
     <w:p>
@@ -9776,41 +10935,36 @@
           <w:color w:val="2A3730"/>
           <w:sz w:val="21"/>
         </w:rPr>
-        <w:t>No. It is capstone-prototype ready after final farm validation. Production use still needs stronger data governance, confirmed harvest events, threshold approval, secure deployment, monitoring, and more cycles.</w:t>
+        <w:t>They are recovery-model inputs and operating checks. Average-temperature and humidity deviations also form one provisional environmental risk dimension. Sparse coverage prevents causal claims: use them to guide inspection, not to promise that one adjustment will change the outcome.</w:t>
       </w:r>
     </w:p>
     <w:p>
       <w:pPr>
-        <w:pStyle w:val="Heading1"/>
-      </w:pPr>
-      <w:r>
-        <w:t>16. What we can defend strongly</w:t>
+        <w:pStyle w:val="Heading3"/>
+      </w:pPr>
+      <w:r>
+        <w:t>“Is the app production ready?”</w:t>
       </w:r>
     </w:p>
     <w:p>
       <w:pPr>
-        <w:pStyle w:val="ListBullet"/>
-      </w:pPr>
-      <w:r>
-        <w:rPr>
-          <w:rFonts w:ascii="Calibri" w:hAnsi="Calibri"/>
-          <w:color w:val="2A3730"/>
-          <w:sz w:val="21"/>
-        </w:rPr>
-        <w:t xml:space="preserve"> one-row-per-building-day data preparation</w:t>
+        <w:spacing w:before="0" w:after="120" w:line="288" w:lineRule="auto"/>
+      </w:pPr>
+      <w:r>
+        <w:rPr>
+          <w:rFonts w:ascii="Calibri" w:hAnsi="Calibri"/>
+          <w:color w:val="2A3730"/>
+          <w:sz w:val="21"/>
+        </w:rPr>
+        <w:t>No. It is capstone-prototype ready after final farm validation. Production use still needs stronger data governance, confirmed harvest events, threshold approval, secure deployment, monitoring, and more cycles.</w:t>
       </w:r>
     </w:p>
     <w:p>
       <w:pPr>
-        <w:pStyle w:val="ListBullet"/>
-      </w:pPr>
-      <w:r>
-        <w:rPr>
-          <w:rFonts w:ascii="Calibri" w:hAnsi="Calibri"/>
-          <w:color w:val="2A3730"/>
-          <w:sz w:val="21"/>
-        </w:rPr>
-        <w:t xml:space="preserve"> correct handling of Zone A/B records without double-counting production</w:t>
+        <w:pStyle w:val="Heading1"/>
+      </w:pPr>
+      <w:r>
+        <w:t>16. What we can defend strongly</w:t>
       </w:r>
     </w:p>
     <w:p>
@@ -9823,7 +10977,7 @@
           <w:color w:val="2A3730"/>
           <w:sz w:val="21"/>
         </w:rPr>
-        <w:t xml:space="preserve"> corrected checkpoint-weight coverage</w:t>
+        <w:t xml:space="preserve"> one-row-per-building-day data preparation</w:t>
       </w:r>
     </w:p>
     <w:p>
@@ -9836,7 +10990,7 @@
           <w:color w:val="2A3730"/>
           <w:sz w:val="21"/>
         </w:rPr>
-        <w:t xml:space="preserve"> rules-based score traceability</w:t>
+        <w:t xml:space="preserve"> correct handling of Zone A/B records without double-counting production</w:t>
       </w:r>
     </w:p>
     <w:p>
@@ -9849,7 +11003,7 @@
           <w:color w:val="2A3730"/>
           <w:sz w:val="21"/>
         </w:rPr>
-        <w:t xml:space="preserve"> cycle-held-out model validation</w:t>
+        <w:t xml:space="preserve"> corrected checkpoint-weight coverage</w:t>
       </w:r>
     </w:p>
     <w:p>
@@ -9862,7 +11016,7 @@
           <w:color w:val="2A3730"/>
           <w:sz w:val="21"/>
         </w:rPr>
-        <w:t xml:space="preserve"> three ML candidates plus transparent baselines for Day 35 weight</w:t>
+        <w:t xml:space="preserve"> rules-based score traceability</w:t>
       </w:r>
     </w:p>
     <w:p>
@@ -9875,7 +11029,7 @@
           <w:color w:val="2A3730"/>
           <w:sz w:val="21"/>
         </w:rPr>
-        <w:t xml:space="preserve"> compact, leakage-safe recovery model</w:t>
+        <w:t xml:space="preserve"> cycle-held-out model validation</w:t>
       </w:r>
     </w:p>
     <w:p>
@@ -9888,7 +11042,7 @@
           <w:color w:val="2A3730"/>
           <w:sz w:val="21"/>
         </w:rPr>
-        <w:t xml:space="preserve"> visible uncertainty and limitations</w:t>
+        <w:t xml:space="preserve"> three ML candidates plus transparent baselines for Day 35 weight</w:t>
       </w:r>
     </w:p>
     <w:p>
@@ -9901,7 +11055,7 @@
           <w:color w:val="2A3730"/>
           <w:sz w:val="21"/>
         </w:rPr>
-        <w:t xml:space="preserve"> deterministic recommendation mapping</w:t>
+        <w:t xml:space="preserve"> compact, leakage-safe recovery model</w:t>
       </w:r>
     </w:p>
     <w:p>
@@ -9914,15 +11068,20 @@
           <w:color w:val="2A3730"/>
           <w:sz w:val="21"/>
         </w:rPr>
-        <w:t xml:space="preserve"> replacement of opaque trend/peer points with direct population, mortality, and environmental evidence</w:t>
+        <w:t xml:space="preserve"> visible uncertainty and limitations</w:t>
       </w:r>
     </w:p>
     <w:p>
       <w:pPr>
-        <w:pStyle w:val="Heading1"/>
-      </w:pPr>
-      <w:r>
-        <w:t>17. What we must not overclaim</w:t>
+        <w:pStyle w:val="ListBullet"/>
+      </w:pPr>
+      <w:r>
+        <w:rPr>
+          <w:rFonts w:ascii="Calibri" w:hAnsi="Calibri"/>
+          <w:color w:val="2A3730"/>
+          <w:sz w:val="21"/>
+        </w:rPr>
+        <w:t xml:space="preserve"> deterministic recommendation mapping</w:t>
       </w:r>
     </w:p>
     <w:p>
@@ -9935,20 +11094,15 @@
           <w:color w:val="2A3730"/>
           <w:sz w:val="21"/>
         </w:rPr>
-        <w:t xml:space="preserve"> risk score is not a probability</w:t>
+        <w:t xml:space="preserve"> replacement of opaque trend/peer points with direct population, mortality, and environmental evidence</w:t>
       </w:r>
     </w:p>
     <w:p>
       <w:pPr>
-        <w:pStyle w:val="ListBullet"/>
-      </w:pPr>
-      <w:r>
-        <w:rPr>
-          <w:rFonts w:ascii="Calibri" w:hAnsi="Calibri"/>
-          <w:color w:val="2A3730"/>
-          <w:sz w:val="21"/>
-        </w:rPr>
-        <w:t xml:space="preserve"> feature importance is not causality</w:t>
+        <w:pStyle w:val="Heading1"/>
+      </w:pPr>
+      <w:r>
+        <w:t>17. What we must not overclaim</w:t>
       </w:r>
     </w:p>
     <w:p>
@@ -9961,7 +11115,7 @@
           <w:color w:val="2A3730"/>
           <w:sz w:val="21"/>
         </w:rPr>
-        <w:t xml:space="preserve"> recovery target classification is not proven</w:t>
+        <w:t xml:space="preserve"> risk score is not a probability</w:t>
       </w:r>
     </w:p>
     <w:p>
@@ -9974,7 +11128,7 @@
           <w:color w:val="2A3730"/>
           <w:sz w:val="21"/>
         </w:rPr>
-        <w:t xml:space="preserve"> five Day 35 target hits are a small group</w:t>
+        <w:t xml:space="preserve"> feature importance is not causality</w:t>
       </w:r>
     </w:p>
     <w:p>
@@ -9987,7 +11141,7 @@
           <w:color w:val="2A3730"/>
           <w:sz w:val="21"/>
         </w:rPr>
-        <w:t xml:space="preserve"> unweighted zone averaging assumes equal relevance of Zones A and B</w:t>
+        <w:t xml:space="preserve"> recovery target classification is not proven</w:t>
       </w:r>
     </w:p>
     <w:p>
@@ -10000,7 +11154,7 @@
           <w:color w:val="2A3730"/>
           <w:sz w:val="21"/>
         </w:rPr>
-        <w:t xml:space="preserve"> the recovery target is a last-recorded proxy, not a verified harvest-event result</w:t>
+        <w:t xml:space="preserve"> five Day 35 target hits are a small group</w:t>
       </w:r>
     </w:p>
     <w:p>
@@ -10013,7 +11167,7 @@
           <w:color w:val="2A3730"/>
           <w:sz w:val="21"/>
         </w:rPr>
-        <w:t xml:space="preserve"> recommended actions support inspection; they do not guarantee recovered revenue or target attainment</w:t>
+        <w:t xml:space="preserve"> unweighted zone averaging assumes equal relevance of Zones A and B</w:t>
       </w:r>
     </w:p>
     <w:p>
@@ -10026,59 +11180,22 @@
           <w:color w:val="2A3730"/>
           <w:sz w:val="21"/>
         </w:rPr>
-        <w:t xml:space="preserve"> environmental thresholds are expert starting rules, not historically calibrated causal cutoffs</w:t>
+        <w:t xml:space="preserve"> the recovery target is a last-recorded proxy, not a verified harvest-event result</w:t>
       </w:r>
     </w:p>
     <w:p>
       <w:pPr>
-        <w:pStyle w:val="Heading1"/>
-      </w:pPr>
-      <w:r>
-        <w:t>18. Final one-sentence defense</w:t>
+        <w:pStyle w:val="ListBullet"/>
+      </w:pPr>
+      <w:r>
+        <w:rPr>
+          <w:rFonts w:ascii="Calibri" w:hAnsi="Calibri"/>
+          <w:color w:val="2A3730"/>
+          <w:sz w:val="21"/>
+        </w:rPr>
+        <w:t xml:space="preserve"> recommended actions support inspection; they do not guarantee recovered revenue or target attainment</w:t>
       </w:r>
     </w:p>
-    <w:tbl>
-      <w:tblPr>
-        <w:tblW w:type="dxa" w:w="9360"/>
-        <w:tblLayout w:type="fixed"/>
-        <w:tblLook w:firstColumn="1" w:firstRow="1" w:lastColumn="0" w:lastRow="0" w:noHBand="0" w:noVBand="1" w:val="04A0"/>
-        <w:tblInd w:w="120" w:type="dxa"/>
-      </w:tblPr>
-      <w:tblGrid>
-        <w:gridCol w:w="9360"/>
-      </w:tblGrid>
-      <w:tr>
-        <w:trPr>
-          <w:cantSplit/>
-        </w:trPr>
-        <w:tc>
-          <w:tcPr>
-            <w:tcW w:type="dxa" w:w="9360"/>
-            <w:tcMar>
-              <w:top w:w="80" w:type="dxa"/>
-              <w:start w:w="120" w:type="dxa"/>
-              <w:bottom w:w="80" w:type="dxa"/>
-              <w:end w:w="120" w:type="dxa"/>
-            </w:tcMar>
-            <w:vAlign w:val="center"/>
-            <w:shd w:fill="F2F8D9"/>
-          </w:tcPr>
-          <w:p>
-            <w:pPr>
-              <w:spacing w:before="0" w:after="0" w:line="300" w:lineRule="auto"/>
-            </w:pPr>
-            <w:r>
-              <w:rPr>
-                <w:rFonts w:ascii="Calibri" w:hAnsi="Calibri"/>
-                <w:color w:val="173F31"/>
-                <w:sz w:val="21"/>
-              </w:rPr>
-              <w:t>Project Canary converts daily building data into transparent operational priorities, leakage-safe outcome forecasts, and practical inspection guidance, while clearly separating what the evidence supports from what still requires farm validation.</w:t>
-            </w:r>
-          </w:p>
-        </w:tc>
-      </w:tr>
-    </w:tbl>
     <w:sectPr>
       <w:headerReference w:type="default" r:id="rId9"/>
       <w:footerReference w:type="default" r:id="rId10"/>
@@ -10346,6 +11463,70 @@
   </w:abstractNum>
   <w:num w:numId="10">
     <w:abstractNumId w:val="9"/>
+  </w:num>
+  <w:abstractNum w:abstractNumId="10">
+    <w:multiLevelType w:val="singleLevel"/>
+    <w:lvl w:ilvl="0">
+      <w:start w:val="1"/>
+      <w:numFmt w:val="decimal"/>
+      <w:lvlText w:val="%1."/>
+      <w:lvlJc w:val="left"/>
+      <w:suff w:val="space"/>
+      <w:pPr>
+        <w:ind w:left="540" w:hanging="270"/>
+      </w:pPr>
+    </w:lvl>
+  </w:abstractNum>
+  <w:num w:numId="11">
+    <w:abstractNumId w:val="10"/>
+  </w:num>
+  <w:abstractNum w:abstractNumId="11">
+    <w:multiLevelType w:val="singleLevel"/>
+    <w:lvl w:ilvl="0">
+      <w:start w:val="1"/>
+      <w:numFmt w:val="decimal"/>
+      <w:lvlText w:val="%1."/>
+      <w:lvlJc w:val="left"/>
+      <w:suff w:val="space"/>
+      <w:pPr>
+        <w:ind w:left="540" w:hanging="270"/>
+      </w:pPr>
+    </w:lvl>
+  </w:abstractNum>
+  <w:num w:numId="12">
+    <w:abstractNumId w:val="11"/>
+  </w:num>
+  <w:abstractNum w:abstractNumId="12">
+    <w:multiLevelType w:val="singleLevel"/>
+    <w:lvl w:ilvl="0">
+      <w:start w:val="1"/>
+      <w:numFmt w:val="decimal"/>
+      <w:lvlText w:val="%1."/>
+      <w:lvlJc w:val="left"/>
+      <w:suff w:val="space"/>
+      <w:pPr>
+        <w:ind w:left="540" w:hanging="270"/>
+      </w:pPr>
+    </w:lvl>
+  </w:abstractNum>
+  <w:num w:numId="13">
+    <w:abstractNumId w:val="12"/>
+  </w:num>
+  <w:abstractNum w:abstractNumId="13">
+    <w:multiLevelType w:val="singleLevel"/>
+    <w:lvl w:ilvl="0">
+      <w:start w:val="1"/>
+      <w:numFmt w:val="decimal"/>
+      <w:lvlText w:val="%1."/>
+      <w:lvlJc w:val="left"/>
+      <w:suff w:val="space"/>
+      <w:pPr>
+        <w:ind w:left="540" w:hanging="270"/>
+      </w:pPr>
+    </w:lvl>
+  </w:abstractNum>
+  <w:num w:numId="14">
+    <w:abstractNumId w:val="13"/>
   </w:num>
 </w:numbering>
 </file>

</xml_diff>

<commit_message>
fix: prevent stale package import on Harvest Analysis startup
fix: prevent stale package import on Harvest Analysis startup
</commit_message>
<xml_diff>
--- a/docs/Project_Canary_Defense_Cheat_Sheet.docx
+++ b/docs/Project_Canary_Defense_Cheat_Sheet.docx
@@ -422,20 +422,54 @@
           <w:color w:val="2A3730"/>
           <w:sz w:val="21"/>
         </w:rPr>
-        <w:t xml:space="preserve"> Recovery Y is the agreed proxy: last-recorded population ÷ beginning population.</w:t>
+        <w:t xml:space="preserve"> Recovery endpoint is the agreed proxy: last-recorded population ÷ beginning population. The redesigned </w:t>
       </w:r>
-    </w:p>
-    <w:p>
-      <w:pPr>
-        <w:pStyle w:val="ListBullet"/>
-      </w:pPr>
+      <w:r>
+        <w:rPr>
+          <w:rFonts w:ascii="Calibri" w:hAnsi="Calibri"/>
+          <w:b/>
+          <w:color w:val="2A3730"/>
+          <w:sz w:val="21"/>
+        </w:rPr>
+        <w:t>training Y</w:t>
+      </w:r>
       <w:r>
         <w:rPr>
           <w:rFonts w:ascii="Calibri" w:hAnsi="Calibri"/>
           <w:color w:val="2A3730"/>
           <w:sz w:val="21"/>
         </w:rPr>
-        <w:t xml:space="preserve"> Weight Y is observed average bodyweight on production Day 35.</w:t>
+        <w:t xml:space="preserve"> is the additional population loss after each review date.</w:t>
+      </w:r>
+    </w:p>
+    <w:p>
+      <w:pPr>
+        <w:pStyle w:val="ListBullet"/>
+      </w:pPr>
+      <w:r>
+        <w:rPr>
+          <w:rFonts w:ascii="Calibri" w:hAnsi="Calibri"/>
+          <w:color w:val="2A3730"/>
+          <w:sz w:val="21"/>
+        </w:rPr>
+        <w:t xml:space="preserve"> Weight endpoint is observed average bodyweight on Day 35. The redesigned </w:t>
+      </w:r>
+      <w:r>
+        <w:rPr>
+          <w:rFonts w:ascii="Calibri" w:hAnsi="Calibri"/>
+          <w:b/>
+          <w:color w:val="2A3730"/>
+          <w:sz w:val="21"/>
+        </w:rPr>
+        <w:t>training Y</w:t>
+      </w:r>
+      <w:r>
+        <w:rPr>
+          <w:rFonts w:ascii="Calibri" w:hAnsi="Calibri"/>
+          <w:color w:val="2A3730"/>
+          <w:sz w:val="21"/>
+        </w:rPr>
+        <w:t xml:space="preserve"> is the remaining gain from the current checkpoint to Day 35.</w:t>
       </w:r>
     </w:p>
     <w:p>
@@ -520,7 +554,7 @@
           <w:color w:val="2A3730"/>
           <w:sz w:val="21"/>
         </w:rPr>
-        <w:t xml:space="preserve"> ordinary linear regression is the continuous estimator. Whole-cycle MAE is </w:t>
+        <w:t xml:space="preserve"> the operational method is the </w:t>
       </w:r>
       <w:r>
         <w:rPr>
@@ -529,7 +563,24 @@
           <w:color w:val="2A3730"/>
           <w:sz w:val="21"/>
         </w:rPr>
-        <w:t>1.37 percentage points</w:t>
+        <w:t>age-band remaining-loss baseline</w:t>
+      </w:r>
+      <w:r>
+        <w:rPr>
+          <w:rFonts w:ascii="Calibri" w:hAnsi="Calibri"/>
+          <w:color w:val="2A3730"/>
+          <w:sz w:val="21"/>
+        </w:rPr>
+        <w:t xml:space="preserve">. Whole-cycle MAE is </w:t>
+      </w:r>
+      <w:r>
+        <w:rPr>
+          <w:rFonts w:ascii="Calibri" w:hAnsi="Calibri"/>
+          <w:b/>
+          <w:color w:val="2A3730"/>
+          <w:sz w:val="21"/>
+        </w:rPr>
+        <w:t>1.40 percentage points</w:t>
       </w:r>
       <w:r>
         <w:rPr>
@@ -546,7 +597,7 @@
           <w:color w:val="2A3730"/>
           <w:sz w:val="21"/>
         </w:rPr>
-        <w:t>1.48 points</w:t>
+        <w:t>1.50 points</w:t>
       </w:r>
       <w:r>
         <w:rPr>
@@ -563,7 +614,7 @@
           <w:color w:val="2A3730"/>
           <w:sz w:val="21"/>
         </w:rPr>
-        <w:t>1.84 points</w:t>
+        <w:t>1.80 points</w:t>
       </w:r>
       <w:r>
         <w:rPr>
@@ -580,7 +631,7 @@
           <w:color w:val="2A3730"/>
           <w:sz w:val="21"/>
         </w:rPr>
-        <w:t>0.189</w:t>
+        <w:t>0.222</w:t>
       </w:r>
       <w:r>
         <w:rPr>
@@ -588,7 +639,7 @@
           <w:color w:val="2A3730"/>
           <w:sz w:val="21"/>
         </w:rPr>
-        <w:t xml:space="preserve">. It improves cycle-balanced MAE by </w:t>
+        <w:t>. Robust Huber is the best learned research challenger (</w:t>
       </w:r>
       <w:r>
         <w:rPr>
@@ -597,7 +648,7 @@
           <w:color w:val="2A3730"/>
           <w:sz w:val="21"/>
         </w:rPr>
-        <w:t>14.5%</w:t>
+        <w:t>1.24-point MAE, R² 0.260</w:t>
       </w:r>
       <w:r>
         <w:rPr>
@@ -605,7 +656,7 @@
           <w:color w:val="2A3730"/>
           <w:sz w:val="21"/>
         </w:rPr>
-        <w:t xml:space="preserve"> versus the historical-mean baseline. It is not validated as a 95% hit/miss classifier.</w:t>
+        <w:t>) but remains experimental because it fails the 95% classification gate and is less stable under rolling-origin validation.</w:t>
       </w:r>
     </w:p>
     <w:p>
@@ -652,7 +703,7 @@
           <w:color w:val="2A3730"/>
           <w:sz w:val="21"/>
         </w:rPr>
-        <w:t xml:space="preserve"> is the operational fallback. MAE is </w:t>
+        <w:t xml:space="preserve"> remains operational. MAE is </w:t>
       </w:r>
       <w:r>
         <w:rPr>
@@ -737,7 +788,7 @@
           <w:color w:val="2A3730"/>
           <w:sz w:val="21"/>
         </w:rPr>
-        <w:t xml:space="preserve"> are within 200 g. Ridge is the best learned linear challenger, but it is worse than the baseline and fails the replacement gates.</w:t>
+        <w:t xml:space="preserve"> are within 200 g. Every learned challenger performs worse on unseen cycles.</w:t>
       </w:r>
     </w:p>
     <w:p>
@@ -1033,7 +1084,7 @@
           <w:color w:val="2A3730"/>
           <w:sz w:val="21"/>
         </w:rPr>
-        <w:t xml:space="preserve"> cycle day; current percentage alive; recent mortality and mortality change; latest weight gap and freshness; temperature/humidity band deviations; recent out-of-band environment days; and environment freshness. Feed is withheld until its unit is confirmed.</w:t>
+        <w:t xml:space="preserve"> age and remaining days; current survival and cumulative loss; mortality level/acceleration; latest weight gap/freshness; temperature/humidity exposure and freshness. Feed is withheld until its unit is confirmed.</w:t>
       </w:r>
     </w:p>
     <w:p>
@@ -1085,7 +1136,7 @@
           <w:color w:val="2A3730"/>
           <w:sz w:val="21"/>
         </w:rPr>
-        <w:t xml:space="preserve"> point estimate, target gap, empirical range, model version, forecast date, and predictive drivers.</w:t>
+        <w:t xml:space="preserve"> current survival minus predicted remaining loss, plus target gap, empirical range, model version, forecast date, and predictive context.</w:t>
       </w:r>
     </w:p>
     <w:p>
@@ -1323,7 +1374,7 @@
                 <w:color w:val="2A3730"/>
                 <w:sz w:val="19"/>
               </w:rPr>
-              <w:t>Calculates the completed-cycle recovery proxy: last-recorded population ÷ beginning population.</w:t>
+              <w:t>Calculates remaining loss after the snapshot: current percentage alive − completed-cycle recovery proxy. Final forecast = current survival − predicted remaining loss.</w:t>
             </w:r>
           </w:p>
         </w:tc>
@@ -1689,7 +1740,7 @@
                 <w:color w:val="2A3730"/>
                 <w:sz w:val="19"/>
               </w:rPr>
-              <w:t>Returns an estimated final recovery, likely range, gap to 95%, model version, and non-causal driver explanation.</w:t>
+              <w:t>Returns current survival minus expected remaining loss, a likely range, gap to 95%, model version, and non-causal driver context.</w:t>
             </w:r>
           </w:p>
         </w:tc>
@@ -1719,7 +1770,21 @@
           <w:color w:val="286245"/>
           <w:sz w:val="20"/>
         </w:rPr>
-        <w:t>final recovery proxy = last-recorded population ÷ beginning population</w:t>
+        <w:t>additional loss Y = current percentage alive − final recovery proxy</w:t>
+      </w:r>
+    </w:p>
+    <w:p>
+      <w:pPr>
+        <w:spacing w:before="0" w:after="120" w:line="288" w:lineRule="auto"/>
+      </w:pPr>
+      <w:r>
+        <w:rPr>
+          <w:rFonts w:ascii="Calibri" w:hAnsi="Calibri"/>
+          <w:b/>
+          <w:color w:val="286245"/>
+          <w:sz w:val="20"/>
+        </w:rPr>
+        <w:t>predicted final recovery = current percentage alive − predicted additional loss</w:t>
       </w:r>
     </w:p>
     <w:p>
@@ -1994,10 +2059,11 @@
             <w:r>
               <w:rPr>
                 <w:rFonts w:ascii="Calibri" w:hAnsi="Calibri"/>
+                <w:b/>
                 <w:color w:val="2A3730"/>
                 <w:sz w:val="18"/>
               </w:rPr>
-              <w:t>Historical mean</w:t>
+              <w:t>Age-band remaining-loss baseline</w:t>
             </w:r>
           </w:p>
         </w:tc>
@@ -2022,10 +2088,11 @@
             <w:r>
               <w:rPr>
                 <w:rFonts w:ascii="Calibri" w:hAnsi="Calibri"/>
+                <w:b/>
                 <w:color w:val="2A3730"/>
                 <w:sz w:val="18"/>
               </w:rPr>
-              <w:t>1.66</w:t>
+              <w:t>1.40</w:t>
             </w:r>
           </w:p>
         </w:tc>
@@ -2050,10 +2117,11 @@
             <w:r>
               <w:rPr>
                 <w:rFonts w:ascii="Calibri" w:hAnsi="Calibri"/>
+                <w:b/>
                 <w:color w:val="2A3730"/>
                 <w:sz w:val="18"/>
               </w:rPr>
-              <w:t>1.73</w:t>
+              <w:t>1.50</w:t>
             </w:r>
           </w:p>
         </w:tc>
@@ -2078,10 +2146,11 @@
             <w:r>
               <w:rPr>
                 <w:rFonts w:ascii="Calibri" w:hAnsi="Calibri"/>
+                <w:b/>
                 <w:color w:val="2A3730"/>
                 <w:sz w:val="18"/>
               </w:rPr>
-              <w:t>2.17</w:t>
+              <w:t>1.80</w:t>
             </w:r>
           </w:p>
         </w:tc>
@@ -2106,10 +2175,11 @@
             <w:r>
               <w:rPr>
                 <w:rFonts w:ascii="Calibri" w:hAnsi="Calibri"/>
+                <w:b/>
                 <w:color w:val="2A3730"/>
                 <w:sz w:val="18"/>
               </w:rPr>
-              <w:t>-0.132</w:t>
+              <w:t>0.222</w:t>
             </w:r>
           </w:p>
         </w:tc>
@@ -2134,10 +2204,11 @@
             <w:r>
               <w:rPr>
                 <w:rFonts w:ascii="Calibri" w:hAnsi="Calibri"/>
+                <w:b/>
                 <w:color w:val="2A3730"/>
                 <w:sz w:val="18"/>
               </w:rPr>
-              <w:t>Baseline</w:t>
+              <w:t>Operational fallback</w:t>
             </w:r>
           </w:p>
         </w:tc>
@@ -2168,11 +2239,10 @@
             <w:r>
               <w:rPr>
                 <w:rFonts w:ascii="Calibri" w:hAnsi="Calibri"/>
-                <w:b/>
                 <w:color w:val="2A3730"/>
                 <w:sz w:val="18"/>
               </w:rPr>
-              <w:t>Ordinary linear regression</w:t>
+              <w:t>Linear remaining-loss regression</w:t>
             </w:r>
           </w:p>
         </w:tc>
@@ -2198,11 +2268,10 @@
             <w:r>
               <w:rPr>
                 <w:rFonts w:ascii="Calibri" w:hAnsi="Calibri"/>
-                <w:b/>
                 <w:color w:val="2A3730"/>
                 <w:sz w:val="18"/>
               </w:rPr>
-              <w:t>1.37</w:t>
+              <w:t>1.29</w:t>
             </w:r>
           </w:p>
         </w:tc>
@@ -2228,11 +2297,10 @@
             <w:r>
               <w:rPr>
                 <w:rFonts w:ascii="Calibri" w:hAnsi="Calibri"/>
-                <w:b/>
                 <w:color w:val="2A3730"/>
                 <w:sz w:val="18"/>
               </w:rPr>
-              <w:t>1.48</w:t>
+              <w:t>1.40</w:t>
             </w:r>
           </w:p>
         </w:tc>
@@ -2258,11 +2326,10 @@
             <w:r>
               <w:rPr>
                 <w:rFonts w:ascii="Calibri" w:hAnsi="Calibri"/>
-                <w:b/>
                 <w:color w:val="2A3730"/>
                 <w:sz w:val="18"/>
               </w:rPr>
-              <w:t>1.84</w:t>
+              <w:t>1.80</w:t>
             </w:r>
           </w:p>
         </w:tc>
@@ -2288,11 +2355,10 @@
             <w:r>
               <w:rPr>
                 <w:rFonts w:ascii="Calibri" w:hAnsi="Calibri"/>
-                <w:b/>
                 <w:color w:val="2A3730"/>
                 <w:sz w:val="18"/>
               </w:rPr>
-              <w:t>0.189</w:t>
+              <w:t>0.224</w:t>
             </w:r>
           </w:p>
         </w:tc>
@@ -2318,11 +2384,10 @@
             <w:r>
               <w:rPr>
                 <w:rFonts w:ascii="Calibri" w:hAnsi="Calibri"/>
-                <w:b/>
                 <w:color w:val="2A3730"/>
                 <w:sz w:val="18"/>
               </w:rPr>
-              <w:t>Operational continuous estimator</w:t>
+              <w:t>Compared</w:t>
             </w:r>
           </w:p>
         </w:tc>
@@ -2355,7 +2420,7 @@
                 <w:color w:val="2A3730"/>
                 <w:sz w:val="18"/>
               </w:rPr>
-              <w:t>Compact Ridge</w:t>
+              <w:t>Ridge remaining-loss regression</w:t>
             </w:r>
           </w:p>
         </w:tc>
@@ -2383,7 +2448,7 @@
                 <w:color w:val="2A3730"/>
                 <w:sz w:val="18"/>
               </w:rPr>
-              <w:t>1.55</w:t>
+              <w:t>1.31</w:t>
             </w:r>
           </w:p>
         </w:tc>
@@ -2411,7 +2476,7 @@
                 <w:color w:val="2A3730"/>
                 <w:sz w:val="18"/>
               </w:rPr>
-              <w:t>1.59</w:t>
+              <w:t>1.43</w:t>
             </w:r>
           </w:p>
         </w:tc>
@@ -2439,7 +2504,7 @@
                 <w:color w:val="2A3730"/>
                 <w:sz w:val="18"/>
               </w:rPr>
-              <w:t>1.97</w:t>
+              <w:t>1.82</w:t>
             </w:r>
           </w:p>
         </w:tc>
@@ -2467,7 +2532,7 @@
                 <w:color w:val="2A3730"/>
                 <w:sz w:val="18"/>
               </w:rPr>
-              <w:t>0.070</w:t>
+              <w:t>0.207</w:t>
             </w:r>
           </w:p>
         </w:tc>
@@ -2529,7 +2594,7 @@
                 <w:color w:val="2A3730"/>
                 <w:sz w:val="18"/>
               </w:rPr>
-              <w:t>Gradient Boosting</w:t>
+              <w:t>Robust Huber remaining-loss regression</w:t>
             </w:r>
           </w:p>
         </w:tc>
@@ -2558,7 +2623,7 @@
                 <w:color w:val="2A3730"/>
                 <w:sz w:val="18"/>
               </w:rPr>
-              <w:t>1.57</w:t>
+              <w:t>1.24</w:t>
             </w:r>
           </w:p>
         </w:tc>
@@ -2587,7 +2652,7 @@
                 <w:color w:val="2A3730"/>
                 <w:sz w:val="18"/>
               </w:rPr>
-              <w:t>1.66</w:t>
+              <w:t>1.33</w:t>
             </w:r>
           </w:p>
         </w:tc>
@@ -2616,7 +2681,7 @@
                 <w:color w:val="2A3730"/>
                 <w:sz w:val="18"/>
               </w:rPr>
-              <w:t>2.08</w:t>
+              <w:t>1.76</w:t>
             </w:r>
           </w:p>
         </w:tc>
@@ -2645,7 +2710,7 @@
                 <w:color w:val="2A3730"/>
                 <w:sz w:val="18"/>
               </w:rPr>
-              <w:t>-0.041</w:t>
+              <w:t>0.260</w:t>
             </w:r>
           </w:p>
         </w:tc>
@@ -2674,7 +2739,7 @@
                 <w:color w:val="2A3730"/>
                 <w:sz w:val="18"/>
               </w:rPr>
-              <w:t>Compared</w:t>
+              <w:t>Best research challenger</w:t>
             </w:r>
           </w:p>
         </w:tc>
@@ -2706,7 +2771,7 @@
                 <w:color w:val="2A3730"/>
                 <w:sz w:val="18"/>
               </w:rPr>
-              <w:t>XGBoost</w:t>
+              <w:t>Gradient Boosting remaining-loss</w:t>
             </w:r>
           </w:p>
         </w:tc>
@@ -2733,7 +2798,7 @@
                 <w:color w:val="2A3730"/>
                 <w:sz w:val="18"/>
               </w:rPr>
-              <w:t>—</w:t>
+              <w:t>1.25</w:t>
             </w:r>
           </w:p>
         </w:tc>
@@ -2760,7 +2825,7 @@
                 <w:color w:val="2A3730"/>
                 <w:sz w:val="18"/>
               </w:rPr>
-              <w:t>—</w:t>
+              <w:t>1.37</w:t>
             </w:r>
           </w:p>
         </w:tc>
@@ -2787,7 +2852,7 @@
                 <w:color w:val="2A3730"/>
                 <w:sz w:val="18"/>
               </w:rPr>
-              <w:t>—</w:t>
+              <w:t>1.78</w:t>
             </w:r>
           </w:p>
         </w:tc>
@@ -2814,7 +2879,7 @@
                 <w:color w:val="2A3730"/>
                 <w:sz w:val="18"/>
               </w:rPr>
-              <w:t>—</w:t>
+              <w:t>0.243</w:t>
             </w:r>
           </w:p>
         </w:tc>
@@ -2841,16 +2906,7 @@
                 <w:color w:val="2A3730"/>
                 <w:sz w:val="18"/>
               </w:rPr>
-              <w:t xml:space="preserve">Declared challenger; unavailable locally because macOS lacks </w:t>
-            </w:r>
-            <w:r>
-              <w:rPr>
-                <w:rFonts w:ascii="Calibri" w:hAnsi="Calibri"/>
-                <w:b/>
-                <w:color w:val="286245"/>
-                <w:sz w:val="17"/>
-              </w:rPr>
-              <w:t>libomp</w:t>
+              <w:t>Compared</w:t>
             </w:r>
           </w:p>
         </w:tc>
@@ -2866,7 +2922,7 @@
         <w:pStyle w:val="Heading3"/>
       </w:pPr>
       <w:r>
-        <w:t>Why ordinary linear regression instead of Ridge?</w:t>
+        <w:t>Why not automatically deploy Huber because its MAE is best?</w:t>
       </w:r>
     </w:p>
     <w:p>
@@ -2879,7 +2935,7 @@
           <w:color w:val="2A3730"/>
           <w:sz w:val="21"/>
         </w:rPr>
-        <w:t xml:space="preserve">We did test both. Under the redesigned nested whole-cycle test, ordinary linear regression improved the historical-mean baseline by </w:t>
+        <w:t xml:space="preserve">Huber improves cycle-balanced MAE by </w:t>
       </w:r>
       <w:r>
         <w:rPr>
@@ -2888,7 +2944,7 @@
           <w:color w:val="2A3730"/>
           <w:sz w:val="21"/>
         </w:rPr>
-        <w:t>14.5%</w:t>
+        <w:t>11.2%</w:t>
       </w:r>
       <w:r>
         <w:rPr>
@@ -2896,7 +2952,7 @@
           <w:color w:val="2A3730"/>
           <w:sz w:val="21"/>
         </w:rPr>
-        <w:t xml:space="preserve"> and kept positive R². Ridge was more regularized, but improved the baseline by only </w:t>
+        <w:t xml:space="preserve"> and keeps positive R², but its rolling-origin cycle MAE is </w:t>
       </w:r>
       <w:r>
         <w:rPr>
@@ -2905,7 +2961,7 @@
           <w:color w:val="2A3730"/>
           <w:sz w:val="21"/>
         </w:rPr>
-        <w:t>8.1%</w:t>
+        <w:t>1.73 points</w:t>
       </w:r>
       <w:r>
         <w:rPr>
@@ -2913,7 +2969,24 @@
           <w:color w:val="2A3730"/>
           <w:sz w:val="21"/>
         </w:rPr>
-        <w:t>, below the approved 10% gate. The evidence therefore favors OLS for the continuous estimate in this release.</w:t>
+        <w:t xml:space="preserve"> versus </w:t>
+      </w:r>
+      <w:r>
+        <w:rPr>
+          <w:rFonts w:ascii="Calibri" w:hAnsi="Calibri"/>
+          <w:b/>
+          <w:color w:val="2A3730"/>
+          <w:sz w:val="21"/>
+        </w:rPr>
+        <w:t>1.35</w:t>
+      </w:r>
+      <w:r>
+        <w:rPr>
+          <w:rFonts w:ascii="Calibri" w:hAnsi="Calibri"/>
+          <w:color w:val="2A3730"/>
+          <w:sz w:val="21"/>
+        </w:rPr>
+        <w:t xml:space="preserve"> for the age-band baseline, and it does not beat the majority rule for identifying the 95% target side. The strict gate therefore keeps the transparent baseline operational while Huber remains the research champion.</w:t>
       </w:r>
     </w:p>
     <w:p>
@@ -2943,7 +3016,7 @@
           <w:color w:val="2A3730"/>
           <w:sz w:val="21"/>
         </w:rPr>
-        <w:t>82.8%</w:t>
+        <w:t>86.1%</w:t>
       </w:r>
       <w:r>
         <w:rPr>
@@ -2951,7 +3024,7 @@
           <w:color w:val="2A3730"/>
           <w:sz w:val="21"/>
         </w:rPr>
-        <w:t>.</w:t>
+        <w:t xml:space="preserve"> for the operational baseline.</w:t>
       </w:r>
     </w:p>
     <w:p>
@@ -3003,7 +3076,7 @@
           <w:color w:val="2A3730"/>
           <w:sz w:val="21"/>
         </w:rPr>
-        <w:t>80.0%</w:t>
+        <w:t>84.0%</w:t>
       </w:r>
       <w:r>
         <w:rPr>
@@ -3011,7 +3084,7 @@
           <w:color w:val="2A3730"/>
           <w:sz w:val="21"/>
         </w:rPr>
-        <w:t xml:space="preserve"> versus an </w:t>
+        <w:t xml:space="preserve">, equal to the </w:t>
       </w:r>
       <w:r>
         <w:rPr>
@@ -3101,7 +3174,7 @@
           <w:color w:val="2A3730"/>
           <w:sz w:val="21"/>
         </w:rPr>
-        <w:t>The largest out-of-fold permutation importances are humidity-band deviation, current survival, flock age, recent mortality, and mortality trend. These are associations that helped prediction on unseen cycles; they do not prove causal treatment effects.</w:t>
+        <w:t>Canary reports held-out permutation importance for the Huber research challenger. These are predictive associations—not proof that changing a factor will cause recovery to improve. The live baseline itself uses only current survival and the age-band historical remaining loss.</w:t>
       </w:r>
     </w:p>
     <w:p>
@@ -3161,7 +3234,7 @@
           <w:color w:val="2A3730"/>
           <w:sz w:val="21"/>
         </w:rPr>
-        <w:t xml:space="preserve"> latest/checkpoint weights; weighing day; weight-to-target ratio; recent and cumulative average daily gain; earlier checkpoint weights available by that date; current survival; environmental-band exposure and freshness.</w:t>
+        <w:t xml:space="preserve"> latest/checkpoint weights; weighing day; weight-to-target ratio; recent and cumulative average daily gain; earlier checkpoint weights available by that date; current survival; mortality; and environmental exposure/freshness.</w:t>
       </w:r>
     </w:p>
     <w:p>
@@ -3451,7 +3524,7 @@
                 <w:color w:val="2A3730"/>
                 <w:sz w:val="19"/>
               </w:rPr>
-              <w:t>Uses the observed building average bodyweight on production Day 35.</w:t>
+              <w:t>Calculates remaining gain: observed Day 35 weight − current checkpoint weight. Final forecast = current weight + predicted remaining gain.</w:t>
             </w:r>
           </w:p>
         </w:tc>
@@ -3755,7 +3828,7 @@
                 <w:color w:val="2A3730"/>
                 <w:sz w:val="19"/>
               </w:rPr>
-              <w:t>Compares the transparent remaining-gain baseline with OLS, Ridge, Gradient Boosting, and declared XGBoost. A learned model must improve cycle-balanced MAE by 10% and reach 70% within 200 g.</w:t>
+              <w:t>Compares historical remaining gain, checkpoint linear, Ridge, robust Huber, and constrained Gradient Boosting. A learned model must improve cycle-balanced MAE by 10%, keep positive R², remain stable, reach 70% within 200 g, and improve target-side usefulness.</w:t>
             </w:r>
           </w:p>
         </w:tc>
@@ -3847,7 +3920,21 @@
           <w:color w:val="286245"/>
           <w:sz w:val="20"/>
         </w:rPr>
-        <w:t>Y = observed average building bodyweight on production Day 35</w:t>
+        <w:t>remaining gain Y = observed Day 35 weight − current checkpoint weight</w:t>
+      </w:r>
+    </w:p>
+    <w:p>
+      <w:pPr>
+        <w:spacing w:before="0" w:after="120" w:line="288" w:lineRule="auto"/>
+      </w:pPr>
+      <w:r>
+        <w:rPr>
+          <w:rFonts w:ascii="Calibri" w:hAnsi="Calibri"/>
+          <w:b/>
+          <w:color w:val="286245"/>
+          <w:sz w:val="20"/>
+        </w:rPr>
+        <w:t>projected Day 35 weight = current checkpoint weight + predicted remaining gain</w:t>
       </w:r>
     </w:p>
     <w:p>
@@ -4369,7 +4456,7 @@
                 <w:color w:val="2A3730"/>
                 <w:sz w:val="18"/>
               </w:rPr>
-              <w:t>Ordinary linear regression</w:t>
+              <w:t>Checkpoint linear remaining-gain</w:t>
             </w:r>
           </w:p>
         </w:tc>
@@ -4398,7 +4485,7 @@
                 <w:color w:val="2A3730"/>
                 <w:sz w:val="18"/>
               </w:rPr>
-              <w:t>217 g</w:t>
+              <w:t>216 g</w:t>
             </w:r>
           </w:p>
         </w:tc>
@@ -4427,7 +4514,7 @@
                 <w:color w:val="2A3730"/>
                 <w:sz w:val="18"/>
               </w:rPr>
-              <w:t>209 g</w:t>
+              <w:t>208 g</w:t>
             </w:r>
           </w:p>
         </w:tc>
@@ -4485,7 +4572,7 @@
                 <w:color w:val="2A3730"/>
                 <w:sz w:val="18"/>
               </w:rPr>
-              <w:t>-0.114</w:t>
+              <w:t>-0.118</w:t>
             </w:r>
           </w:p>
         </w:tc>
@@ -4514,7 +4601,7 @@
                 <w:color w:val="2A3730"/>
                 <w:sz w:val="18"/>
               </w:rPr>
-              <w:t>55.6%</w:t>
+              <w:t>56.5%</w:t>
             </w:r>
           </w:p>
         </w:tc>
@@ -4576,7 +4663,7 @@
                 <w:color w:val="2A3730"/>
                 <w:sz w:val="18"/>
               </w:rPr>
-              <w:t>Ridge regression</w:t>
+              <w:t>Ridge remaining-gain</w:t>
             </w:r>
           </w:p>
         </w:tc>
@@ -4604,7 +4691,7 @@
                 <w:color w:val="2A3730"/>
                 <w:sz w:val="18"/>
               </w:rPr>
-              <w:t>197 g</w:t>
+              <w:t>207 g</w:t>
             </w:r>
           </w:p>
         </w:tc>
@@ -4632,7 +4719,7 @@
                 <w:color w:val="2A3730"/>
                 <w:sz w:val="18"/>
               </w:rPr>
-              <w:t>193 g</w:t>
+              <w:t>200 g</w:t>
             </w:r>
           </w:p>
         </w:tc>
@@ -4660,7 +4747,7 @@
                 <w:color w:val="2A3730"/>
                 <w:sz w:val="18"/>
               </w:rPr>
-              <w:t>252 g</w:t>
+              <w:t>264 g</w:t>
             </w:r>
           </w:p>
         </w:tc>
@@ -4688,7 +4775,7 @@
                 <w:color w:val="2A3730"/>
                 <w:sz w:val="18"/>
               </w:rPr>
-              <w:t>0.048</w:t>
+              <w:t>-0.045</w:t>
             </w:r>
           </w:p>
         </w:tc>
@@ -4716,7 +4803,7 @@
                 <w:color w:val="2A3730"/>
                 <w:sz w:val="18"/>
               </w:rPr>
-              <w:t>60.5%</w:t>
+              <w:t>56.5%</w:t>
             </w:r>
           </w:p>
         </w:tc>
@@ -4744,7 +4831,7 @@
                 <w:color w:val="2A3730"/>
                 <w:sz w:val="18"/>
               </w:rPr>
-              <w:t>Best learned linear challenger</w:t>
+              <w:t>Compared</w:t>
             </w:r>
           </w:p>
         </w:tc>
@@ -4778,7 +4865,7 @@
                 <w:color w:val="2A3730"/>
                 <w:sz w:val="18"/>
               </w:rPr>
-              <w:t>Gradient Boosting</w:t>
+              <w:t>Robust Huber remaining-gain</w:t>
             </w:r>
           </w:p>
         </w:tc>
@@ -4807,7 +4894,7 @@
                 <w:color w:val="2A3730"/>
                 <w:sz w:val="18"/>
               </w:rPr>
-              <w:t>189 g</w:t>
+              <w:t>226 g</w:t>
             </w:r>
           </w:p>
         </w:tc>
@@ -4836,7 +4923,7 @@
                 <w:color w:val="2A3730"/>
                 <w:sz w:val="18"/>
               </w:rPr>
-              <w:t>189 g</w:t>
+              <w:t>223 g</w:t>
             </w:r>
           </w:p>
         </w:tc>
@@ -4865,7 +4952,7 @@
                 <w:color w:val="2A3730"/>
                 <w:sz w:val="18"/>
               </w:rPr>
-              <w:t>256 g</w:t>
+              <w:t>276 g</w:t>
             </w:r>
           </w:p>
         </w:tc>
@@ -4894,7 +4981,7 @@
                 <w:color w:val="2A3730"/>
                 <w:sz w:val="18"/>
               </w:rPr>
-              <w:t>0.018</w:t>
+              <w:t>-0.144</w:t>
             </w:r>
           </w:p>
         </w:tc>
@@ -4923,7 +5010,7 @@
                 <w:color w:val="2A3730"/>
                 <w:sz w:val="18"/>
               </w:rPr>
-              <w:t>58.1%</w:t>
+              <w:t>51.6%</w:t>
             </w:r>
           </w:p>
         </w:tc>
@@ -4984,7 +5071,7 @@
                 <w:color w:val="2A3730"/>
                 <w:sz w:val="18"/>
               </w:rPr>
-              <w:t>XGBoost</w:t>
+              <w:t>Gradient Boosting remaining-gain</w:t>
             </w:r>
           </w:p>
         </w:tc>
@@ -5011,7 +5098,7 @@
                 <w:color w:val="2A3730"/>
                 <w:sz w:val="18"/>
               </w:rPr>
-              <w:t>—</w:t>
+              <w:t>203 g</w:t>
             </w:r>
           </w:p>
         </w:tc>
@@ -5038,7 +5125,7 @@
                 <w:color w:val="2A3730"/>
                 <w:sz w:val="18"/>
               </w:rPr>
-              <w:t>—</w:t>
+              <w:t>207 g</w:t>
             </w:r>
           </w:p>
         </w:tc>
@@ -5065,7 +5152,7 @@
                 <w:color w:val="2A3730"/>
                 <w:sz w:val="18"/>
               </w:rPr>
-              <w:t>—</w:t>
+              <w:t>262 g</w:t>
             </w:r>
           </w:p>
         </w:tc>
@@ -5092,7 +5179,7 @@
                 <w:color w:val="2A3730"/>
                 <w:sz w:val="18"/>
               </w:rPr>
-              <w:t>—</w:t>
+              <w:t>-0.026</w:t>
             </w:r>
           </w:p>
         </w:tc>
@@ -5119,7 +5206,7 @@
                 <w:color w:val="2A3730"/>
                 <w:sz w:val="18"/>
               </w:rPr>
-              <w:t>—</w:t>
+              <w:t>52.4%</w:t>
             </w:r>
           </w:p>
         </w:tc>
@@ -5146,16 +5233,7 @@
                 <w:color w:val="2A3730"/>
                 <w:sz w:val="18"/>
               </w:rPr>
-              <w:t xml:space="preserve">Declared challenger; unavailable locally because macOS lacks </w:t>
-            </w:r>
-            <w:r>
-              <w:rPr>
-                <w:rFonts w:ascii="Calibri" w:hAnsi="Calibri"/>
-                <w:b/>
-                <w:color w:val="286245"/>
-                <w:sz w:val="17"/>
-              </w:rPr>
-              <w:t>libomp</w:t>
+              <w:t>Best nonlinear challenger</w:t>
             </w:r>
           </w:p>
         </w:tc>
@@ -5246,7 +5324,7 @@
         <w:pStyle w:val="Heading3"/>
       </w:pPr>
       <w:r>
-        <w:t>Why not use Ridge as the live model?</w:t>
+        <w:t>Why not use a learned model as the live method?</w:t>
       </w:r>
     </w:p>
     <w:p>
@@ -5259,62 +5337,28 @@
           <w:color w:val="2A3730"/>
           <w:sz w:val="21"/>
         </w:rPr>
-        <w:t xml:space="preserve">Ridge is explainable and has positive R², but it is </w:t>
+        <w:t>All learned challengers have negative whole-cycle R² and higher cycle-balanced MAE than the historical remaining-gain baseline. The approved gate requires at least 10% improvement, positive R², stability, and at least 70% within 200 g. Using the baseline is therefore the honest, defensible choice.</w:t>
       </w:r>
+    </w:p>
+    <w:p>
+      <w:pPr>
+        <w:pStyle w:val="Heading3"/>
+      </w:pPr>
       <w:r>
-        <w:rPr>
-          <w:rFonts w:ascii="Calibri" w:hAnsi="Calibri"/>
-          <w:b/>
-          <w:color w:val="2A3730"/>
-          <w:sz w:val="21"/>
-        </w:rPr>
-        <w:t>5.7% worse</w:t>
+        <w:t>What drives the live weight projection?</w:t>
       </w:r>
+    </w:p>
+    <w:p>
+      <w:pPr>
+        <w:spacing w:before="0" w:after="120" w:line="288" w:lineRule="auto"/>
+      </w:pPr>
       <w:r>
         <w:rPr>
           <w:rFonts w:ascii="Calibri" w:hAnsi="Calibri"/>
           <w:color w:val="2A3730"/>
           <w:sz w:val="21"/>
         </w:rPr>
-        <w:t xml:space="preserve"> than historical remaining gain on cycle-balanced MAE and reaches only </w:t>
-      </w:r>
-      <w:r>
-        <w:rPr>
-          <w:rFonts w:ascii="Calibri" w:hAnsi="Calibri"/>
-          <w:b/>
-          <w:color w:val="2A3730"/>
-          <w:sz w:val="21"/>
-        </w:rPr>
-        <w:t>60.5% within 200 g</w:t>
-      </w:r>
-      <w:r>
-        <w:rPr>
-          <w:rFonts w:ascii="Calibri" w:hAnsi="Calibri"/>
-          <w:color w:val="2A3730"/>
-          <w:sz w:val="21"/>
-        </w:rPr>
-        <w:t>. The approved gate requires at least 10% improvement and at least 70% within 200 g. Using the baseline is therefore the honest, defensible choice.</w:t>
-      </w:r>
-    </w:p>
-    <w:p>
-      <w:pPr>
-        <w:pStyle w:val="Heading3"/>
-      </w:pPr>
-      <w:r>
-        <w:t>What drives the live weight projection?</w:t>
-      </w:r>
-    </w:p>
-    <w:p>
-      <w:pPr>
-        <w:spacing w:before="0" w:after="120" w:line="288" w:lineRule="auto"/>
-      </w:pPr>
-      <w:r>
-        <w:rPr>
-          <w:rFonts w:ascii="Calibri" w:hAnsi="Calibri"/>
-          <w:color w:val="2A3730"/>
-          <w:sz w:val="21"/>
-        </w:rPr>
-        <w:t xml:space="preserve">The live formula uses three direct items: the latest measured weight, its measurement day, and the average historical remaining gain for that checkpoint age. Ridge coefficients may be shown as research evidence about the best learned challenger, but they do </w:t>
+        <w:t xml:space="preserve">The live formula uses three direct items: latest measured weight, its measurement day, and the average historical remaining gain for that checkpoint. Learned-model importances may be shown as research evidence, but they do </w:t>
       </w:r>
       <w:r>
         <w:rPr>
@@ -6484,7 +6528,7 @@
           <w:color w:val="2A3730"/>
           <w:sz w:val="21"/>
         </w:rPr>
-        <w:t>They are useful as validated prototype estimates, not guarantees. Recovery passes its continuous-estimate gate but not classification. Weight learned models fail the replacement gates, so Canary uses the transparent baseline.</w:t>
+        <w:t>They are useful as validated prototype estimates, not guarantees. The recovery Huber challenger passes the continuous-error gate but not the full deployment gate; Canary therefore keeps the transparent age-band fallback. Weight learned models also fail the replacement gates, so Canary uses historical remaining gain.</w:t>
       </w:r>
     </w:p>
     <w:p>

</xml_diff>

<commit_message>
Integrate Trish v18 models and finalize Canary decision support
</commit_message>
<xml_diff>
--- a/docs/Project_Canary_Defense_Cheat_Sheet.docx
+++ b/docs/Project_Canary_Defense_Cheat_Sheet.docx
@@ -132,7 +132,7 @@
                 <w:color w:val="173F31"/>
                 <w:sz w:val="21"/>
               </w:rPr>
-              <w:t>Updated 11 August 2026. Use this as the shared answer key for the dashboard, notebooks, model files, and presentation.</w:t>
+              <w:t>Updated 12 August 2026. Use this as the shared answer key for the dashboard, notebooks, model files, and presentation.</w:t>
             </w:r>
           </w:p>
         </w:tc>
@@ -169,7 +169,20 @@
           <w:color w:val="2A3730"/>
           <w:sz w:val="21"/>
         </w:rPr>
-        <w:t>Project Canary is an early-warning and decision-support system for a broiler farm. It identifies buildings that need attention, explains the recorded warning signs, estimates harvest recovery and Day 35 average weight, and links confirmed operating patterns to Doc Raymond’s action playbook.</w:t>
+        <w:t>Project Canary is an early-warning and decision-support system for a broiler farm. Its purpose is to help make production outcomes more consistent by giving management earlier visibility of buildings that are going off-track. It identifies recorded warning signs, estimates harvest recovery and Day 35 average weight, and links confirmed operating patterns to Doc Raymond’s action playbook.</w:t>
+      </w:r>
+    </w:p>
+    <w:p>
+      <w:pPr>
+        <w:spacing w:before="0" w:after="120" w:line="288" w:lineRule="auto"/>
+      </w:pPr>
+      <w:r>
+        <w:rPr>
+          <w:rFonts w:ascii="Calibri" w:hAnsi="Calibri"/>
+          <w:color w:val="2A3730"/>
+          <w:sz w:val="21"/>
+        </w:rPr>
+        <w:t>Canary does not directly control mortality or growth. Its value is earlier visibility, so management can investigate and intervene before weak daily signals become final outcomes.</w:t>
       </w:r>
     </w:p>
     <w:p>
@@ -191,7 +204,54 @@
           <w:color w:val="2A3730"/>
           <w:sz w:val="21"/>
         </w:rPr>
-        <w:t>Which buildings need attention today, why, what harvest recovery and Day 35 weight should we expect, and what should management check next?</w:t>
+        <w:t>How can the farm make production outcomes more consistent? Specifically: which buildings are going off-track, what evidence explains the concern, what harvest recovery and Day 35 weight are currently expected, and what should management check first?</w:t>
+      </w:r>
+    </w:p>
+    <w:p>
+      <w:pPr>
+        <w:spacing w:before="0" w:after="120" w:line="288" w:lineRule="auto"/>
+      </w:pPr>
+      <w:r>
+        <w:rPr>
+          <w:rFonts w:ascii="Calibri" w:hAnsi="Calibri"/>
+          <w:color w:val="2A3730"/>
+          <w:sz w:val="21"/>
+        </w:rPr>
+        <w:t xml:space="preserve">The Day 35 weight milestone is </w:t>
+      </w:r>
+      <w:r>
+        <w:rPr>
+          <w:rFonts w:ascii="Calibri" w:hAnsi="Calibri"/>
+          <w:b/>
+          <w:color w:val="2A3730"/>
+          <w:sz w:val="21"/>
+        </w:rPr>
+        <w:t>1,800 g</w:t>
+      </w:r>
+      <w:r>
+        <w:rPr>
+          <w:rFonts w:ascii="Calibri" w:hAnsi="Calibri"/>
+          <w:color w:val="2A3730"/>
+          <w:sz w:val="21"/>
+        </w:rPr>
+        <w:t xml:space="preserve">; the harvest-recovery goal is </w:t>
+      </w:r>
+      <w:r>
+        <w:rPr>
+          <w:rFonts w:ascii="Calibri" w:hAnsi="Calibri"/>
+          <w:b/>
+          <w:color w:val="2A3730"/>
+          <w:sz w:val="21"/>
+        </w:rPr>
+        <w:t>95%</w:t>
+      </w:r>
+      <w:r>
+        <w:rPr>
+          <w:rFonts w:ascii="Calibri" w:hAnsi="Calibri"/>
+          <w:color w:val="2A3730"/>
+          <w:sz w:val="21"/>
+        </w:rPr>
+        <w:t>. Day 14 is the principal early-warning checkpoint, but Canary continues updating through Day 35 and harvest.</w:t>
       </w:r>
     </w:p>
     <w:p>
@@ -298,7 +358,7 @@
           <w:color w:val="2A3730"/>
           <w:sz w:val="21"/>
         </w:rPr>
-        <w:t xml:space="preserve"> 1,785 source rows became </w:t>
+        <w:t xml:space="preserve"> The newest workbook contains </w:t>
       </w:r>
       <w:r>
         <w:rPr>
@@ -307,7 +367,7 @@
           <w:color w:val="2A3730"/>
           <w:sz w:val="21"/>
         </w:rPr>
-        <w:t>1,666 unique building-day records</w:t>
+        <w:t>1,624 unique building-day records with no duplicate building-day keys</w:t>
       </w:r>
       <w:r>
         <w:rPr>
@@ -315,7 +375,7 @@
           <w:color w:val="2A3730"/>
           <w:sz w:val="21"/>
         </w:rPr>
-        <w:t xml:space="preserve"> after repeated Zone A/B environment rows were consolidated.</w:t>
+        <w:t>. The row count fell because unsupported forward-filled Days 36–49 were removed from 2026-3; this prevents Day 35 population from being mistaken for a later harvest endpoint.</w:t>
       </w:r>
     </w:p>
     <w:p>
@@ -329,53 +389,6 @@
           <w:sz w:val="21"/>
         </w:rPr>
         <w:t xml:space="preserve"> Recovery: </w:t>
-      </w:r>
-      <w:r>
-        <w:rPr>
-          <w:rFonts w:ascii="Calibri" w:hAnsi="Calibri"/>
-          <w:b/>
-          <w:color w:val="2A3730"/>
-          <w:sz w:val="21"/>
-        </w:rPr>
-        <w:t>25 independent building-cycle outcomes</w:t>
-      </w:r>
-      <w:r>
-        <w:rPr>
-          <w:rFonts w:ascii="Calibri" w:hAnsi="Calibri"/>
-          <w:color w:val="2A3730"/>
-          <w:sz w:val="21"/>
-        </w:rPr>
-        <w:t xml:space="preserve">, represented by </w:t>
-      </w:r>
-      <w:r>
-        <w:rPr>
-          <w:rFonts w:ascii="Calibri" w:hAnsi="Calibri"/>
-          <w:b/>
-          <w:color w:val="2A3730"/>
-          <w:sz w:val="21"/>
-        </w:rPr>
-        <w:t>122 balanced decision snapshots</w:t>
-      </w:r>
-      <w:r>
-        <w:rPr>
-          <w:rFonts w:ascii="Calibri" w:hAnsi="Calibri"/>
-          <w:color w:val="2A3730"/>
-          <w:sz w:val="21"/>
-        </w:rPr>
-        <w:t>; 1,122 leakage-safe daily snapshots are retained for audit.</w:t>
-      </w:r>
-    </w:p>
-    <w:p>
-      <w:pPr>
-        <w:pStyle w:val="ListBullet"/>
-      </w:pPr>
-      <w:r>
-        <w:rPr>
-          <w:rFonts w:ascii="Calibri" w:hAnsi="Calibri"/>
-          <w:color w:val="2A3730"/>
-          <w:sz w:val="21"/>
-        </w:rPr>
-        <w:t xml:space="preserve"> Day 35 weight: </w:t>
       </w:r>
       <w:r>
         <w:rPr>
@@ -401,6 +414,53 @@
           <w:color w:val="2A3730"/>
           <w:sz w:val="21"/>
         </w:rPr>
+        <w:t>151 balanced decision snapshots</w:t>
+      </w:r>
+      <w:r>
+        <w:rPr>
+          <w:rFonts w:ascii="Calibri" w:hAnsi="Calibri"/>
+          <w:color w:val="2A3730"/>
+          <w:sz w:val="21"/>
+        </w:rPr>
+        <w:t>; 1,355 leakage-safe daily snapshots are retained for audit.</w:t>
+      </w:r>
+    </w:p>
+    <w:p>
+      <w:pPr>
+        <w:pStyle w:val="ListBullet"/>
+      </w:pPr>
+      <w:r>
+        <w:rPr>
+          <w:rFonts w:ascii="Calibri" w:hAnsi="Calibri"/>
+          <w:color w:val="2A3730"/>
+          <w:sz w:val="21"/>
+        </w:rPr>
+        <w:t xml:space="preserve"> Day 35 weight: </w:t>
+      </w:r>
+      <w:r>
+        <w:rPr>
+          <w:rFonts w:ascii="Calibri" w:hAnsi="Calibri"/>
+          <w:b/>
+          <w:color w:val="2A3730"/>
+          <w:sz w:val="21"/>
+        </w:rPr>
+        <w:t>31 independent building-cycle outcomes</w:t>
+      </w:r>
+      <w:r>
+        <w:rPr>
+          <w:rFonts w:ascii="Calibri" w:hAnsi="Calibri"/>
+          <w:color w:val="2A3730"/>
+          <w:sz w:val="21"/>
+        </w:rPr>
+        <w:t xml:space="preserve">, represented by </w:t>
+      </w:r>
+      <w:r>
+        <w:rPr>
+          <w:rFonts w:ascii="Calibri" w:hAnsi="Calibri"/>
+          <w:b/>
+          <w:color w:val="2A3730"/>
+          <w:sz w:val="21"/>
+        </w:rPr>
         <w:t>124 Day 7/14/21/28 checkpoint rows</w:t>
       </w:r>
       <w:r>
@@ -554,7 +614,7 @@
           <w:color w:val="2A3730"/>
           <w:sz w:val="21"/>
         </w:rPr>
-        <w:t xml:space="preserve"> the operational method is the </w:t>
+        <w:t xml:space="preserve"> </w:t>
       </w:r>
       <w:r>
         <w:rPr>
@@ -563,7 +623,7 @@
           <w:color w:val="2A3730"/>
           <w:sz w:val="21"/>
         </w:rPr>
-        <w:t>age-band remaining-loss baseline</w:t>
+        <w:t>ordinary linear remaining-loss regression</w:t>
       </w:r>
       <w:r>
         <w:rPr>
@@ -571,7 +631,7 @@
           <w:color w:val="2A3730"/>
           <w:sz w:val="21"/>
         </w:rPr>
-        <w:t xml:space="preserve">. Whole-cycle MAE is </w:t>
+        <w:t xml:space="preserve"> is the operational continuous-estimate model. Whole-cycle MAE is </w:t>
       </w:r>
       <w:r>
         <w:rPr>
@@ -580,7 +640,7 @@
           <w:color w:val="2A3730"/>
           <w:sz w:val="21"/>
         </w:rPr>
-        <w:t>1.40 percentage points</w:t>
+        <w:t>1.74 percentage points</w:t>
       </w:r>
       <w:r>
         <w:rPr>
@@ -597,7 +657,7 @@
           <w:color w:val="2A3730"/>
           <w:sz w:val="21"/>
         </w:rPr>
-        <w:t>1.50 points</w:t>
+        <w:t>1.76 points</w:t>
       </w:r>
       <w:r>
         <w:rPr>
@@ -614,7 +674,7 @@
           <w:color w:val="2A3730"/>
           <w:sz w:val="21"/>
         </w:rPr>
-        <w:t>1.80 points</w:t>
+        <w:t>2.57 points</w:t>
       </w:r>
       <w:r>
         <w:rPr>
@@ -631,7 +691,7 @@
           <w:color w:val="2A3730"/>
           <w:sz w:val="21"/>
         </w:rPr>
-        <w:t>0.222</w:t>
+        <w:t>0.054</w:t>
       </w:r>
       <w:r>
         <w:rPr>
@@ -639,7 +699,7 @@
           <w:color w:val="2A3730"/>
           <w:sz w:val="21"/>
         </w:rPr>
-        <w:t>. Robust Huber is the best learned research challenger (</w:t>
+        <w:t xml:space="preserve">. It improves cycle-balanced MAE by </w:t>
       </w:r>
       <w:r>
         <w:rPr>
@@ -648,7 +708,7 @@
           <w:color w:val="2A3730"/>
           <w:sz w:val="21"/>
         </w:rPr>
-        <w:t>1.24-point MAE, R² 0.260</w:t>
+        <w:t>16.1%</w:t>
       </w:r>
       <w:r>
         <w:rPr>
@@ -656,7 +716,24 @@
           <w:color w:val="2A3730"/>
           <w:sz w:val="21"/>
         </w:rPr>
-        <w:t>) but remains experimental because it fails the 95% classification gate and is less stable under rolling-origin validation.</w:t>
+        <w:t xml:space="preserve"> over the refreshed age-band baseline and is effectively tied with Ridge while remaining simpler to explain. It remains experimental because at/above-95% recall is only </w:t>
+      </w:r>
+      <w:r>
+        <w:rPr>
+          <w:rFonts w:ascii="Calibri" w:hAnsi="Calibri"/>
+          <w:b/>
+          <w:color w:val="2A3730"/>
+          <w:sz w:val="21"/>
+        </w:rPr>
+        <w:t>21.1%</w:t>
+      </w:r>
+      <w:r>
+        <w:rPr>
+          <w:rFonts w:ascii="Calibri" w:hAnsi="Calibri"/>
+          <w:color w:val="2A3730"/>
+          <w:sz w:val="21"/>
+        </w:rPr>
+        <w:t>.</w:t>
       </w:r>
     </w:p>
     <w:p>
@@ -793,6 +870,70 @@
     </w:p>
     <w:p>
       <w:pPr>
+        <w:pStyle w:val="ListBullet"/>
+      </w:pPr>
+      <w:r>
+        <w:rPr>
+          <w:rFonts w:ascii="Calibri" w:hAnsi="Calibri"/>
+          <w:color w:val="2A3730"/>
+          <w:sz w:val="21"/>
+        </w:rPr>
+        <w:t xml:space="preserve"> </w:t>
+      </w:r>
+      <w:r>
+        <w:rPr>
+          <w:rFonts w:ascii="Calibri" w:hAnsi="Calibri"/>
+          <w:b/>
+          <w:color w:val="2A3730"/>
+          <w:sz w:val="21"/>
+        </w:rPr>
+        <w:t>Later 2026-3 audit:</w:t>
+      </w:r>
+      <w:r>
+        <w:rPr>
+          <w:rFonts w:ascii="Calibri" w:hAnsi="Calibri"/>
+          <w:color w:val="2A3730"/>
+          <w:sz w:val="21"/>
+        </w:rPr>
+        <w:t xml:space="preserve"> weight was encouraging at </w:t>
+      </w:r>
+      <w:r>
+        <w:rPr>
+          <w:rFonts w:ascii="Calibri" w:hAnsi="Calibri"/>
+          <w:b/>
+          <w:color w:val="2A3730"/>
+          <w:sz w:val="21"/>
+        </w:rPr>
+        <w:t>63 g MAE</w:t>
+      </w:r>
+      <w:r>
+        <w:rPr>
+          <w:rFonts w:ascii="Calibri" w:hAnsi="Calibri"/>
+          <w:color w:val="2A3730"/>
+          <w:sz w:val="21"/>
+        </w:rPr>
+        <w:t xml:space="preserve"> across 12 checkpoint forecasts, but recovery was weak at </w:t>
+      </w:r>
+      <w:r>
+        <w:rPr>
+          <w:rFonts w:ascii="Calibri" w:hAnsi="Calibri"/>
+          <w:b/>
+          <w:color w:val="2A3730"/>
+          <w:sz w:val="21"/>
+        </w:rPr>
+        <w:t>4.08 percentage-point MAE</w:t>
+      </w:r>
+      <w:r>
+        <w:rPr>
+          <w:rFonts w:ascii="Calibri" w:hAnsi="Calibri"/>
+          <w:color w:val="2A3730"/>
+          <w:sz w:val="21"/>
+        </w:rPr>
+        <w:t xml:space="preserve"> and biased low. These three later buildings were excluded from all model selection. The recovery result is a clear warning that more completed cycles and a verified harvest endpoint are needed.</w:t>
+      </w:r>
+    </w:p>
+    <w:p>
+      <w:pPr>
         <w:pStyle w:val="Heading3"/>
       </w:pPr>
       <w:r>
@@ -826,7 +967,7 @@
           <w:color w:val="2A3730"/>
           <w:sz w:val="21"/>
         </w:rPr>
-        <w:t>, not a production guarantee. Recovery is useful directionally as a continuous estimate. Day 35 weight uses the more defensible transparent fallback because the learned models do not yet improve enough on unseen cycles.</w:t>
+        <w:t>, not a production guarantee. Recovery is useful directionally as a continuous estimate, but its low held-out R² means most across-cycle variation remains unexplained. Day 35 weight uses the more defensible transparent fallback because learned models still do not improve enough on unseen cycles.</w:t>
       </w:r>
     </w:p>
     <w:p>
@@ -985,7 +1126,7 @@
           <w:color w:val="2A3730"/>
           <w:sz w:val="21"/>
         </w:rPr>
-        <w:t xml:space="preserve"> Only 25–31 independent outcomes are available.</w:t>
+        <w:t xml:space="preserve"> Only 31 independent outcomes are available.</w:t>
       </w:r>
     </w:p>
     <w:p>
@@ -1162,7 +1303,7 @@
           <w:color w:val="2A3730"/>
           <w:sz w:val="21"/>
         </w:rPr>
-        <w:t xml:space="preserve"> Y is a last-recorded recovery proxy, only five historical cycles are available, and the model cannot yet distinguish 95% hits from misses better than the majority rule.</w:t>
+        <w:t xml:space="preserve"> Y is a last-recorded recovery proxy, only six historical cycles are available, and the model strongly recognizes below-target cases but still misses most at/above-95% cases.</w:t>
       </w:r>
     </w:p>
     <w:p>
@@ -1756,6 +1897,458 @@
         <w:pStyle w:val="Heading3"/>
       </w:pPr>
       <w:r>
+        <w:t>Memorize: what “held-out cycle” means</w:t>
+      </w:r>
+    </w:p>
+    <w:p>
+      <w:pPr>
+        <w:spacing w:before="0" w:after="120" w:line="288" w:lineRule="auto"/>
+      </w:pPr>
+      <w:r>
+        <w:rPr>
+          <w:rFonts w:ascii="Calibri" w:hAnsi="Calibri"/>
+          <w:color w:val="2A3730"/>
+          <w:sz w:val="21"/>
+        </w:rPr>
+        <w:t xml:space="preserve">Recovery uses six complete-cycle folds: </w:t>
+      </w:r>
+      <w:r>
+        <w:rPr>
+          <w:rFonts w:ascii="Calibri" w:hAnsi="Calibri"/>
+          <w:b/>
+          <w:color w:val="2A3730"/>
+          <w:sz w:val="21"/>
+        </w:rPr>
+        <w:t>2025-2, 2025-3, 2025-4, 2025-5, 2026-1, and 2026-2</w:t>
+      </w:r>
+      <w:r>
+        <w:rPr>
+          <w:rFonts w:ascii="Calibri" w:hAnsi="Calibri"/>
+          <w:color w:val="2A3730"/>
+          <w:sz w:val="21"/>
+        </w:rPr>
+        <w:t>. In each test, every building from one named cycle is removed, Canary learns from the other cycles, and then it predicts the excluded cycle as if it were new. The current 2026-3 cycle is never part of historical model selection. The weight model uses the same six historical folds; its newly observed 2026-3 weights are reserved as a small prospective audit.</w:t>
+      </w:r>
+    </w:p>
+    <w:p>
+      <w:pPr>
+        <w:spacing w:before="0" w:after="120" w:line="288" w:lineRule="auto"/>
+      </w:pPr>
+      <w:r>
+        <w:rPr>
+          <w:rFonts w:ascii="Calibri" w:hAnsi="Calibri"/>
+          <w:color w:val="2A3730"/>
+          <w:sz w:val="21"/>
+        </w:rPr>
+        <w:t>This applies to predictive models. Risk alerts are transparent rules, so they are replayed using a historical review date rather than trained and held out.</w:t>
+      </w:r>
+    </w:p>
+    <w:p>
+      <w:pPr>
+        <w:pStyle w:val="Heading3"/>
+      </w:pPr>
+      <w:r>
+        <w:t>Memorize: Day 14 retrospective</w:t>
+      </w:r>
+    </w:p>
+    <w:p>
+      <w:pPr>
+        <w:numPr>
+          <w:ilvl w:val="0"/>
+          <w:numId w:val="13"/>
+        </w:numPr>
+        <w:spacing w:before="0" w:after="60" w:line="283" w:lineRule="auto"/>
+      </w:pPr>
+      <w:r>
+        <w:rPr>
+          <w:rFonts w:ascii="Calibri" w:hAnsi="Calibri"/>
+          <w:color w:val="2A3730"/>
+          <w:sz w:val="21"/>
+        </w:rPr>
+        <w:t>Freeze each completed building at Day 14.</w:t>
+      </w:r>
+    </w:p>
+    <w:p>
+      <w:pPr>
+        <w:numPr>
+          <w:ilvl w:val="0"/>
+          <w:numId w:val="13"/>
+        </w:numPr>
+        <w:spacing w:before="0" w:after="60" w:line="283" w:lineRule="auto"/>
+      </w:pPr>
+      <w:r>
+        <w:rPr>
+          <w:rFonts w:ascii="Calibri" w:hAnsi="Calibri"/>
+          <w:color w:val="2A3730"/>
+          <w:sz w:val="21"/>
+        </w:rPr>
+        <w:t>Remove its entire cycle from training.</w:t>
+      </w:r>
+    </w:p>
+    <w:p>
+      <w:pPr>
+        <w:numPr>
+          <w:ilvl w:val="0"/>
+          <w:numId w:val="13"/>
+        </w:numPr>
+        <w:spacing w:before="0" w:after="60" w:line="283" w:lineRule="auto"/>
+      </w:pPr>
+      <w:r>
+        <w:rPr>
+          <w:rFonts w:ascii="Calibri" w:hAnsi="Calibri"/>
+          <w:color w:val="2A3730"/>
+          <w:sz w:val="21"/>
+        </w:rPr>
+        <w:t>Estimate the additional loss after Day 14 from the other cycles.</w:t>
+      </w:r>
+    </w:p>
+    <w:p>
+      <w:pPr>
+        <w:numPr>
+          <w:ilvl w:val="0"/>
+          <w:numId w:val="13"/>
+        </w:numPr>
+        <w:spacing w:before="0" w:after="60" w:line="283" w:lineRule="auto"/>
+      </w:pPr>
+      <w:r>
+        <w:rPr>
+          <w:rFonts w:ascii="Calibri" w:hAnsi="Calibri"/>
+          <w:color w:val="2A3730"/>
+          <w:sz w:val="21"/>
+        </w:rPr>
+        <w:t xml:space="preserve">Calculate </w:t>
+      </w:r>
+      <w:r>
+        <w:rPr>
+          <w:rFonts w:ascii="Calibri" w:hAnsi="Calibri"/>
+          <w:b/>
+          <w:color w:val="286245"/>
+          <w:sz w:val="20"/>
+        </w:rPr>
+        <w:t>Day 14 survival − expected remaining loss</w:t>
+      </w:r>
+      <w:r>
+        <w:rPr>
+          <w:rFonts w:ascii="Calibri" w:hAnsi="Calibri"/>
+          <w:color w:val="2A3730"/>
+          <w:sz w:val="21"/>
+        </w:rPr>
+        <w:t>.</w:t>
+      </w:r>
+    </w:p>
+    <w:p>
+      <w:pPr>
+        <w:numPr>
+          <w:ilvl w:val="0"/>
+          <w:numId w:val="13"/>
+        </w:numPr>
+        <w:spacing w:before="0" w:after="60" w:line="283" w:lineRule="auto"/>
+      </w:pPr>
+      <w:r>
+        <w:rPr>
+          <w:rFonts w:ascii="Calibri" w:hAnsi="Calibri"/>
+          <w:color w:val="2A3730"/>
+          <w:sz w:val="21"/>
+        </w:rPr>
+        <w:t xml:space="preserve">Compare with </w:t>
+      </w:r>
+      <w:r>
+        <w:rPr>
+          <w:rFonts w:ascii="Calibri" w:hAnsi="Calibri"/>
+          <w:b/>
+          <w:color w:val="286245"/>
+          <w:sz w:val="20"/>
+        </w:rPr>
+        <w:t>last-recorded population ÷ beginning population</w:t>
+      </w:r>
+      <w:r>
+        <w:rPr>
+          <w:rFonts w:ascii="Calibri" w:hAnsi="Calibri"/>
+          <w:color w:val="2A3730"/>
+          <w:sz w:val="21"/>
+        </w:rPr>
+        <w:t>.</w:t>
+      </w:r>
+    </w:p>
+    <w:p>
+      <w:pPr>
+        <w:spacing w:before="0" w:after="120" w:line="288" w:lineRule="auto"/>
+      </w:pPr>
+      <w:r>
+        <w:rPr>
+          <w:rFonts w:ascii="Calibri" w:hAnsi="Calibri"/>
+          <w:color w:val="2A3730"/>
+          <w:sz w:val="21"/>
+        </w:rPr>
+        <w:t xml:space="preserve">Example — </w:t>
+      </w:r>
+      <w:r>
+        <w:rPr>
+          <w:rFonts w:ascii="Calibri" w:hAnsi="Calibri"/>
+          <w:b/>
+          <w:color w:val="2A3730"/>
+          <w:sz w:val="21"/>
+        </w:rPr>
+        <w:t>2025-2 Tags 1</w:t>
+      </w:r>
+      <w:r>
+        <w:rPr>
+          <w:rFonts w:ascii="Calibri" w:hAnsi="Calibri"/>
+          <w:color w:val="2A3730"/>
+          <w:sz w:val="21"/>
+        </w:rPr>
+        <w:t xml:space="preserve">: projected </w:t>
+      </w:r>
+      <w:r>
+        <w:rPr>
+          <w:rFonts w:ascii="Calibri" w:hAnsi="Calibri"/>
+          <w:b/>
+          <w:color w:val="2A3730"/>
+          <w:sz w:val="21"/>
+        </w:rPr>
+        <w:t>92.75%</w:t>
+      </w:r>
+      <w:r>
+        <w:rPr>
+          <w:rFonts w:ascii="Calibri" w:hAnsi="Calibri"/>
+          <w:color w:val="2A3730"/>
+          <w:sz w:val="21"/>
+        </w:rPr>
+        <w:t xml:space="preserve">, recorded proxy </w:t>
+      </w:r>
+      <w:r>
+        <w:rPr>
+          <w:rFonts w:ascii="Calibri" w:hAnsi="Calibri"/>
+          <w:b/>
+          <w:color w:val="2A3730"/>
+          <w:sz w:val="21"/>
+        </w:rPr>
+        <w:t>94.28%</w:t>
+      </w:r>
+      <w:r>
+        <w:rPr>
+          <w:rFonts w:ascii="Calibri" w:hAnsi="Calibri"/>
+          <w:color w:val="2A3730"/>
+          <w:sz w:val="21"/>
+        </w:rPr>
+        <w:t xml:space="preserve">, error </w:t>
+      </w:r>
+      <w:r>
+        <w:rPr>
+          <w:rFonts w:ascii="Calibri" w:hAnsi="Calibri"/>
+          <w:b/>
+          <w:color w:val="2A3730"/>
+          <w:sz w:val="21"/>
+        </w:rPr>
+        <w:t>−1.53 points</w:t>
+      </w:r>
+      <w:r>
+        <w:rPr>
+          <w:rFonts w:ascii="Calibri" w:hAnsi="Calibri"/>
+          <w:color w:val="2A3730"/>
+          <w:sz w:val="21"/>
+        </w:rPr>
+        <w:t>.</w:t>
+      </w:r>
+    </w:p>
+    <w:p>
+      <w:pPr>
+        <w:spacing w:before="0" w:after="120" w:line="288" w:lineRule="auto"/>
+      </w:pPr>
+      <w:r>
+        <w:rPr>
+          <w:rFonts w:ascii="Calibri" w:hAnsi="Calibri"/>
+          <w:color w:val="2A3730"/>
+          <w:sz w:val="21"/>
+        </w:rPr>
+        <w:t xml:space="preserve">Day 14 recovery results: </w:t>
+      </w:r>
+      <w:r>
+        <w:rPr>
+          <w:rFonts w:ascii="Calibri" w:hAnsi="Calibri"/>
+          <w:b/>
+          <w:color w:val="2A3730"/>
+          <w:sz w:val="21"/>
+        </w:rPr>
+        <w:t>MAE 1.95 points</w:t>
+      </w:r>
+      <w:r>
+        <w:rPr>
+          <w:rFonts w:ascii="Calibri" w:hAnsi="Calibri"/>
+          <w:color w:val="2A3730"/>
+          <w:sz w:val="21"/>
+        </w:rPr>
+        <w:t xml:space="preserve">, </w:t>
+      </w:r>
+      <w:r>
+        <w:rPr>
+          <w:rFonts w:ascii="Calibri" w:hAnsi="Calibri"/>
+          <w:b/>
+          <w:color w:val="2A3730"/>
+          <w:sz w:val="21"/>
+        </w:rPr>
+        <w:t>RMSE 2.71 points</w:t>
+      </w:r>
+      <w:r>
+        <w:rPr>
+          <w:rFonts w:ascii="Calibri" w:hAnsi="Calibri"/>
+          <w:color w:val="2A3730"/>
+          <w:sz w:val="21"/>
+        </w:rPr>
+        <w:t xml:space="preserve">, </w:t>
+      </w:r>
+      <w:r>
+        <w:rPr>
+          <w:rFonts w:ascii="Calibri" w:hAnsi="Calibri"/>
+          <w:b/>
+          <w:color w:val="2A3730"/>
+          <w:sz w:val="21"/>
+        </w:rPr>
+        <w:t>bias +0.49 points</w:t>
+      </w:r>
+      <w:r>
+        <w:rPr>
+          <w:rFonts w:ascii="Calibri" w:hAnsi="Calibri"/>
+          <w:color w:val="2A3730"/>
+          <w:sz w:val="21"/>
+        </w:rPr>
+        <w:t xml:space="preserve">, </w:t>
+      </w:r>
+      <w:r>
+        <w:rPr>
+          <w:rFonts w:ascii="Calibri" w:hAnsi="Calibri"/>
+          <w:b/>
+          <w:color w:val="2A3730"/>
+          <w:sz w:val="21"/>
+        </w:rPr>
+        <w:t>R² 0.025</w:t>
+      </w:r>
+      <w:r>
+        <w:rPr>
+          <w:rFonts w:ascii="Calibri" w:hAnsi="Calibri"/>
+          <w:color w:val="2A3730"/>
+          <w:sz w:val="21"/>
+        </w:rPr>
+        <w:t xml:space="preserve">, and empirical 80% range about </w:t>
+      </w:r>
+      <w:r>
+        <w:rPr>
+          <w:rFonts w:ascii="Calibri" w:hAnsi="Calibri"/>
+          <w:b/>
+          <w:color w:val="2A3730"/>
+          <w:sz w:val="21"/>
+        </w:rPr>
+        <w:t>±2.70 points</w:t>
+      </w:r>
+      <w:r>
+        <w:rPr>
+          <w:rFonts w:ascii="Calibri" w:hAnsi="Calibri"/>
+          <w:color w:val="2A3730"/>
+          <w:sz w:val="21"/>
+        </w:rPr>
+        <w:t xml:space="preserve">. Target-side accuracy is </w:t>
+      </w:r>
+      <w:r>
+        <w:rPr>
+          <w:rFonts w:ascii="Calibri" w:hAnsi="Calibri"/>
+          <w:b/>
+          <w:color w:val="2A3730"/>
+          <w:sz w:val="21"/>
+        </w:rPr>
+        <w:t>87.1%</w:t>
+      </w:r>
+      <w:r>
+        <w:rPr>
+          <w:rFonts w:ascii="Calibri" w:hAnsi="Calibri"/>
+          <w:color w:val="2A3730"/>
+          <w:sz w:val="21"/>
+        </w:rPr>
+        <w:t xml:space="preserve">, equal to the always-below majority baseline, with </w:t>
+      </w:r>
+      <w:r>
+        <w:rPr>
+          <w:rFonts w:ascii="Calibri" w:hAnsi="Calibri"/>
+          <w:b/>
+          <w:color w:val="2A3730"/>
+          <w:sz w:val="21"/>
+        </w:rPr>
+        <w:t>0% recall</w:t>
+      </w:r>
+      <w:r>
+        <w:rPr>
+          <w:rFonts w:ascii="Calibri" w:hAnsi="Calibri"/>
+          <w:color w:val="2A3730"/>
+          <w:sz w:val="21"/>
+        </w:rPr>
+        <w:t xml:space="preserve"> of actual ≥95% outcomes. Day 14 remains useful for early operational warning, but its recovery forecast is directional rather than a reliable target-hit classifier.</w:t>
+      </w:r>
+    </w:p>
+    <w:p>
+      <w:pPr>
+        <w:pStyle w:val="Heading3"/>
+      </w:pPr>
+      <w:r>
+        <w:t>Memorize: live dates between checkpoints</w:t>
+      </w:r>
+    </w:p>
+    <w:p>
+      <w:pPr>
+        <w:spacing w:before="0" w:after="120" w:line="288" w:lineRule="auto"/>
+      </w:pPr>
+      <w:r>
+        <w:rPr>
+          <w:rFonts w:ascii="Calibri" w:hAnsi="Calibri"/>
+          <w:color w:val="2A3730"/>
+          <w:sz w:val="21"/>
+        </w:rPr>
+        <w:t>The selected ordinary linear remaining-loss model can score any review date using that date's leakage-safe feature snapshot. If the fitted model is unavailable, Canary falls back to the transparent Day 7/14/21/28 remaining-loss baseline and interpolates between checkpoints so the fallback does not jump abruptly.</w:t>
+      </w:r>
+    </w:p>
+    <w:p>
+      <w:pPr>
+        <w:spacing w:before="0" w:after="120" w:line="288" w:lineRule="auto"/>
+      </w:pPr>
+      <w:r>
+        <w:rPr>
+          <w:rFonts w:ascii="Calibri" w:hAnsi="Calibri"/>
+          <w:color w:val="2A3730"/>
+          <w:sz w:val="21"/>
+        </w:rPr>
+        <w:t>Revenue at risk is not another model:</w:t>
+      </w:r>
+    </w:p>
+    <w:p>
+      <w:pPr>
+        <w:spacing w:before="0" w:after="120" w:line="288" w:lineRule="auto"/>
+      </w:pPr>
+      <w:r>
+        <w:rPr>
+          <w:rFonts w:ascii="Calibri" w:hAnsi="Calibri"/>
+          <w:b/>
+          <w:color w:val="286245"/>
+          <w:sz w:val="20"/>
+        </w:rPr>
+        <w:t>beginning birds × recovery gap to 95% × assumed sale weight × price/kg</w:t>
+      </w:r>
+    </w:p>
+    <w:p>
+      <w:pPr>
+        <w:spacing w:before="0" w:after="120" w:line="288" w:lineRule="auto"/>
+      </w:pPr>
+      <w:r>
+        <w:rPr>
+          <w:rFonts w:ascii="Calibri" w:hAnsi="Calibri"/>
+          <w:color w:val="2A3730"/>
+          <w:sz w:val="21"/>
+        </w:rPr>
+        <w:t>Therefore, recovery forecast changes directly change the displayed revenue scenario.</w:t>
+      </w:r>
+    </w:p>
+    <w:p>
+      <w:pPr>
+        <w:pStyle w:val="Heading3"/>
+      </w:pPr>
+      <w:r>
         <w:t>Recovery Y target</w:t>
       </w:r>
     </w:p>
@@ -2059,7 +2652,6 @@
             <w:r>
               <w:rPr>
                 <w:rFonts w:ascii="Calibri" w:hAnsi="Calibri"/>
-                <w:b/>
                 <w:color w:val="2A3730"/>
                 <w:sz w:val="18"/>
               </w:rPr>
@@ -2088,11 +2680,10 @@
             <w:r>
               <w:rPr>
                 <w:rFonts w:ascii="Calibri" w:hAnsi="Calibri"/>
-                <w:b/>
                 <w:color w:val="2A3730"/>
                 <w:sz w:val="18"/>
               </w:rPr>
-              <w:t>1.40</w:t>
+              <w:t>2.00</w:t>
             </w:r>
           </w:p>
         </w:tc>
@@ -2117,11 +2708,10 @@
             <w:r>
               <w:rPr>
                 <w:rFonts w:ascii="Calibri" w:hAnsi="Calibri"/>
-                <w:b/>
                 <w:color w:val="2A3730"/>
                 <w:sz w:val="18"/>
               </w:rPr>
-              <w:t>1.50</w:t>
+              <w:t>2.09</w:t>
             </w:r>
           </w:p>
         </w:tc>
@@ -2146,11 +2736,10 @@
             <w:r>
               <w:rPr>
                 <w:rFonts w:ascii="Calibri" w:hAnsi="Calibri"/>
-                <w:b/>
                 <w:color w:val="2A3730"/>
                 <w:sz w:val="18"/>
               </w:rPr>
-              <w:t>1.80</w:t>
+              <w:t>2.66</w:t>
             </w:r>
           </w:p>
         </w:tc>
@@ -2175,11 +2764,10 @@
             <w:r>
               <w:rPr>
                 <w:rFonts w:ascii="Calibri" w:hAnsi="Calibri"/>
-                <w:b/>
                 <w:color w:val="2A3730"/>
                 <w:sz w:val="18"/>
               </w:rPr>
-              <w:t>0.222</w:t>
+              <w:t>-0.010</w:t>
             </w:r>
           </w:p>
         </w:tc>
@@ -2204,11 +2792,10 @@
             <w:r>
               <w:rPr>
                 <w:rFonts w:ascii="Calibri" w:hAnsi="Calibri"/>
-                <w:b/>
                 <w:color w:val="2A3730"/>
                 <w:sz w:val="18"/>
               </w:rPr>
-              <w:t>Operational fallback</w:t>
+              <w:t>Transparent baseline</w:t>
             </w:r>
           </w:p>
         </w:tc>
@@ -2239,6 +2826,7 @@
             <w:r>
               <w:rPr>
                 <w:rFonts w:ascii="Calibri" w:hAnsi="Calibri"/>
+                <w:b/>
                 <w:color w:val="2A3730"/>
                 <w:sz w:val="18"/>
               </w:rPr>
@@ -2268,10 +2856,11 @@
             <w:r>
               <w:rPr>
                 <w:rFonts w:ascii="Calibri" w:hAnsi="Calibri"/>
+                <w:b/>
                 <w:color w:val="2A3730"/>
                 <w:sz w:val="18"/>
               </w:rPr>
-              <w:t>1.29</w:t>
+              <w:t>1.74</w:t>
             </w:r>
           </w:p>
         </w:tc>
@@ -2297,10 +2886,11 @@
             <w:r>
               <w:rPr>
                 <w:rFonts w:ascii="Calibri" w:hAnsi="Calibri"/>
+                <w:b/>
                 <w:color w:val="2A3730"/>
                 <w:sz w:val="18"/>
               </w:rPr>
-              <w:t>1.40</w:t>
+              <w:t>1.76</w:t>
             </w:r>
           </w:p>
         </w:tc>
@@ -2326,10 +2916,11 @@
             <w:r>
               <w:rPr>
                 <w:rFonts w:ascii="Calibri" w:hAnsi="Calibri"/>
+                <w:b/>
                 <w:color w:val="2A3730"/>
                 <w:sz w:val="18"/>
               </w:rPr>
-              <w:t>1.80</w:t>
+              <w:t>2.57</w:t>
             </w:r>
           </w:p>
         </w:tc>
@@ -2355,10 +2946,11 @@
             <w:r>
               <w:rPr>
                 <w:rFonts w:ascii="Calibri" w:hAnsi="Calibri"/>
+                <w:b/>
                 <w:color w:val="2A3730"/>
                 <w:sz w:val="18"/>
               </w:rPr>
-              <w:t>0.224</w:t>
+              <w:t>0.054</w:t>
             </w:r>
           </w:p>
         </w:tc>
@@ -2384,10 +2976,11 @@
             <w:r>
               <w:rPr>
                 <w:rFonts w:ascii="Calibri" w:hAnsi="Calibri"/>
+                <w:b/>
                 <w:color w:val="2A3730"/>
                 <w:sz w:val="18"/>
               </w:rPr>
-              <w:t>Compared</w:t>
+              <w:t>Selected continuous estimate</w:t>
             </w:r>
           </w:p>
         </w:tc>
@@ -2448,7 +3041,7 @@
                 <w:color w:val="2A3730"/>
                 <w:sz w:val="18"/>
               </w:rPr>
-              <w:t>1.31</w:t>
+              <w:t>1.74</w:t>
             </w:r>
           </w:p>
         </w:tc>
@@ -2476,7 +3069,7 @@
                 <w:color w:val="2A3730"/>
                 <w:sz w:val="18"/>
               </w:rPr>
-              <w:t>1.43</w:t>
+              <w:t>1.76</w:t>
             </w:r>
           </w:p>
         </w:tc>
@@ -2504,7 +3097,7 @@
                 <w:color w:val="2A3730"/>
                 <w:sz w:val="18"/>
               </w:rPr>
-              <w:t>1.82</w:t>
+              <w:t>2.57</w:t>
             </w:r>
           </w:p>
         </w:tc>
@@ -2532,7 +3125,7 @@
                 <w:color w:val="2A3730"/>
                 <w:sz w:val="18"/>
               </w:rPr>
-              <w:t>0.207</w:t>
+              <w:t>0.055</w:t>
             </w:r>
           </w:p>
         </w:tc>
@@ -2594,65 +3187,7 @@
                 <w:color w:val="2A3730"/>
                 <w:sz w:val="18"/>
               </w:rPr>
-              <w:t>Robust Huber remaining-loss regression</w:t>
-            </w:r>
-          </w:p>
-        </w:tc>
-        <w:tc>
-          <w:tcPr>
-            <w:tcW w:type="dxa" w:w="1560"/>
-            <w:tcMar>
-              <w:top w:w="80" w:type="dxa"/>
-              <w:start w:w="120" w:type="dxa"/>
-              <w:bottom w:w="80" w:type="dxa"/>
-              <w:end w:w="120" w:type="dxa"/>
-            </w:tcMar>
-            <w:vAlign w:val="center"/>
-            <w:shd w:fill="F4F8F5"/>
-          </w:tcPr>
-          <w:p>
-            <w:pPr>
-              <w:keepNext/>
-              <w:keepLines/>
-              <w:spacing w:before="0" w:after="0" w:line="264" w:lineRule="auto"/>
-            </w:pPr>
-            <w:r/>
-            <w:r>
-              <w:rPr>
-                <w:rFonts w:ascii="Calibri" w:hAnsi="Calibri"/>
-                <w:color w:val="2A3730"/>
-                <w:sz w:val="18"/>
-              </w:rPr>
-              <w:t>1.24</w:t>
-            </w:r>
-          </w:p>
-        </w:tc>
-        <w:tc>
-          <w:tcPr>
-            <w:tcW w:type="dxa" w:w="1560"/>
-            <w:tcMar>
-              <w:top w:w="80" w:type="dxa"/>
-              <w:start w:w="120" w:type="dxa"/>
-              <w:bottom w:w="80" w:type="dxa"/>
-              <w:end w:w="120" w:type="dxa"/>
-            </w:tcMar>
-            <w:vAlign w:val="center"/>
-            <w:shd w:fill="F4F8F5"/>
-          </w:tcPr>
-          <w:p>
-            <w:pPr>
-              <w:keepNext/>
-              <w:keepLines/>
-              <w:spacing w:before="0" w:after="0" w:line="264" w:lineRule="auto"/>
-            </w:pPr>
-            <w:r/>
-            <w:r>
-              <w:rPr>
-                <w:rFonts w:ascii="Calibri" w:hAnsi="Calibri"/>
-                <w:color w:val="2A3730"/>
-                <w:sz w:val="18"/>
-              </w:rPr>
-              <w:t>1.33</w:t>
+              <w:t>Gradient Boosting remaining-loss</w:t>
             </w:r>
           </w:p>
         </w:tc>
@@ -2710,7 +3245,7 @@
                 <w:color w:val="2A3730"/>
                 <w:sz w:val="18"/>
               </w:rPr>
-              <w:t>0.260</w:t>
+              <w:t>1.84</w:t>
             </w:r>
           </w:p>
         </w:tc>
@@ -2739,7 +3274,65 @@
                 <w:color w:val="2A3730"/>
                 <w:sz w:val="18"/>
               </w:rPr>
-              <w:t>Best research challenger</w:t>
+              <w:t>2.47</w:t>
+            </w:r>
+          </w:p>
+        </w:tc>
+        <w:tc>
+          <w:tcPr>
+            <w:tcW w:type="dxa" w:w="1560"/>
+            <w:tcMar>
+              <w:top w:w="80" w:type="dxa"/>
+              <w:start w:w="120" w:type="dxa"/>
+              <w:bottom w:w="80" w:type="dxa"/>
+              <w:end w:w="120" w:type="dxa"/>
+            </w:tcMar>
+            <w:vAlign w:val="center"/>
+            <w:shd w:fill="F4F8F5"/>
+          </w:tcPr>
+          <w:p>
+            <w:pPr>
+              <w:keepNext/>
+              <w:keepLines/>
+              <w:spacing w:before="0" w:after="0" w:line="264" w:lineRule="auto"/>
+            </w:pPr>
+            <w:r/>
+            <w:r>
+              <w:rPr>
+                <w:rFonts w:ascii="Calibri" w:hAnsi="Calibri"/>
+                <w:color w:val="2A3730"/>
+                <w:sz w:val="18"/>
+              </w:rPr>
+              <w:t>0.129</w:t>
+            </w:r>
+          </w:p>
+        </w:tc>
+        <w:tc>
+          <w:tcPr>
+            <w:tcW w:type="dxa" w:w="1560"/>
+            <w:tcMar>
+              <w:top w:w="80" w:type="dxa"/>
+              <w:start w:w="120" w:type="dxa"/>
+              <w:bottom w:w="80" w:type="dxa"/>
+              <w:end w:w="120" w:type="dxa"/>
+            </w:tcMar>
+            <w:vAlign w:val="center"/>
+            <w:shd w:fill="F4F8F5"/>
+          </w:tcPr>
+          <w:p>
+            <w:pPr>
+              <w:keepNext/>
+              <w:keepLines/>
+              <w:spacing w:before="0" w:after="0" w:line="264" w:lineRule="auto"/>
+            </w:pPr>
+            <w:r/>
+            <w:r>
+              <w:rPr>
+                <w:rFonts w:ascii="Calibri" w:hAnsi="Calibri"/>
+                <w:color w:val="2A3730"/>
+                <w:sz w:val="18"/>
+              </w:rPr>
+              <w:t>Compared</w:t>
             </w:r>
           </w:p>
         </w:tc>
@@ -2771,7 +3364,7 @@
                 <w:color w:val="2A3730"/>
                 <w:sz w:val="18"/>
               </w:rPr>
-              <w:t>Gradient Boosting remaining-loss</w:t>
+              <w:t>Constrained Extra Trees</w:t>
             </w:r>
           </w:p>
         </w:tc>
@@ -2798,7 +3391,7 @@
                 <w:color w:val="2A3730"/>
                 <w:sz w:val="18"/>
               </w:rPr>
-              <w:t>1.25</w:t>
+              <w:t>1.73</w:t>
             </w:r>
           </w:p>
         </w:tc>
@@ -2825,7 +3418,7 @@
                 <w:color w:val="2A3730"/>
                 <w:sz w:val="18"/>
               </w:rPr>
-              <w:t>1.37</w:t>
+              <w:t>1.80</w:t>
             </w:r>
           </w:p>
         </w:tc>
@@ -2852,7 +3445,7 @@
                 <w:color w:val="2A3730"/>
                 <w:sz w:val="18"/>
               </w:rPr>
-              <w:t>1.78</w:t>
+              <w:t>2.47</w:t>
             </w:r>
           </w:p>
         </w:tc>
@@ -2879,7 +3472,7 @@
                 <w:color w:val="2A3730"/>
                 <w:sz w:val="18"/>
               </w:rPr>
-              <w:t>0.243</w:t>
+              <w:t>0.129</w:t>
             </w:r>
           </w:p>
         </w:tc>
@@ -2906,7 +3499,7 @@
                 <w:color w:val="2A3730"/>
                 <w:sz w:val="18"/>
               </w:rPr>
-              <w:t>Compared</w:t>
+              <w:t>Nonlinear sensitivity challenger</w:t>
             </w:r>
           </w:p>
         </w:tc>
@@ -2922,7 +3515,7 @@
         <w:pStyle w:val="Heading3"/>
       </w:pPr>
       <w:r>
-        <w:t>Why not automatically deploy Huber because its MAE is best?</w:t>
+        <w:t>Why select linear regression—and why not call it a 95% classifier?</w:t>
       </w:r>
     </w:p>
     <w:p>
@@ -2935,7 +3528,7 @@
           <w:color w:val="2A3730"/>
           <w:sz w:val="21"/>
         </w:rPr>
-        <w:t xml:space="preserve">Huber improves cycle-balanced MAE by </w:t>
+        <w:t xml:space="preserve">Linear regression improves cycle-balanced MAE by </w:t>
       </w:r>
       <w:r>
         <w:rPr>
@@ -2944,7 +3537,7 @@
           <w:color w:val="2A3730"/>
           <w:sz w:val="21"/>
         </w:rPr>
-        <w:t>11.2%</w:t>
+        <w:t>16.1%</w:t>
       </w:r>
       <w:r>
         <w:rPr>
@@ -2952,7 +3545,7 @@
           <w:color w:val="2A3730"/>
           <w:sz w:val="21"/>
         </w:rPr>
-        <w:t xml:space="preserve"> and keeps positive R², but its rolling-origin cycle MAE is </w:t>
+        <w:t xml:space="preserve"> versus the refreshed age-band baseline, keeps positive held-out R², and is effectively tied with Ridge. Extra Trees has slightly lower pooled MAE and higher R² but worse cycle-balanced MAE. The simpler linear method therefore wins under the prespecified cycle-balanced MAE and simplicity rule. However, it detects only </w:t>
       </w:r>
       <w:r>
         <w:rPr>
@@ -2961,7 +3554,7 @@
           <w:color w:val="2A3730"/>
           <w:sz w:val="21"/>
         </w:rPr>
-        <w:t>1.73 points</w:t>
+        <w:t>21.1%</w:t>
       </w:r>
       <w:r>
         <w:rPr>
@@ -2969,7 +3562,28 @@
           <w:color w:val="2A3730"/>
           <w:sz w:val="21"/>
         </w:rPr>
-        <w:t xml:space="preserve"> versus </w:t>
+        <w:t xml:space="preserve"> of actual at/above-95% snapshots. Canary therefore shows a point estimate and range, not a probability that the flock will hit 95%.</w:t>
+      </w:r>
+    </w:p>
+    <w:p>
+      <w:pPr>
+        <w:pStyle w:val="Heading3"/>
+      </w:pPr>
+      <w:r>
+        <w:t>Recovery classification warning</w:t>
+      </w:r>
+    </w:p>
+    <w:p>
+      <w:pPr>
+        <w:pStyle w:val="ListBullet"/>
+      </w:pPr>
+      <w:r>
+        <w:rPr>
+          <w:rFonts w:ascii="Calibri" w:hAnsi="Calibri"/>
+          <w:color w:val="2A3730"/>
+          <w:sz w:val="21"/>
+        </w:rPr>
+        <w:t xml:space="preserve"> Target-side accuracy: </w:t>
       </w:r>
       <w:r>
         <w:rPr>
@@ -2978,7 +3592,7 @@
           <w:color w:val="2A3730"/>
           <w:sz w:val="21"/>
         </w:rPr>
-        <w:t>1.35</w:t>
+        <w:t>90.1%</w:t>
       </w:r>
       <w:r>
         <w:rPr>
@@ -2986,15 +3600,7 @@
           <w:color w:val="2A3730"/>
           <w:sz w:val="21"/>
         </w:rPr>
-        <w:t xml:space="preserve"> for the age-band baseline, and it does not beat the majority rule for identifying the 95% target side. The strict gate therefore keeps the transparent baseline operational while Huber remains the research champion.</w:t>
-      </w:r>
-    </w:p>
-    <w:p>
-      <w:pPr>
-        <w:pStyle w:val="Heading3"/>
-      </w:pPr>
-      <w:r>
-        <w:t>Recovery classification warning</w:t>
+        <w:t xml:space="preserve"> for the selected linear estimate.</w:t>
       </w:r>
     </w:p>
     <w:p>
@@ -3007,7 +3613,7 @@
           <w:color w:val="2A3730"/>
           <w:sz w:val="21"/>
         </w:rPr>
-        <w:t xml:space="preserve"> Target-side accuracy: </w:t>
+        <w:t xml:space="preserve"> Majority baseline: </w:t>
       </w:r>
       <w:r>
         <w:rPr>
@@ -3016,7 +3622,7 @@
           <w:color w:val="2A3730"/>
           <w:sz w:val="21"/>
         </w:rPr>
-        <w:t>86.1%</w:t>
+        <w:t>87.4%</w:t>
       </w:r>
       <w:r>
         <w:rPr>
@@ -3024,7 +3630,7 @@
           <w:color w:val="2A3730"/>
           <w:sz w:val="21"/>
         </w:rPr>
-        <w:t xml:space="preserve"> for the operational baseline.</w:t>
+        <w:t xml:space="preserve"> overall.</w:t>
       </w:r>
     </w:p>
     <w:p>
@@ -3037,7 +3643,7 @@
           <w:color w:val="2A3730"/>
           <w:sz w:val="21"/>
         </w:rPr>
-        <w:t xml:space="preserve"> Majority baseline: </w:t>
+        <w:t xml:space="preserve"> Day 14: </w:t>
       </w:r>
       <w:r>
         <w:rPr>
@@ -3046,7 +3652,7 @@
           <w:color w:val="2A3730"/>
           <w:sz w:val="21"/>
         </w:rPr>
-        <w:t>84.4%</w:t>
+        <w:t>87.1%</w:t>
       </w:r>
       <w:r>
         <w:rPr>
@@ -3054,20 +3660,7 @@
           <w:color w:val="2A3730"/>
           <w:sz w:val="21"/>
         </w:rPr>
-        <w:t xml:space="preserve"> overall.</w:t>
-      </w:r>
-    </w:p>
-    <w:p>
-      <w:pPr>
-        <w:pStyle w:val="ListBullet"/>
-      </w:pPr>
-      <w:r>
-        <w:rPr>
-          <w:rFonts w:ascii="Calibri" w:hAnsi="Calibri"/>
-          <w:color w:val="2A3730"/>
-          <w:sz w:val="21"/>
-        </w:rPr>
-        <w:t xml:space="preserve"> Day 14: </w:t>
+        <w:t xml:space="preserve">, equal to the </w:t>
       </w:r>
       <w:r>
         <w:rPr>
@@ -3076,7 +3669,7 @@
           <w:color w:val="2A3730"/>
           <w:sz w:val="21"/>
         </w:rPr>
-        <w:t>84.0%</w:t>
+        <w:t>87.1%</w:t>
       </w:r>
       <w:r>
         <w:rPr>
@@ -3084,7 +3677,20 @@
           <w:color w:val="2A3730"/>
           <w:sz w:val="21"/>
         </w:rPr>
-        <w:t xml:space="preserve">, equal to the </w:t>
+        <w:t xml:space="preserve"> majority baseline.</w:t>
+      </w:r>
+    </w:p>
+    <w:p>
+      <w:pPr>
+        <w:pStyle w:val="ListBullet"/>
+      </w:pPr>
+      <w:r>
+        <w:rPr>
+          <w:rFonts w:ascii="Calibri" w:hAnsi="Calibri"/>
+          <w:color w:val="2A3730"/>
+          <w:sz w:val="21"/>
+        </w:rPr>
+        <w:t xml:space="preserve"> Below-95% recall: </w:t>
       </w:r>
       <w:r>
         <w:rPr>
@@ -3093,7 +3699,7 @@
           <w:color w:val="2A3730"/>
           <w:sz w:val="21"/>
         </w:rPr>
-        <w:t>84.0%</w:t>
+        <w:t>100%</w:t>
       </w:r>
       <w:r>
         <w:rPr>
@@ -3101,7 +3707,7 @@
           <w:color w:val="2A3730"/>
           <w:sz w:val="21"/>
         </w:rPr>
-        <w:t xml:space="preserve"> majority baseline.</w:t>
+        <w:t>.</w:t>
       </w:r>
     </w:p>
     <w:p>
@@ -3123,7 +3729,7 @@
           <w:color w:val="2A3730"/>
           <w:sz w:val="21"/>
         </w:rPr>
-        <w:t>0%</w:t>
+        <w:t>21.1%</w:t>
       </w:r>
       <w:r>
         <w:rPr>
@@ -3132,6 +3738,36 @@
           <w:sz w:val="21"/>
         </w:rPr>
         <w:t>.</w:t>
+      </w:r>
+    </w:p>
+    <w:p>
+      <w:pPr>
+        <w:pStyle w:val="ListBullet"/>
+      </w:pPr>
+      <w:r>
+        <w:rPr>
+          <w:rFonts w:ascii="Calibri" w:hAnsi="Calibri"/>
+          <w:color w:val="2A3730"/>
+          <w:sz w:val="21"/>
+        </w:rPr>
+        <w:t xml:space="preserve"> Balanced target accuracy: </w:t>
+      </w:r>
+      <w:r>
+        <w:rPr>
+          <w:rFonts w:ascii="Calibri" w:hAnsi="Calibri"/>
+          <w:b/>
+          <w:color w:val="2A3730"/>
+          <w:sz w:val="21"/>
+        </w:rPr>
+        <w:t>60.5%</w:t>
+      </w:r>
+      <w:r>
+        <w:rPr>
+          <w:rFonts w:ascii="Calibri" w:hAnsi="Calibri"/>
+          <w:color w:val="2A3730"/>
+          <w:sz w:val="21"/>
+        </w:rPr>
+        <w:t>; still operationally weak because the positive-side sample is small.</w:t>
       </w:r>
     </w:p>
     <w:p>
@@ -3174,7 +3810,7 @@
           <w:color w:val="2A3730"/>
           <w:sz w:val="21"/>
         </w:rPr>
-        <w:t>Canary reports held-out permutation importance for the Huber research challenger. These are predictive associations—not proof that changing a factor will cause recovery to improve. The live baseline itself uses only current survival and the age-band historical remaining loss.</w:t>
+        <w:t>Canary reports held-out permutation importance for the operational linear model and held-out SHAP for the strongest nonlinear sensitivity challenger, Extra Trees. SHAP is calculated only after removing the complete test cycle. It shows which inputs moved model estimates and whether higher values generally moved the estimate up or down. These are predictive associations—not proof that changing a factor will cause recovery to improve. Building-specific SHAP explains one forecast; actual actions still require a recorded rule violation and Doc Raymond's playbook.</w:t>
       </w:r>
     </w:p>
     <w:p>
@@ -3189,7 +3825,7 @@
       <w:pPr>
         <w:numPr>
           <w:ilvl w:val="0"/>
-          <w:numId w:val="13"/>
+          <w:numId w:val="14"/>
         </w:numPr>
         <w:spacing w:before="0" w:after="60" w:line="283" w:lineRule="auto"/>
       </w:pPr>
@@ -3215,7 +3851,7 @@
       <w:pPr>
         <w:numPr>
           <w:ilvl w:val="0"/>
-          <w:numId w:val="13"/>
+          <w:numId w:val="14"/>
         </w:numPr>
         <w:spacing w:before="0" w:after="60" w:line="283" w:lineRule="auto"/>
       </w:pPr>
@@ -3241,7 +3877,7 @@
       <w:pPr>
         <w:numPr>
           <w:ilvl w:val="0"/>
-          <w:numId w:val="13"/>
+          <w:numId w:val="14"/>
         </w:numPr>
         <w:spacing w:before="0" w:after="60" w:line="283" w:lineRule="auto"/>
       </w:pPr>
@@ -3267,7 +3903,7 @@
       <w:pPr>
         <w:numPr>
           <w:ilvl w:val="0"/>
-          <w:numId w:val="13"/>
+          <w:numId w:val="14"/>
         </w:numPr>
         <w:spacing w:before="0" w:after="60" w:line="283" w:lineRule="auto"/>
       </w:pPr>
@@ -3293,7 +3929,7 @@
       <w:pPr>
         <w:numPr>
           <w:ilvl w:val="0"/>
-          <w:numId w:val="13"/>
+          <w:numId w:val="14"/>
         </w:numPr>
         <w:spacing w:before="0" w:after="60" w:line="283" w:lineRule="auto"/>
       </w:pPr>
@@ -5544,7 +6180,7 @@
       <w:pPr>
         <w:numPr>
           <w:ilvl w:val="0"/>
-          <w:numId w:val="14"/>
+          <w:numId w:val="15"/>
         </w:numPr>
         <w:spacing w:before="0" w:after="60" w:line="283" w:lineRule="auto"/>
       </w:pPr>
@@ -5570,7 +6206,7 @@
       <w:pPr>
         <w:numPr>
           <w:ilvl w:val="0"/>
-          <w:numId w:val="14"/>
+          <w:numId w:val="15"/>
         </w:numPr>
         <w:spacing w:before="0" w:after="60" w:line="283" w:lineRule="auto"/>
       </w:pPr>
@@ -5596,7 +6232,7 @@
       <w:pPr>
         <w:numPr>
           <w:ilvl w:val="0"/>
-          <w:numId w:val="14"/>
+          <w:numId w:val="15"/>
         </w:numPr>
         <w:spacing w:before="0" w:after="60" w:line="283" w:lineRule="auto"/>
       </w:pPr>
@@ -5622,7 +6258,7 @@
       <w:pPr>
         <w:numPr>
           <w:ilvl w:val="0"/>
-          <w:numId w:val="14"/>
+          <w:numId w:val="15"/>
         </w:numPr>
         <w:spacing w:before="0" w:after="60" w:line="283" w:lineRule="auto"/>
       </w:pPr>
@@ -5648,7 +6284,7 @@
       <w:pPr>
         <w:numPr>
           <w:ilvl w:val="0"/>
-          <w:numId w:val="14"/>
+          <w:numId w:val="15"/>
         </w:numPr>
         <w:spacing w:before="0" w:after="60" w:line="283" w:lineRule="auto"/>
       </w:pPr>
@@ -6218,7 +6854,7 @@
       <w:pPr>
         <w:numPr>
           <w:ilvl w:val="0"/>
-          <w:numId w:val="15"/>
+          <w:numId w:val="16"/>
         </w:numPr>
         <w:spacing w:before="0" w:after="60" w:line="283" w:lineRule="auto"/>
       </w:pPr>
@@ -6244,7 +6880,7 @@
       <w:pPr>
         <w:numPr>
           <w:ilvl w:val="0"/>
-          <w:numId w:val="15"/>
+          <w:numId w:val="16"/>
         </w:numPr>
         <w:spacing w:before="0" w:after="60" w:line="283" w:lineRule="auto"/>
       </w:pPr>
@@ -6270,7 +6906,7 @@
       <w:pPr>
         <w:numPr>
           <w:ilvl w:val="0"/>
-          <w:numId w:val="15"/>
+          <w:numId w:val="16"/>
         </w:numPr>
         <w:spacing w:before="0" w:after="60" w:line="283" w:lineRule="auto"/>
       </w:pPr>
@@ -6296,7 +6932,7 @@
       <w:pPr>
         <w:numPr>
           <w:ilvl w:val="0"/>
-          <w:numId w:val="15"/>
+          <w:numId w:val="16"/>
         </w:numPr>
         <w:spacing w:before="0" w:after="60" w:line="283" w:lineRule="auto"/>
       </w:pPr>
@@ -6322,7 +6958,7 @@
       <w:pPr>
         <w:numPr>
           <w:ilvl w:val="0"/>
-          <w:numId w:val="15"/>
+          <w:numId w:val="16"/>
         </w:numPr>
         <w:spacing w:before="0" w:after="60" w:line="283" w:lineRule="auto"/>
       </w:pPr>
@@ -6348,7 +6984,7 @@
       <w:pPr>
         <w:numPr>
           <w:ilvl w:val="0"/>
-          <w:numId w:val="15"/>
+          <w:numId w:val="16"/>
         </w:numPr>
         <w:spacing w:before="0" w:after="60" w:line="283" w:lineRule="auto"/>
       </w:pPr>
@@ -6374,7 +7010,7 @@
       <w:pPr>
         <w:numPr>
           <w:ilvl w:val="0"/>
-          <w:numId w:val="15"/>
+          <w:numId w:val="16"/>
         </w:numPr>
         <w:spacing w:before="0" w:after="60" w:line="283" w:lineRule="auto"/>
       </w:pPr>
@@ -6528,7 +7164,7 @@
           <w:color w:val="2A3730"/>
           <w:sz w:val="21"/>
         </w:rPr>
-        <w:t>They are useful as validated prototype estimates, not guarantees. The recovery Huber challenger passes the continuous-error gate but not the full deployment gate; Canary therefore keeps the transparent age-band fallback. Weight learned models also fail the replacement gates, so Canary uses historical remaining gain.</w:t>
+        <w:t>They are useful as validated prototype estimates, not guarantees. The linear recovery model reduces typical error but has low R² and weak at/above-95% recall. Weight learned models fail the replacement gates, so Canary uses historical remaining gain.</w:t>
       </w:r>
     </w:p>
     <w:p>
@@ -6780,7 +7416,7 @@
       <w:pPr>
         <w:numPr>
           <w:ilvl w:val="0"/>
-          <w:numId w:val="16"/>
+          <w:numId w:val="17"/>
         </w:numPr>
         <w:spacing w:before="0" w:after="60" w:line="283" w:lineRule="auto"/>
       </w:pPr>
@@ -6797,7 +7433,7 @@
       <w:pPr>
         <w:numPr>
           <w:ilvl w:val="0"/>
-          <w:numId w:val="16"/>
+          <w:numId w:val="17"/>
         </w:numPr>
         <w:spacing w:before="0" w:after="60" w:line="283" w:lineRule="auto"/>
       </w:pPr>
@@ -6814,7 +7450,7 @@
       <w:pPr>
         <w:numPr>
           <w:ilvl w:val="0"/>
-          <w:numId w:val="16"/>
+          <w:numId w:val="17"/>
         </w:numPr>
         <w:spacing w:before="0" w:after="60" w:line="283" w:lineRule="auto"/>
       </w:pPr>
@@ -6831,7 +7467,7 @@
       <w:pPr>
         <w:numPr>
           <w:ilvl w:val="0"/>
-          <w:numId w:val="16"/>
+          <w:numId w:val="17"/>
         </w:numPr>
         <w:spacing w:before="0" w:after="60" w:line="283" w:lineRule="auto"/>
       </w:pPr>
@@ -6848,7 +7484,7 @@
       <w:pPr>
         <w:numPr>
           <w:ilvl w:val="0"/>
-          <w:numId w:val="16"/>
+          <w:numId w:val="17"/>
         </w:numPr>
         <w:spacing w:before="0" w:after="60" w:line="283" w:lineRule="auto"/>
       </w:pPr>
@@ -7224,6 +7860,22 @@
   </w:abstractNum>
   <w:num w:numId="16">
     <w:abstractNumId w:val="15"/>
+  </w:num>
+  <w:abstractNum w:abstractNumId="16">
+    <w:multiLevelType w:val="singleLevel"/>
+    <w:lvl w:ilvl="0">
+      <w:start w:val="1"/>
+      <w:numFmt w:val="decimal"/>
+      <w:lvlText w:val="%1."/>
+      <w:lvlJc w:val="left"/>
+      <w:suff w:val="space"/>
+      <w:pPr>
+        <w:ind w:left="540" w:hanging="270"/>
+      </w:pPr>
+    </w:lvl>
+  </w:abstractNum>
+  <w:num w:numId="17">
+    <w:abstractNumId w:val="16"/>
   </w:num>
 </w:numbering>
 </file>

</xml_diff>